<commit_message>
Align validation BOS with site section structure
</commit_message>
<xml_diff>
--- a/docs/artimex-bos.docx
+++ b/docs/artimex-bos.docx
@@ -277,7 +277,7 @@
           <w:sz w:val="28"/>
           <w:szCs w:val="28"/>
         </w:rPr>
-        <w:t xml:space="preserve">1. Announcement and navigation</w:t>
+        <w:t xml:space="preserve">Announcement bar and header</w:t>
       </w:r>
     </w:p>
     <w:p>
@@ -787,7 +787,7 @@
           <w:sz w:val="28"/>
           <w:szCs w:val="28"/>
         </w:rPr>
-        <w:t xml:space="preserve">2. Hero</w:t>
+        <w:t xml:space="preserve">Authenticity • Tradition • Superior ingredients</w:t>
       </w:r>
     </w:p>
     <w:p>
@@ -1327,7 +1327,7 @@
           <w:sz w:val="28"/>
           <w:szCs w:val="28"/>
         </w:rPr>
-        <w:t xml:space="preserve">3. Product category marquee</w:t>
+        <w:t xml:space="preserve">Product categories</w:t>
       </w:r>
     </w:p>
     <w:p>
@@ -1569,7 +1569,867 @@
           <w:sz w:val="28"/>
           <w:szCs w:val="28"/>
         </w:rPr>
-        <w:t xml:space="preserve">4. Customer journeys</w:t>
+        <w:t xml:space="preserve">Fresh from our ovens</w:t>
+      </w:r>
+    </w:p>
+    <w:p>
+      <w:pPr>
+        <w:spacing w:before="0" w:after="110" w:line="260"/>
+      </w:pPr>
+      <w:r>
+        <w:rPr>
+          <w:rFonts w:ascii="Aptos" w:cs="Aptos" w:eastAsia="Aptos" w:hAnsi="Aptos"/>
+          <w:b/>
+          <w:bCs/>
+          <w:color w:val="25323B"/>
+          <w:sz w:val="20"/>
+          <w:szCs w:val="20"/>
+        </w:rPr>
+        <w:t xml:space="preserve">*Audience label:*</w:t>
+      </w:r>
+      <w:r>
+        <w:rPr>
+          <w:rFonts w:ascii="Aptos" w:cs="Aptos" w:eastAsia="Aptos" w:hAnsi="Aptos"/>
+          <w:b w:val="false"/>
+          <w:bCs w:val="false"/>
+          <w:color w:val="25323B"/>
+          <w:sz w:val="20"/>
+          <w:szCs w:val="20"/>
+        </w:rPr>
+        <w:t xml:space="preserve"> </w:t>
+      </w:r>
+      <w:r>
+        <w:rPr>
+          <w:rFonts w:ascii="Aptos Mono" w:cs="Aptos Mono" w:eastAsia="Aptos Mono" w:hAnsi="Aptos Mono"/>
+          <w:b w:val="false"/>
+          <w:bCs w:val="false"/>
+          <w:color w:val="1E5E85"/>
+          <w:sz w:val="18"/>
+          <w:szCs w:val="18"/>
+        </w:rPr>
+        <w:t xml:space="preserve">For home &amp; family</w:t>
+      </w:r>
+    </w:p>
+    <w:p>
+      <w:pPr>
+        <w:spacing w:before="0" w:after="110" w:line="260"/>
+      </w:pPr>
+      <w:r>
+        <w:rPr>
+          <w:rFonts w:ascii="Aptos" w:cs="Aptos" w:eastAsia="Aptos" w:hAnsi="Aptos"/>
+          <w:b/>
+          <w:bCs/>
+          <w:color w:val="25323B"/>
+          <w:sz w:val="20"/>
+          <w:szCs w:val="20"/>
+        </w:rPr>
+        <w:t xml:space="preserve">*Headline:*</w:t>
+      </w:r>
+    </w:p>
+    <w:p>
+      <w:pPr>
+        <w:spacing w:before="0" w:after="110" w:line="260"/>
+      </w:pPr>
+      <w:r>
+        <w:rPr>
+          <w:rFonts w:ascii="Aptos Mono" w:cs="Aptos Mono" w:eastAsia="Aptos Mono" w:hAnsi="Aptos Mono"/>
+          <w:b w:val="false"/>
+          <w:bCs w:val="false"/>
+          <w:color w:val="1E5E85"/>
+          <w:sz w:val="18"/>
+          <w:szCs w:val="18"/>
+        </w:rPr>
+        <w:t xml:space="preserve">Fresh from</w:t>
+      </w:r>
+    </w:p>
+    <w:p>
+      <w:pPr>
+        <w:spacing w:before="0" w:after="110" w:line="260"/>
+      </w:pPr>
+      <w:r>
+        <w:rPr>
+          <w:rFonts w:ascii="Aptos Mono" w:cs="Aptos Mono" w:eastAsia="Aptos Mono" w:hAnsi="Aptos Mono"/>
+          <w:b w:val="false"/>
+          <w:bCs w:val="false"/>
+          <w:color w:val="1E5E85"/>
+          <w:sz w:val="18"/>
+          <w:szCs w:val="18"/>
+        </w:rPr>
+        <w:t xml:space="preserve">our ovens.</w:t>
+      </w:r>
+    </w:p>
+    <w:p>
+      <w:pPr>
+        <w:spacing w:before="0" w:after="110" w:line="260"/>
+      </w:pPr>
+      <w:r>
+        <w:rPr>
+          <w:rFonts w:ascii="Aptos" w:cs="Aptos" w:eastAsia="Aptos" w:hAnsi="Aptos"/>
+          <w:b/>
+          <w:bCs/>
+          <w:color w:val="25323B"/>
+          <w:sz w:val="20"/>
+          <w:szCs w:val="20"/>
+        </w:rPr>
+        <w:t xml:space="preserve">*Text:*</w:t>
+      </w:r>
+      <w:r>
+        <w:rPr>
+          <w:rFonts w:ascii="Aptos" w:cs="Aptos" w:eastAsia="Aptos" w:hAnsi="Aptos"/>
+          <w:b w:val="false"/>
+          <w:bCs w:val="false"/>
+          <w:color w:val="25323B"/>
+          <w:sz w:val="20"/>
+          <w:szCs w:val="20"/>
+        </w:rPr>
+        <w:t xml:space="preserve"> </w:t>
+      </w:r>
+      <w:r>
+        <w:rPr>
+          <w:rFonts w:ascii="Aptos Mono" w:cs="Aptos Mono" w:eastAsia="Aptos Mono" w:hAnsi="Aptos Mono"/>
+          <w:b w:val="false"/>
+          <w:bCs w:val="false"/>
+          <w:color w:val="1E5E85"/>
+          <w:sz w:val="18"/>
+          <w:szCs w:val="18"/>
+        </w:rPr>
+        <w:t xml:space="preserve">Build your box with the Mexican breads your family loves, baked locally with superior ingredients.</w:t>
+      </w:r>
+    </w:p>
+    <w:p>
+      <w:pPr>
+        <w:spacing w:before="0" w:after="110" w:line="260"/>
+      </w:pPr>
+      <w:r>
+        <w:rPr>
+          <w:rFonts w:ascii="Aptos" w:cs="Aptos" w:eastAsia="Aptos" w:hAnsi="Aptos"/>
+          <w:b/>
+          <w:bCs/>
+          <w:color w:val="25323B"/>
+          <w:sz w:val="20"/>
+          <w:szCs w:val="20"/>
+        </w:rPr>
+        <w:t xml:space="preserve">*Button:*</w:t>
+      </w:r>
+      <w:r>
+        <w:rPr>
+          <w:rFonts w:ascii="Aptos" w:cs="Aptos" w:eastAsia="Aptos" w:hAnsi="Aptos"/>
+          <w:b w:val="false"/>
+          <w:bCs w:val="false"/>
+          <w:color w:val="25323B"/>
+          <w:sz w:val="20"/>
+          <w:szCs w:val="20"/>
+        </w:rPr>
+        <w:t xml:space="preserve"> </w:t>
+      </w:r>
+      <w:r>
+        <w:rPr>
+          <w:rFonts w:ascii="Aptos Mono" w:cs="Aptos Mono" w:eastAsia="Aptos Mono" w:hAnsi="Aptos Mono"/>
+          <w:b w:val="false"/>
+          <w:bCs w:val="false"/>
+          <w:color w:val="1E5E85"/>
+          <w:sz w:val="18"/>
+          <w:szCs w:val="18"/>
+        </w:rPr>
+        <w:t xml:space="preserve">Shop fresh</w:t>
+      </w:r>
+    </w:p>
+    <w:p>
+      <w:pPr>
+        <w:pStyle w:val="Heading1"/>
+        <w:keepNext/>
+        <w:spacing w:before="260" w:after="90"/>
+      </w:pPr>
+      <w:r>
+        <w:rPr>
+          <w:rFonts w:ascii="Aptos" w:cs="Aptos" w:eastAsia="Aptos" w:hAnsi="Aptos"/>
+          <w:b w:val="false"/>
+          <w:bCs w:val="false"/>
+          <w:color w:val="1E5E85"/>
+          <w:sz w:val="28"/>
+          <w:szCs w:val="28"/>
+        </w:rPr>
+        <w:t xml:space="preserve">Your bakery, made simpler</w:t>
+      </w:r>
+    </w:p>
+    <w:p>
+      <w:pPr>
+        <w:spacing w:before="0" w:after="110" w:line="260"/>
+      </w:pPr>
+      <w:r>
+        <w:rPr>
+          <w:rFonts w:ascii="Aptos" w:cs="Aptos" w:eastAsia="Aptos" w:hAnsi="Aptos"/>
+          <w:b/>
+          <w:bCs/>
+          <w:color w:val="25323B"/>
+          <w:sz w:val="20"/>
+          <w:szCs w:val="20"/>
+        </w:rPr>
+        <w:t xml:space="preserve">*Audience label:*</w:t>
+      </w:r>
+      <w:r>
+        <w:rPr>
+          <w:rFonts w:ascii="Aptos" w:cs="Aptos" w:eastAsia="Aptos" w:hAnsi="Aptos"/>
+          <w:b w:val="false"/>
+          <w:bCs w:val="false"/>
+          <w:color w:val="25323B"/>
+          <w:sz w:val="20"/>
+          <w:szCs w:val="20"/>
+        </w:rPr>
+        <w:t xml:space="preserve"> </w:t>
+      </w:r>
+      <w:r>
+        <w:rPr>
+          <w:rFonts w:ascii="Aptos Mono" w:cs="Aptos Mono" w:eastAsia="Aptos Mono" w:hAnsi="Aptos Mono"/>
+          <w:b w:val="false"/>
+          <w:bCs w:val="false"/>
+          <w:color w:val="1E5E85"/>
+          <w:sz w:val="18"/>
+          <w:szCs w:val="18"/>
+        </w:rPr>
+        <w:t xml:space="preserve">For retail &amp; foodservice</w:t>
+      </w:r>
+    </w:p>
+    <w:p>
+      <w:pPr>
+        <w:spacing w:before="0" w:after="110" w:line="260"/>
+      </w:pPr>
+      <w:r>
+        <w:rPr>
+          <w:rFonts w:ascii="Aptos" w:cs="Aptos" w:eastAsia="Aptos" w:hAnsi="Aptos"/>
+          <w:b/>
+          <w:bCs/>
+          <w:color w:val="25323B"/>
+          <w:sz w:val="20"/>
+          <w:szCs w:val="20"/>
+        </w:rPr>
+        <w:t xml:space="preserve">*Headline:*</w:t>
+      </w:r>
+    </w:p>
+    <w:p>
+      <w:pPr>
+        <w:spacing w:before="0" w:after="110" w:line="260"/>
+      </w:pPr>
+      <w:r>
+        <w:rPr>
+          <w:rFonts w:ascii="Aptos Mono" w:cs="Aptos Mono" w:eastAsia="Aptos Mono" w:hAnsi="Aptos Mono"/>
+          <w:b w:val="false"/>
+          <w:bCs w:val="false"/>
+          <w:color w:val="1E5E85"/>
+          <w:sz w:val="18"/>
+          <w:szCs w:val="18"/>
+        </w:rPr>
+        <w:t xml:space="preserve">Your bakery,</w:t>
+      </w:r>
+    </w:p>
+    <w:p>
+      <w:pPr>
+        <w:spacing w:before="0" w:after="110" w:line="260"/>
+      </w:pPr>
+      <w:r>
+        <w:rPr>
+          <w:rFonts w:ascii="Aptos Mono" w:cs="Aptos Mono" w:eastAsia="Aptos Mono" w:hAnsi="Aptos Mono"/>
+          <w:b w:val="false"/>
+          <w:bCs w:val="false"/>
+          <w:color w:val="1E5E85"/>
+          <w:sz w:val="18"/>
+          <w:szCs w:val="18"/>
+        </w:rPr>
+        <w:t xml:space="preserve">made simpler.</w:t>
+      </w:r>
+    </w:p>
+    <w:p>
+      <w:pPr>
+        <w:spacing w:before="0" w:after="110" w:line="260"/>
+      </w:pPr>
+      <w:r>
+        <w:rPr>
+          <w:rFonts w:ascii="Aptos" w:cs="Aptos" w:eastAsia="Aptos" w:hAnsi="Aptos"/>
+          <w:b/>
+          <w:bCs/>
+          <w:color w:val="25323B"/>
+          <w:sz w:val="20"/>
+          <w:szCs w:val="20"/>
+        </w:rPr>
+        <w:t xml:space="preserve">*Text:*</w:t>
+      </w:r>
+      <w:r>
+        <w:rPr>
+          <w:rFonts w:ascii="Aptos" w:cs="Aptos" w:eastAsia="Aptos" w:hAnsi="Aptos"/>
+          <w:b w:val="false"/>
+          <w:bCs w:val="false"/>
+          <w:color w:val="25323B"/>
+          <w:sz w:val="20"/>
+          <w:szCs w:val="20"/>
+        </w:rPr>
+        <w:t xml:space="preserve"> </w:t>
+      </w:r>
+      <w:r>
+        <w:rPr>
+          <w:rFonts w:ascii="Aptos Mono" w:cs="Aptos Mono" w:eastAsia="Aptos Mono" w:hAnsi="Aptos Mono"/>
+          <w:b w:val="false"/>
+          <w:bCs w:val="false"/>
+          <w:color w:val="1E5E85"/>
+          <w:sz w:val="18"/>
+          <w:szCs w:val="18"/>
+        </w:rPr>
+        <w:t xml:space="preserve">Frozen dough and fully baked programs with dependable quality, lower waste and less labor.</w:t>
+      </w:r>
+    </w:p>
+    <w:p>
+      <w:pPr>
+        <w:spacing w:before="0" w:after="110" w:line="260"/>
+      </w:pPr>
+      <w:r>
+        <w:rPr>
+          <w:rFonts w:ascii="Aptos" w:cs="Aptos" w:eastAsia="Aptos" w:hAnsi="Aptos"/>
+          <w:b/>
+          <w:bCs/>
+          <w:color w:val="25323B"/>
+          <w:sz w:val="20"/>
+          <w:szCs w:val="20"/>
+        </w:rPr>
+        <w:t xml:space="preserve">*Button:*</w:t>
+      </w:r>
+      <w:r>
+        <w:rPr>
+          <w:rFonts w:ascii="Aptos" w:cs="Aptos" w:eastAsia="Aptos" w:hAnsi="Aptos"/>
+          <w:b w:val="false"/>
+          <w:bCs w:val="false"/>
+          <w:color w:val="25323B"/>
+          <w:sz w:val="20"/>
+          <w:szCs w:val="20"/>
+        </w:rPr>
+        <w:t xml:space="preserve"> </w:t>
+      </w:r>
+      <w:r>
+        <w:rPr>
+          <w:rFonts w:ascii="Aptos Mono" w:cs="Aptos Mono" w:eastAsia="Aptos Mono" w:hAnsi="Aptos Mono"/>
+          <w:b w:val="false"/>
+          <w:bCs w:val="false"/>
+          <w:color w:val="1E5E85"/>
+          <w:sz w:val="18"/>
+          <w:szCs w:val="18"/>
+        </w:rPr>
+        <w:t xml:space="preserve">Explore wholesale</w:t>
+      </w:r>
+    </w:p>
+    <w:p>
+      <w:pPr>
+        <w:spacing w:before="0" w:after="110" w:line="260"/>
+      </w:pPr>
+      <w:r>
+        <w:rPr>
+          <w:rFonts w:ascii="Aptos" w:cs="Aptos" w:eastAsia="Aptos" w:hAnsi="Aptos"/>
+          <w:b w:val="false"/>
+          <w:bCs w:val="false"/>
+          <w:color w:val="25323B"/>
+          <w:sz w:val="20"/>
+          <w:szCs w:val="20"/>
+        </w:rPr>
+        <w:t xml:space="preserve">Validation: [ ] Approved as written  [ ] Changes requested</w:t>
+      </w:r>
+    </w:p>
+    <w:p>
+      <w:pPr>
+        <w:spacing w:before="0" w:after="110" w:line="260"/>
+      </w:pPr>
+      <w:r>
+        <w:rPr>
+          <w:rFonts w:ascii="Aptos" w:cs="Aptos" w:eastAsia="Aptos" w:hAnsi="Aptos"/>
+          <w:b w:val="false"/>
+          <w:bCs w:val="false"/>
+          <w:color w:val="25323B"/>
+          <w:sz w:val="20"/>
+          <w:szCs w:val="20"/>
+        </w:rPr>
+        <w:t xml:space="preserve">Notes: ______________________________________________________________________</w:t>
+      </w:r>
+    </w:p>
+    <w:p>
+      <w:pPr>
+        <w:pStyle w:val="Heading1"/>
+        <w:keepNext/>
+        <w:spacing w:before="260" w:after="90"/>
+      </w:pPr>
+      <w:r>
+        <w:rPr>
+          <w:rFonts w:ascii="Aptos" w:cs="Aptos" w:eastAsia="Aptos" w:hAnsi="Aptos"/>
+          <w:b w:val="false"/>
+          <w:bCs w:val="false"/>
+          <w:color w:val="1E5E85"/>
+          <w:sz w:val="28"/>
+          <w:szCs w:val="28"/>
+        </w:rPr>
+        <w:t xml:space="preserve">Two ways to enjoy Artimex</w:t>
+      </w:r>
+    </w:p>
+    <w:p>
+      <w:pPr>
+        <w:spacing w:before="0" w:after="110" w:line="260"/>
+      </w:pPr>
+      <w:r>
+        <w:rPr>
+          <w:rFonts w:ascii="Aptos" w:cs="Aptos" w:eastAsia="Aptos" w:hAnsi="Aptos"/>
+          <w:b/>
+          <w:bCs/>
+          <w:color w:val="25323B"/>
+          <w:sz w:val="20"/>
+          <w:szCs w:val="20"/>
+        </w:rPr>
+        <w:t xml:space="preserve">*Eyebrow:*</w:t>
+      </w:r>
+      <w:r>
+        <w:rPr>
+          <w:rFonts w:ascii="Aptos" w:cs="Aptos" w:eastAsia="Aptos" w:hAnsi="Aptos"/>
+          <w:b w:val="false"/>
+          <w:bCs w:val="false"/>
+          <w:color w:val="25323B"/>
+          <w:sz w:val="20"/>
+          <w:szCs w:val="20"/>
+        </w:rPr>
+        <w:t xml:space="preserve"> </w:t>
+      </w:r>
+      <w:r>
+        <w:rPr>
+          <w:rFonts w:ascii="Aptos Mono" w:cs="Aptos Mono" w:eastAsia="Aptos Mono" w:hAnsi="Aptos Mono"/>
+          <w:b w:val="false"/>
+          <w:bCs w:val="false"/>
+          <w:color w:val="1E5E85"/>
+          <w:sz w:val="18"/>
+          <w:szCs w:val="18"/>
+        </w:rPr>
+        <w:t xml:space="preserve">Two ways to enjoy Artimex</w:t>
+      </w:r>
+    </w:p>
+    <w:p>
+      <w:pPr>
+        <w:spacing w:before="0" w:after="110" w:line="260"/>
+      </w:pPr>
+      <w:r>
+        <w:rPr>
+          <w:rFonts w:ascii="Aptos" w:cs="Aptos" w:eastAsia="Aptos" w:hAnsi="Aptos"/>
+          <w:b/>
+          <w:bCs/>
+          <w:color w:val="25323B"/>
+          <w:sz w:val="20"/>
+          <w:szCs w:val="20"/>
+        </w:rPr>
+        <w:t xml:space="preserve">*Headline:*</w:t>
+      </w:r>
+    </w:p>
+    <w:p>
+      <w:pPr>
+        <w:spacing w:before="0" w:after="110" w:line="260"/>
+      </w:pPr>
+      <w:r>
+        <w:rPr>
+          <w:rFonts w:ascii="Aptos Mono" w:cs="Aptos Mono" w:eastAsia="Aptos Mono" w:hAnsi="Aptos Mono"/>
+          <w:b w:val="false"/>
+          <w:bCs w:val="false"/>
+          <w:color w:val="1E5E85"/>
+          <w:sz w:val="18"/>
+          <w:szCs w:val="18"/>
+        </w:rPr>
+        <w:t xml:space="preserve">Fresh for the table.</w:t>
+      </w:r>
+    </w:p>
+    <w:p>
+      <w:pPr>
+        <w:spacing w:before="0" w:after="110" w:line="260"/>
+      </w:pPr>
+      <w:r>
+        <w:rPr>
+          <w:rFonts w:ascii="Aptos Mono" w:cs="Aptos Mono" w:eastAsia="Aptos Mono" w:hAnsi="Aptos Mono"/>
+          <w:b w:val="false"/>
+          <w:bCs w:val="false"/>
+          <w:color w:val="1E5E85"/>
+          <w:sz w:val="18"/>
+          <w:szCs w:val="18"/>
+        </w:rPr>
+        <w:t xml:space="preserve">Frozen for the business.</w:t>
+      </w:r>
+    </w:p>
+    <w:p>
+      <w:pPr>
+        <w:spacing w:before="0" w:after="110" w:line="260"/>
+      </w:pPr>
+      <w:r>
+        <w:rPr>
+          <w:rFonts w:ascii="Aptos" w:cs="Aptos" w:eastAsia="Aptos" w:hAnsi="Aptos"/>
+          <w:b/>
+          <w:bCs/>
+          <w:color w:val="25323B"/>
+          <w:sz w:val="20"/>
+          <w:szCs w:val="20"/>
+        </w:rPr>
+        <w:t xml:space="preserve">*Text:*</w:t>
+      </w:r>
+      <w:r>
+        <w:rPr>
+          <w:rFonts w:ascii="Aptos" w:cs="Aptos" w:eastAsia="Aptos" w:hAnsi="Aptos"/>
+          <w:b w:val="false"/>
+          <w:bCs w:val="false"/>
+          <w:color w:val="25323B"/>
+          <w:sz w:val="20"/>
+          <w:szCs w:val="20"/>
+        </w:rPr>
+        <w:t xml:space="preserve"> </w:t>
+      </w:r>
+      <w:r>
+        <w:rPr>
+          <w:rFonts w:ascii="Aptos Mono" w:cs="Aptos Mono" w:eastAsia="Aptos Mono" w:hAnsi="Aptos Mono"/>
+          <w:b w:val="false"/>
+          <w:bCs w:val="false"/>
+          <w:color w:val="1E5E85"/>
+          <w:sz w:val="18"/>
+          <w:szCs w:val="18"/>
+        </w:rPr>
+        <w:t xml:space="preserve">One product philosophy, two eCommerce journeys. Customers can buy freshly prepared bakery items, while restaurants and markets can build wholesale ready-to-bake orders.</w:t>
+      </w:r>
+    </w:p>
+    <w:p>
+      <w:pPr>
+        <w:spacing w:before="0" w:after="110" w:line="260"/>
+      </w:pPr>
+      <w:r>
+        <w:rPr>
+          <w:rFonts w:ascii="Aptos" w:cs="Aptos" w:eastAsia="Aptos" w:hAnsi="Aptos"/>
+          <w:b w:val="false"/>
+          <w:bCs w:val="false"/>
+          <w:color w:val="25323B"/>
+          <w:sz w:val="20"/>
+          <w:szCs w:val="20"/>
+        </w:rPr>
+        <w:t xml:space="preserve">Validation: [ ] Approved as written  [ ] Changes requested</w:t>
+      </w:r>
+    </w:p>
+    <w:p>
+      <w:pPr>
+        <w:spacing w:before="0" w:after="110" w:line="260"/>
+      </w:pPr>
+      <w:r>
+        <w:rPr>
+          <w:rFonts w:ascii="Aptos" w:cs="Aptos" w:eastAsia="Aptos" w:hAnsi="Aptos"/>
+          <w:b w:val="false"/>
+          <w:bCs w:val="false"/>
+          <w:color w:val="25323B"/>
+          <w:sz w:val="20"/>
+          <w:szCs w:val="20"/>
+        </w:rPr>
+        <w:t xml:space="preserve">Notes: ______________________________________________________________________</w:t>
+      </w:r>
+    </w:p>
+    <w:p>
+      <w:pPr>
+        <w:pStyle w:val="Heading1"/>
+        <w:keepNext/>
+        <w:spacing w:before="260" w:after="90"/>
+      </w:pPr>
+      <w:r>
+        <w:rPr>
+          <w:rFonts w:ascii="Aptos" w:cs="Aptos" w:eastAsia="Aptos" w:hAnsi="Aptos"/>
+          <w:b w:val="false"/>
+          <w:bCs w:val="false"/>
+          <w:color w:val="1E5E85"/>
+          <w:sz w:val="28"/>
+          <w:szCs w:val="28"/>
+        </w:rPr>
+        <w:t xml:space="preserve">The Artimex collection</w:t>
+      </w:r>
+    </w:p>
+    <w:p>
+      <w:pPr>
+        <w:spacing w:before="0" w:after="110" w:line="260"/>
+      </w:pPr>
+      <w:r>
+        <w:rPr>
+          <w:rFonts w:ascii="Aptos" w:cs="Aptos" w:eastAsia="Aptos" w:hAnsi="Aptos"/>
+          <w:b/>
+          <w:bCs/>
+          <w:color w:val="25323B"/>
+          <w:sz w:val="20"/>
+          <w:szCs w:val="20"/>
+        </w:rPr>
+        <w:t xml:space="preserve">*Tab label:*</w:t>
+      </w:r>
+      <w:r>
+        <w:rPr>
+          <w:rFonts w:ascii="Aptos" w:cs="Aptos" w:eastAsia="Aptos" w:hAnsi="Aptos"/>
+          <w:b w:val="false"/>
+          <w:bCs w:val="false"/>
+          <w:color w:val="25323B"/>
+          <w:sz w:val="20"/>
+          <w:szCs w:val="20"/>
+        </w:rPr>
+        <w:t xml:space="preserve"> </w:t>
+      </w:r>
+      <w:r>
+        <w:rPr>
+          <w:rFonts w:ascii="Aptos Mono" w:cs="Aptos Mono" w:eastAsia="Aptos Mono" w:hAnsi="Aptos Mono"/>
+          <w:b w:val="false"/>
+          <w:bCs w:val="false"/>
+          <w:color w:val="1E5E85"/>
+          <w:sz w:val="18"/>
+          <w:szCs w:val="18"/>
+        </w:rPr>
+        <w:t xml:space="preserve">Fresh bakery</w:t>
+      </w:r>
+    </w:p>
+    <w:p>
+      <w:pPr>
+        <w:spacing w:before="0" w:after="110" w:line="260"/>
+      </w:pPr>
+      <w:r>
+        <w:rPr>
+          <w:rFonts w:ascii="Aptos" w:cs="Aptos" w:eastAsia="Aptos" w:hAnsi="Aptos"/>
+          <w:b/>
+          <w:bCs/>
+          <w:color w:val="25323B"/>
+          <w:sz w:val="20"/>
+          <w:szCs w:val="20"/>
+        </w:rPr>
+        <w:t xml:space="preserve">*Eyebrow:*</w:t>
+      </w:r>
+      <w:r>
+        <w:rPr>
+          <w:rFonts w:ascii="Aptos" w:cs="Aptos" w:eastAsia="Aptos" w:hAnsi="Aptos"/>
+          <w:b w:val="false"/>
+          <w:bCs w:val="false"/>
+          <w:color w:val="25323B"/>
+          <w:sz w:val="20"/>
+          <w:szCs w:val="20"/>
+        </w:rPr>
+        <w:t xml:space="preserve"> </w:t>
+      </w:r>
+      <w:r>
+        <w:rPr>
+          <w:rFonts w:ascii="Aptos Mono" w:cs="Aptos Mono" w:eastAsia="Aptos Mono" w:hAnsi="Aptos Mono"/>
+          <w:b w:val="false"/>
+          <w:bCs w:val="false"/>
+          <w:color w:val="1E5E85"/>
+          <w:sz w:val="18"/>
+          <w:szCs w:val="18"/>
+        </w:rPr>
+        <w:t xml:space="preserve">The Artimex collection</w:t>
+      </w:r>
+    </w:p>
+    <w:p>
+      <w:pPr>
+        <w:spacing w:before="0" w:after="110" w:line="260"/>
+      </w:pPr>
+      <w:r>
+        <w:rPr>
+          <w:rFonts w:ascii="Aptos" w:cs="Aptos" w:eastAsia="Aptos" w:hAnsi="Aptos"/>
+          <w:b/>
+          <w:bCs/>
+          <w:color w:val="25323B"/>
+          <w:sz w:val="20"/>
+          <w:szCs w:val="20"/>
+        </w:rPr>
+        <w:t xml:space="preserve">*Title:*</w:t>
+      </w:r>
+      <w:r>
+        <w:rPr>
+          <w:rFonts w:ascii="Aptos" w:cs="Aptos" w:eastAsia="Aptos" w:hAnsi="Aptos"/>
+          <w:b w:val="false"/>
+          <w:bCs w:val="false"/>
+          <w:color w:val="25323B"/>
+          <w:sz w:val="20"/>
+          <w:szCs w:val="20"/>
+        </w:rPr>
+        <w:t xml:space="preserve"> </w:t>
+      </w:r>
+      <w:r>
+        <w:rPr>
+          <w:rFonts w:ascii="Aptos Mono" w:cs="Aptos Mono" w:eastAsia="Aptos Mono" w:hAnsi="Aptos Mono"/>
+          <w:b w:val="false"/>
+          <w:bCs w:val="false"/>
+          <w:color w:val="1E5E85"/>
+          <w:sz w:val="18"/>
+          <w:szCs w:val="18"/>
+        </w:rPr>
+        <w:t xml:space="preserve">Find your favorite.</w:t>
+      </w:r>
+    </w:p>
+    <w:p>
+      <w:pPr>
+        <w:spacing w:before="0" w:after="110" w:line="260"/>
+      </w:pPr>
+      <w:r>
+        <w:rPr>
+          <w:rFonts w:ascii="Aptos" w:cs="Aptos" w:eastAsia="Aptos" w:hAnsi="Aptos"/>
+          <w:b/>
+          <w:bCs/>
+          <w:color w:val="25323B"/>
+          <w:sz w:val="20"/>
+          <w:szCs w:val="20"/>
+        </w:rPr>
+        <w:t xml:space="preserve">*Filter label:*</w:t>
+      </w:r>
+      <w:r>
+        <w:rPr>
+          <w:rFonts w:ascii="Aptos" w:cs="Aptos" w:eastAsia="Aptos" w:hAnsi="Aptos"/>
+          <w:b w:val="false"/>
+          <w:bCs w:val="false"/>
+          <w:color w:val="25323B"/>
+          <w:sz w:val="20"/>
+          <w:szCs w:val="20"/>
+        </w:rPr>
+        <w:t xml:space="preserve"> </w:t>
+      </w:r>
+      <w:r>
+        <w:rPr>
+          <w:rFonts w:ascii="Aptos Mono" w:cs="Aptos Mono" w:eastAsia="Aptos Mono" w:hAnsi="Aptos Mono"/>
+          <w:b w:val="false"/>
+          <w:bCs w:val="false"/>
+          <w:color w:val="1E5E85"/>
+          <w:sz w:val="18"/>
+          <w:szCs w:val="18"/>
+        </w:rPr>
+        <w:t xml:space="preserve">Product filters</w:t>
+      </w:r>
+    </w:p>
+    <w:p>
+      <w:pPr>
+        <w:spacing w:before="0" w:after="110" w:line="260"/>
+      </w:pPr>
+      <w:r>
+        <w:rPr>
+          <w:rFonts w:ascii="Aptos" w:cs="Aptos" w:eastAsia="Aptos" w:hAnsi="Aptos"/>
+          <w:b/>
+          <w:bCs/>
+          <w:color w:val="25323B"/>
+          <w:sz w:val="20"/>
+          <w:szCs w:val="20"/>
+        </w:rPr>
+        <w:t xml:space="preserve">*Filter options:*</w:t>
+      </w:r>
+      <w:r>
+        <w:rPr>
+          <w:rFonts w:ascii="Aptos" w:cs="Aptos" w:eastAsia="Aptos" w:hAnsi="Aptos"/>
+          <w:b w:val="false"/>
+          <w:bCs w:val="false"/>
+          <w:color w:val="25323B"/>
+          <w:sz w:val="20"/>
+          <w:szCs w:val="20"/>
+        </w:rPr>
+        <w:t xml:space="preserve"> </w:t>
+      </w:r>
+      <w:r>
+        <w:rPr>
+          <w:rFonts w:ascii="Aptos Mono" w:cs="Aptos Mono" w:eastAsia="Aptos Mono" w:hAnsi="Aptos Mono"/>
+          <w:b w:val="false"/>
+          <w:bCs w:val="false"/>
+          <w:color w:val="1E5E85"/>
+          <w:sz w:val="18"/>
+          <w:szCs w:val="18"/>
+        </w:rPr>
+        <w:t xml:space="preserve">All</w:t>
+      </w:r>
+      <w:r>
+        <w:rPr>
+          <w:rFonts w:ascii="Aptos" w:cs="Aptos" w:eastAsia="Aptos" w:hAnsi="Aptos"/>
+          <w:b w:val="false"/>
+          <w:bCs w:val="false"/>
+          <w:color w:val="25323B"/>
+          <w:sz w:val="20"/>
+          <w:szCs w:val="20"/>
+        </w:rPr>
+        <w:t xml:space="preserve"> · </w:t>
+      </w:r>
+      <w:r>
+        <w:rPr>
+          <w:rFonts w:ascii="Aptos Mono" w:cs="Aptos Mono" w:eastAsia="Aptos Mono" w:hAnsi="Aptos Mono"/>
+          <w:b w:val="false"/>
+          <w:bCs w:val="false"/>
+          <w:color w:val="1E5E85"/>
+          <w:sz w:val="18"/>
+          <w:szCs w:val="18"/>
+        </w:rPr>
+        <w:t xml:space="preserve">Conchas</w:t>
+      </w:r>
+      <w:r>
+        <w:rPr>
+          <w:rFonts w:ascii="Aptos" w:cs="Aptos" w:eastAsia="Aptos" w:hAnsi="Aptos"/>
+          <w:b w:val="false"/>
+          <w:bCs w:val="false"/>
+          <w:color w:val="25323B"/>
+          <w:sz w:val="20"/>
+          <w:szCs w:val="20"/>
+        </w:rPr>
+        <w:t xml:space="preserve"> · </w:t>
+      </w:r>
+      <w:r>
+        <w:rPr>
+          <w:rFonts w:ascii="Aptos Mono" w:cs="Aptos Mono" w:eastAsia="Aptos Mono" w:hAnsi="Aptos Mono"/>
+          <w:b w:val="false"/>
+          <w:bCs w:val="false"/>
+          <w:color w:val="1E5E85"/>
+          <w:sz w:val="18"/>
+          <w:szCs w:val="18"/>
+        </w:rPr>
+        <w:t xml:space="preserve">Savory</w:t>
+      </w:r>
+      <w:r>
+        <w:rPr>
+          <w:rFonts w:ascii="Aptos" w:cs="Aptos" w:eastAsia="Aptos" w:hAnsi="Aptos"/>
+          <w:b w:val="false"/>
+          <w:bCs w:val="false"/>
+          <w:color w:val="25323B"/>
+          <w:sz w:val="20"/>
+          <w:szCs w:val="20"/>
+        </w:rPr>
+        <w:t xml:space="preserve"> · </w:t>
+      </w:r>
+      <w:r>
+        <w:rPr>
+          <w:rFonts w:ascii="Aptos Mono" w:cs="Aptos Mono" w:eastAsia="Aptos Mono" w:hAnsi="Aptos Mono"/>
+          <w:b w:val="false"/>
+          <w:bCs w:val="false"/>
+          <w:color w:val="1E5E85"/>
+          <w:sz w:val="18"/>
+          <w:szCs w:val="18"/>
+        </w:rPr>
+        <w:t xml:space="preserve">Pastries</w:t>
+      </w:r>
+    </w:p>
+    <w:p>
+      <w:pPr>
+        <w:spacing w:before="0" w:after="110" w:line="260"/>
+      </w:pPr>
+      <w:r>
+        <w:rPr>
+          <w:rFonts w:ascii="Aptos" w:cs="Aptos" w:eastAsia="Aptos" w:hAnsi="Aptos"/>
+          <w:b/>
+          <w:bCs/>
+          <w:color w:val="25323B"/>
+          <w:sz w:val="20"/>
+          <w:szCs w:val="20"/>
+        </w:rPr>
+        <w:t xml:space="preserve">*Button on each product:*</w:t>
+      </w:r>
+      <w:r>
+        <w:rPr>
+          <w:rFonts w:ascii="Aptos" w:cs="Aptos" w:eastAsia="Aptos" w:hAnsi="Aptos"/>
+          <w:b w:val="false"/>
+          <w:bCs w:val="false"/>
+          <w:color w:val="25323B"/>
+          <w:sz w:val="20"/>
+          <w:szCs w:val="20"/>
+        </w:rPr>
+        <w:t xml:space="preserve"> </w:t>
+      </w:r>
+      <w:r>
+        <w:rPr>
+          <w:rFonts w:ascii="Aptos Mono" w:cs="Aptos Mono" w:eastAsia="Aptos Mono" w:hAnsi="Aptos Mono"/>
+          <w:b w:val="false"/>
+          <w:bCs w:val="false"/>
+          <w:color w:val="1E5E85"/>
+          <w:sz w:val="18"/>
+          <w:szCs w:val="18"/>
+        </w:rPr>
+        <w:t xml:space="preserve">Add to basket</w:t>
       </w:r>
     </w:p>
     <w:p>
@@ -1584,886 +2444,8 @@
           <w:b w:val="false"/>
           <w:bCs w:val="false"/>
           <w:color w:val="1E5E85"/>
-          <w:sz w:val="22"/>
-          <w:szCs w:val="22"/>
-        </w:rPr>
-        <w:t xml:space="preserve">Fresh from our ovens</w:t>
-      </w:r>
-    </w:p>
-    <w:p>
-      <w:pPr>
-        <w:spacing w:before="0" w:after="110" w:line="260"/>
-      </w:pPr>
-      <w:r>
-        <w:rPr>
-          <w:rFonts w:ascii="Aptos" w:cs="Aptos" w:eastAsia="Aptos" w:hAnsi="Aptos"/>
-          <w:b/>
-          <w:bCs/>
-          <w:color w:val="25323B"/>
-          <w:sz w:val="20"/>
-          <w:szCs w:val="20"/>
-        </w:rPr>
-        <w:t xml:space="preserve">*Audience label:*</w:t>
-      </w:r>
-      <w:r>
-        <w:rPr>
-          <w:rFonts w:ascii="Aptos" w:cs="Aptos" w:eastAsia="Aptos" w:hAnsi="Aptos"/>
-          <w:b w:val="false"/>
-          <w:bCs w:val="false"/>
-          <w:color w:val="25323B"/>
-          <w:sz w:val="20"/>
-          <w:szCs w:val="20"/>
-        </w:rPr>
-        <w:t xml:space="preserve"> </w:t>
-      </w:r>
-      <w:r>
-        <w:rPr>
-          <w:rFonts w:ascii="Aptos Mono" w:cs="Aptos Mono" w:eastAsia="Aptos Mono" w:hAnsi="Aptos Mono"/>
-          <w:b w:val="false"/>
-          <w:bCs w:val="false"/>
-          <w:color w:val="1E5E85"/>
-          <w:sz w:val="18"/>
-          <w:szCs w:val="18"/>
-        </w:rPr>
-        <w:t xml:space="preserve">For home &amp; family</w:t>
-      </w:r>
-    </w:p>
-    <w:p>
-      <w:pPr>
-        <w:spacing w:before="0" w:after="110" w:line="260"/>
-      </w:pPr>
-      <w:r>
-        <w:rPr>
-          <w:rFonts w:ascii="Aptos" w:cs="Aptos" w:eastAsia="Aptos" w:hAnsi="Aptos"/>
-          <w:b/>
-          <w:bCs/>
-          <w:color w:val="25323B"/>
-          <w:sz w:val="20"/>
-          <w:szCs w:val="20"/>
-        </w:rPr>
-        <w:t xml:space="preserve">*Headline:*</w:t>
-      </w:r>
-    </w:p>
-    <w:p>
-      <w:pPr>
-        <w:spacing w:before="0" w:after="110" w:line="260"/>
-      </w:pPr>
-      <w:r>
-        <w:rPr>
-          <w:rFonts w:ascii="Aptos Mono" w:cs="Aptos Mono" w:eastAsia="Aptos Mono" w:hAnsi="Aptos Mono"/>
-          <w:b w:val="false"/>
-          <w:bCs w:val="false"/>
-          <w:color w:val="1E5E85"/>
-          <w:sz w:val="18"/>
-          <w:szCs w:val="18"/>
-        </w:rPr>
-        <w:t xml:space="preserve">Fresh from</w:t>
-      </w:r>
-    </w:p>
-    <w:p>
-      <w:pPr>
-        <w:spacing w:before="0" w:after="110" w:line="260"/>
-      </w:pPr>
-      <w:r>
-        <w:rPr>
-          <w:rFonts w:ascii="Aptos Mono" w:cs="Aptos Mono" w:eastAsia="Aptos Mono" w:hAnsi="Aptos Mono"/>
-          <w:b w:val="false"/>
-          <w:bCs w:val="false"/>
-          <w:color w:val="1E5E85"/>
-          <w:sz w:val="18"/>
-          <w:szCs w:val="18"/>
-        </w:rPr>
-        <w:t xml:space="preserve">our ovens.</w:t>
-      </w:r>
-    </w:p>
-    <w:p>
-      <w:pPr>
-        <w:spacing w:before="0" w:after="110" w:line="260"/>
-      </w:pPr>
-      <w:r>
-        <w:rPr>
-          <w:rFonts w:ascii="Aptos" w:cs="Aptos" w:eastAsia="Aptos" w:hAnsi="Aptos"/>
-          <w:b/>
-          <w:bCs/>
-          <w:color w:val="25323B"/>
-          <w:sz w:val="20"/>
-          <w:szCs w:val="20"/>
-        </w:rPr>
-        <w:t xml:space="preserve">*Text:*</w:t>
-      </w:r>
-      <w:r>
-        <w:rPr>
-          <w:rFonts w:ascii="Aptos" w:cs="Aptos" w:eastAsia="Aptos" w:hAnsi="Aptos"/>
-          <w:b w:val="false"/>
-          <w:bCs w:val="false"/>
-          <w:color w:val="25323B"/>
-          <w:sz w:val="20"/>
-          <w:szCs w:val="20"/>
-        </w:rPr>
-        <w:t xml:space="preserve"> </w:t>
-      </w:r>
-      <w:r>
-        <w:rPr>
-          <w:rFonts w:ascii="Aptos Mono" w:cs="Aptos Mono" w:eastAsia="Aptos Mono" w:hAnsi="Aptos Mono"/>
-          <w:b w:val="false"/>
-          <w:bCs w:val="false"/>
-          <w:color w:val="1E5E85"/>
-          <w:sz w:val="18"/>
-          <w:szCs w:val="18"/>
-        </w:rPr>
-        <w:t xml:space="preserve">Build your box with the Mexican breads your family loves, baked locally with superior ingredients.</w:t>
-      </w:r>
-    </w:p>
-    <w:p>
-      <w:pPr>
-        <w:spacing w:before="0" w:after="110" w:line="260"/>
-      </w:pPr>
-      <w:r>
-        <w:rPr>
-          <w:rFonts w:ascii="Aptos" w:cs="Aptos" w:eastAsia="Aptos" w:hAnsi="Aptos"/>
-          <w:b/>
-          <w:bCs/>
-          <w:color w:val="25323B"/>
-          <w:sz w:val="20"/>
-          <w:szCs w:val="20"/>
-        </w:rPr>
-        <w:t xml:space="preserve">*Button:*</w:t>
-      </w:r>
-      <w:r>
-        <w:rPr>
-          <w:rFonts w:ascii="Aptos" w:cs="Aptos" w:eastAsia="Aptos" w:hAnsi="Aptos"/>
-          <w:b w:val="false"/>
-          <w:bCs w:val="false"/>
-          <w:color w:val="25323B"/>
-          <w:sz w:val="20"/>
-          <w:szCs w:val="20"/>
-        </w:rPr>
-        <w:t xml:space="preserve"> </w:t>
-      </w:r>
-      <w:r>
-        <w:rPr>
-          <w:rFonts w:ascii="Aptos Mono" w:cs="Aptos Mono" w:eastAsia="Aptos Mono" w:hAnsi="Aptos Mono"/>
-          <w:b w:val="false"/>
-          <w:bCs w:val="false"/>
-          <w:color w:val="1E5E85"/>
-          <w:sz w:val="18"/>
-          <w:szCs w:val="18"/>
-        </w:rPr>
-        <w:t xml:space="preserve">Shop fresh</w:t>
-      </w:r>
-    </w:p>
-    <w:p>
-      <w:pPr>
-        <w:pStyle w:val="Heading2"/>
-        <w:keepNext/>
-        <w:spacing w:before="180" w:after="90"/>
-      </w:pPr>
-      <w:r>
-        <w:rPr>
-          <w:rFonts w:ascii="Aptos" w:cs="Aptos" w:eastAsia="Aptos" w:hAnsi="Aptos"/>
-          <w:b w:val="false"/>
-          <w:bCs w:val="false"/>
-          <w:color w:val="1E5E85"/>
-          <w:sz w:val="22"/>
-          <w:szCs w:val="22"/>
-        </w:rPr>
-        <w:t xml:space="preserve">Your bakery, made simpler</w:t>
-      </w:r>
-    </w:p>
-    <w:p>
-      <w:pPr>
-        <w:spacing w:before="0" w:after="110" w:line="260"/>
-      </w:pPr>
-      <w:r>
-        <w:rPr>
-          <w:rFonts w:ascii="Aptos" w:cs="Aptos" w:eastAsia="Aptos" w:hAnsi="Aptos"/>
-          <w:b/>
-          <w:bCs/>
-          <w:color w:val="25323B"/>
-          <w:sz w:val="20"/>
-          <w:szCs w:val="20"/>
-        </w:rPr>
-        <w:t xml:space="preserve">*Audience label:*</w:t>
-      </w:r>
-      <w:r>
-        <w:rPr>
-          <w:rFonts w:ascii="Aptos" w:cs="Aptos" w:eastAsia="Aptos" w:hAnsi="Aptos"/>
-          <w:b w:val="false"/>
-          <w:bCs w:val="false"/>
-          <w:color w:val="25323B"/>
-          <w:sz w:val="20"/>
-          <w:szCs w:val="20"/>
-        </w:rPr>
-        <w:t xml:space="preserve"> </w:t>
-      </w:r>
-      <w:r>
-        <w:rPr>
-          <w:rFonts w:ascii="Aptos Mono" w:cs="Aptos Mono" w:eastAsia="Aptos Mono" w:hAnsi="Aptos Mono"/>
-          <w:b w:val="false"/>
-          <w:bCs w:val="false"/>
-          <w:color w:val="1E5E85"/>
-          <w:sz w:val="18"/>
-          <w:szCs w:val="18"/>
-        </w:rPr>
-        <w:t xml:space="preserve">For retail &amp; foodservice</w:t>
-      </w:r>
-    </w:p>
-    <w:p>
-      <w:pPr>
-        <w:spacing w:before="0" w:after="110" w:line="260"/>
-      </w:pPr>
-      <w:r>
-        <w:rPr>
-          <w:rFonts w:ascii="Aptos" w:cs="Aptos" w:eastAsia="Aptos" w:hAnsi="Aptos"/>
-          <w:b/>
-          <w:bCs/>
-          <w:color w:val="25323B"/>
-          <w:sz w:val="20"/>
-          <w:szCs w:val="20"/>
-        </w:rPr>
-        <w:t xml:space="preserve">*Headline:*</w:t>
-      </w:r>
-    </w:p>
-    <w:p>
-      <w:pPr>
-        <w:spacing w:before="0" w:after="110" w:line="260"/>
-      </w:pPr>
-      <w:r>
-        <w:rPr>
-          <w:rFonts w:ascii="Aptos Mono" w:cs="Aptos Mono" w:eastAsia="Aptos Mono" w:hAnsi="Aptos Mono"/>
-          <w:b w:val="false"/>
-          <w:bCs w:val="false"/>
-          <w:color w:val="1E5E85"/>
-          <w:sz w:val="18"/>
-          <w:szCs w:val="18"/>
-        </w:rPr>
-        <w:t xml:space="preserve">Your bakery,</w:t>
-      </w:r>
-    </w:p>
-    <w:p>
-      <w:pPr>
-        <w:spacing w:before="0" w:after="110" w:line="260"/>
-      </w:pPr>
-      <w:r>
-        <w:rPr>
-          <w:rFonts w:ascii="Aptos Mono" w:cs="Aptos Mono" w:eastAsia="Aptos Mono" w:hAnsi="Aptos Mono"/>
-          <w:b w:val="false"/>
-          <w:bCs w:val="false"/>
-          <w:color w:val="1E5E85"/>
-          <w:sz w:val="18"/>
-          <w:szCs w:val="18"/>
-        </w:rPr>
-        <w:t xml:space="preserve">made simpler.</w:t>
-      </w:r>
-    </w:p>
-    <w:p>
-      <w:pPr>
-        <w:spacing w:before="0" w:after="110" w:line="260"/>
-      </w:pPr>
-      <w:r>
-        <w:rPr>
-          <w:rFonts w:ascii="Aptos" w:cs="Aptos" w:eastAsia="Aptos" w:hAnsi="Aptos"/>
-          <w:b/>
-          <w:bCs/>
-          <w:color w:val="25323B"/>
-          <w:sz w:val="20"/>
-          <w:szCs w:val="20"/>
-        </w:rPr>
-        <w:t xml:space="preserve">*Text:*</w:t>
-      </w:r>
-      <w:r>
-        <w:rPr>
-          <w:rFonts w:ascii="Aptos" w:cs="Aptos" w:eastAsia="Aptos" w:hAnsi="Aptos"/>
-          <w:b w:val="false"/>
-          <w:bCs w:val="false"/>
-          <w:color w:val="25323B"/>
-          <w:sz w:val="20"/>
-          <w:szCs w:val="20"/>
-        </w:rPr>
-        <w:t xml:space="preserve"> </w:t>
-      </w:r>
-      <w:r>
-        <w:rPr>
-          <w:rFonts w:ascii="Aptos Mono" w:cs="Aptos Mono" w:eastAsia="Aptos Mono" w:hAnsi="Aptos Mono"/>
-          <w:b w:val="false"/>
-          <w:bCs w:val="false"/>
-          <w:color w:val="1E5E85"/>
-          <w:sz w:val="18"/>
-          <w:szCs w:val="18"/>
-        </w:rPr>
-        <w:t xml:space="preserve">Frozen dough and fully baked programs with dependable quality, lower waste and less labor.</w:t>
-      </w:r>
-    </w:p>
-    <w:p>
-      <w:pPr>
-        <w:spacing w:before="0" w:after="110" w:line="260"/>
-      </w:pPr>
-      <w:r>
-        <w:rPr>
-          <w:rFonts w:ascii="Aptos" w:cs="Aptos" w:eastAsia="Aptos" w:hAnsi="Aptos"/>
-          <w:b/>
-          <w:bCs/>
-          <w:color w:val="25323B"/>
-          <w:sz w:val="20"/>
-          <w:szCs w:val="20"/>
-        </w:rPr>
-        <w:t xml:space="preserve">*Button:*</w:t>
-      </w:r>
-      <w:r>
-        <w:rPr>
-          <w:rFonts w:ascii="Aptos" w:cs="Aptos" w:eastAsia="Aptos" w:hAnsi="Aptos"/>
-          <w:b w:val="false"/>
-          <w:bCs w:val="false"/>
-          <w:color w:val="25323B"/>
-          <w:sz w:val="20"/>
-          <w:szCs w:val="20"/>
-        </w:rPr>
-        <w:t xml:space="preserve"> </w:t>
-      </w:r>
-      <w:r>
-        <w:rPr>
-          <w:rFonts w:ascii="Aptos Mono" w:cs="Aptos Mono" w:eastAsia="Aptos Mono" w:hAnsi="Aptos Mono"/>
-          <w:b w:val="false"/>
-          <w:bCs w:val="false"/>
-          <w:color w:val="1E5E85"/>
-          <w:sz w:val="18"/>
-          <w:szCs w:val="18"/>
-        </w:rPr>
-        <w:t xml:space="preserve">Explore wholesale</w:t>
-      </w:r>
-    </w:p>
-    <w:p>
-      <w:pPr>
-        <w:spacing w:before="0" w:after="110" w:line="260"/>
-      </w:pPr>
-      <w:r>
-        <w:rPr>
-          <w:rFonts w:ascii="Aptos" w:cs="Aptos" w:eastAsia="Aptos" w:hAnsi="Aptos"/>
-          <w:b w:val="false"/>
-          <w:bCs w:val="false"/>
-          <w:color w:val="25323B"/>
-          <w:sz w:val="20"/>
-          <w:szCs w:val="20"/>
-        </w:rPr>
-        <w:t xml:space="preserve">Validation: [ ] Approved as written  [ ] Changes requested</w:t>
-      </w:r>
-    </w:p>
-    <w:p>
-      <w:pPr>
-        <w:spacing w:before="0" w:after="110" w:line="260"/>
-      </w:pPr>
-      <w:r>
-        <w:rPr>
-          <w:rFonts w:ascii="Aptos" w:cs="Aptos" w:eastAsia="Aptos" w:hAnsi="Aptos"/>
-          <w:b w:val="false"/>
-          <w:bCs w:val="false"/>
-          <w:color w:val="25323B"/>
-          <w:sz w:val="20"/>
-          <w:szCs w:val="20"/>
-        </w:rPr>
-        <w:t xml:space="preserve">Notes: ______________________________________________________________________</w:t>
-      </w:r>
-    </w:p>
-    <w:p>
-      <w:pPr>
-        <w:pStyle w:val="Heading1"/>
-        <w:keepNext/>
-        <w:spacing w:before="260" w:after="90"/>
-      </w:pPr>
-      <w:r>
-        <w:rPr>
-          <w:rFonts w:ascii="Aptos" w:cs="Aptos" w:eastAsia="Aptos" w:hAnsi="Aptos"/>
-          <w:b w:val="false"/>
-          <w:bCs w:val="false"/>
-          <w:color w:val="1E5E85"/>
-          <w:sz w:val="28"/>
-          <w:szCs w:val="28"/>
-        </w:rPr>
-        <w:t xml:space="preserve">5. Product experience introduction</w:t>
-      </w:r>
-    </w:p>
-    <w:p>
-      <w:pPr>
-        <w:spacing w:before="0" w:after="110" w:line="260"/>
-      </w:pPr>
-      <w:r>
-        <w:rPr>
-          <w:rFonts w:ascii="Aptos" w:cs="Aptos" w:eastAsia="Aptos" w:hAnsi="Aptos"/>
-          <w:b/>
-          <w:bCs/>
-          <w:color w:val="25323B"/>
-          <w:sz w:val="20"/>
-          <w:szCs w:val="20"/>
-        </w:rPr>
-        <w:t xml:space="preserve">*Eyebrow:*</w:t>
-      </w:r>
-      <w:r>
-        <w:rPr>
-          <w:rFonts w:ascii="Aptos" w:cs="Aptos" w:eastAsia="Aptos" w:hAnsi="Aptos"/>
-          <w:b w:val="false"/>
-          <w:bCs w:val="false"/>
-          <w:color w:val="25323B"/>
-          <w:sz w:val="20"/>
-          <w:szCs w:val="20"/>
-        </w:rPr>
-        <w:t xml:space="preserve"> </w:t>
-      </w:r>
-      <w:r>
-        <w:rPr>
-          <w:rFonts w:ascii="Aptos Mono" w:cs="Aptos Mono" w:eastAsia="Aptos Mono" w:hAnsi="Aptos Mono"/>
-          <w:b w:val="false"/>
-          <w:bCs w:val="false"/>
-          <w:color w:val="1E5E85"/>
-          <w:sz w:val="18"/>
-          <w:szCs w:val="18"/>
-        </w:rPr>
-        <w:t xml:space="preserve">Two ways to enjoy Artimex</w:t>
-      </w:r>
-    </w:p>
-    <w:p>
-      <w:pPr>
-        <w:spacing w:before="0" w:after="110" w:line="260"/>
-      </w:pPr>
-      <w:r>
-        <w:rPr>
-          <w:rFonts w:ascii="Aptos" w:cs="Aptos" w:eastAsia="Aptos" w:hAnsi="Aptos"/>
-          <w:b/>
-          <w:bCs/>
-          <w:color w:val="25323B"/>
-          <w:sz w:val="20"/>
-          <w:szCs w:val="20"/>
-        </w:rPr>
-        <w:t xml:space="preserve">*Headline:*</w:t>
-      </w:r>
-    </w:p>
-    <w:p>
-      <w:pPr>
-        <w:spacing w:before="0" w:after="110" w:line="260"/>
-      </w:pPr>
-      <w:r>
-        <w:rPr>
-          <w:rFonts w:ascii="Aptos Mono" w:cs="Aptos Mono" w:eastAsia="Aptos Mono" w:hAnsi="Aptos Mono"/>
-          <w:b w:val="false"/>
-          <w:bCs w:val="false"/>
-          <w:color w:val="1E5E85"/>
-          <w:sz w:val="18"/>
-          <w:szCs w:val="18"/>
-        </w:rPr>
-        <w:t xml:space="preserve">Fresh for the table.</w:t>
-      </w:r>
-    </w:p>
-    <w:p>
-      <w:pPr>
-        <w:spacing w:before="0" w:after="110" w:line="260"/>
-      </w:pPr>
-      <w:r>
-        <w:rPr>
-          <w:rFonts w:ascii="Aptos Mono" w:cs="Aptos Mono" w:eastAsia="Aptos Mono" w:hAnsi="Aptos Mono"/>
-          <w:b w:val="false"/>
-          <w:bCs w:val="false"/>
-          <w:color w:val="1E5E85"/>
-          <w:sz w:val="18"/>
-          <w:szCs w:val="18"/>
-        </w:rPr>
-        <w:t xml:space="preserve">Frozen for the business.</w:t>
-      </w:r>
-    </w:p>
-    <w:p>
-      <w:pPr>
-        <w:spacing w:before="0" w:after="110" w:line="260"/>
-      </w:pPr>
-      <w:r>
-        <w:rPr>
-          <w:rFonts w:ascii="Aptos" w:cs="Aptos" w:eastAsia="Aptos" w:hAnsi="Aptos"/>
-          <w:b/>
-          <w:bCs/>
-          <w:color w:val="25323B"/>
-          <w:sz w:val="20"/>
-          <w:szCs w:val="20"/>
-        </w:rPr>
-        <w:t xml:space="preserve">*Text:*</w:t>
-      </w:r>
-      <w:r>
-        <w:rPr>
-          <w:rFonts w:ascii="Aptos" w:cs="Aptos" w:eastAsia="Aptos" w:hAnsi="Aptos"/>
-          <w:b w:val="false"/>
-          <w:bCs w:val="false"/>
-          <w:color w:val="25323B"/>
-          <w:sz w:val="20"/>
-          <w:szCs w:val="20"/>
-        </w:rPr>
-        <w:t xml:space="preserve"> </w:t>
-      </w:r>
-      <w:r>
-        <w:rPr>
-          <w:rFonts w:ascii="Aptos Mono" w:cs="Aptos Mono" w:eastAsia="Aptos Mono" w:hAnsi="Aptos Mono"/>
-          <w:b w:val="false"/>
-          <w:bCs w:val="false"/>
-          <w:color w:val="1E5E85"/>
-          <w:sz w:val="18"/>
-          <w:szCs w:val="18"/>
-        </w:rPr>
-        <w:t xml:space="preserve">One product philosophy, two eCommerce journeys. Customers can buy freshly prepared bakery items, while restaurants and markets can build wholesale ready-to-bake orders.</w:t>
-      </w:r>
-    </w:p>
-    <w:p>
-      <w:pPr>
-        <w:spacing w:before="0" w:after="110" w:line="260"/>
-      </w:pPr>
-      <w:r>
-        <w:rPr>
-          <w:rFonts w:ascii="Aptos" w:cs="Aptos" w:eastAsia="Aptos" w:hAnsi="Aptos"/>
-          <w:b w:val="false"/>
-          <w:bCs w:val="false"/>
-          <w:color w:val="25323B"/>
-          <w:sz w:val="20"/>
-          <w:szCs w:val="20"/>
-        </w:rPr>
-        <w:t xml:space="preserve">Validation: [ ] Approved as written  [ ] Changes requested</w:t>
-      </w:r>
-    </w:p>
-    <w:p>
-      <w:pPr>
-        <w:spacing w:before="0" w:after="110" w:line="260"/>
-      </w:pPr>
-      <w:r>
-        <w:rPr>
-          <w:rFonts w:ascii="Aptos" w:cs="Aptos" w:eastAsia="Aptos" w:hAnsi="Aptos"/>
-          <w:b w:val="false"/>
-          <w:bCs w:val="false"/>
-          <w:color w:val="25323B"/>
-          <w:sz w:val="20"/>
-          <w:szCs w:val="20"/>
-        </w:rPr>
-        <w:t xml:space="preserve">Notes: ______________________________________________________________________</w:t>
-      </w:r>
-    </w:p>
-    <w:p>
-      <w:pPr>
-        <w:pStyle w:val="Heading1"/>
-        <w:keepNext/>
-        <w:spacing w:before="260" w:after="90"/>
-      </w:pPr>
-      <w:r>
-        <w:rPr>
-          <w:rFonts w:ascii="Aptos" w:cs="Aptos" w:eastAsia="Aptos" w:hAnsi="Aptos"/>
-          <w:b w:val="false"/>
-          <w:bCs w:val="false"/>
-          <w:color w:val="1E5E85"/>
-          <w:sz w:val="28"/>
-          <w:szCs w:val="28"/>
-        </w:rPr>
-        <w:t xml:space="preserve">6. Fresh bakery / B2C catalogue</w:t>
-      </w:r>
-    </w:p>
-    <w:p>
-      <w:pPr>
-        <w:spacing w:before="0" w:after="110" w:line="260"/>
-      </w:pPr>
-      <w:r>
-        <w:rPr>
-          <w:rFonts w:ascii="Aptos" w:cs="Aptos" w:eastAsia="Aptos" w:hAnsi="Aptos"/>
-          <w:b/>
-          <w:bCs/>
-          <w:color w:val="25323B"/>
-          <w:sz w:val="20"/>
-          <w:szCs w:val="20"/>
-        </w:rPr>
-        <w:t xml:space="preserve">*Tab label:*</w:t>
-      </w:r>
-      <w:r>
-        <w:rPr>
-          <w:rFonts w:ascii="Aptos" w:cs="Aptos" w:eastAsia="Aptos" w:hAnsi="Aptos"/>
-          <w:b w:val="false"/>
-          <w:bCs w:val="false"/>
-          <w:color w:val="25323B"/>
-          <w:sz w:val="20"/>
-          <w:szCs w:val="20"/>
-        </w:rPr>
-        <w:t xml:space="preserve"> </w:t>
-      </w:r>
-      <w:r>
-        <w:rPr>
-          <w:rFonts w:ascii="Aptos Mono" w:cs="Aptos Mono" w:eastAsia="Aptos Mono" w:hAnsi="Aptos Mono"/>
-          <w:b w:val="false"/>
-          <w:bCs w:val="false"/>
-          <w:color w:val="1E5E85"/>
-          <w:sz w:val="18"/>
-          <w:szCs w:val="18"/>
-        </w:rPr>
-        <w:t xml:space="preserve">Fresh bakery</w:t>
-      </w:r>
-    </w:p>
-    <w:p>
-      <w:pPr>
-        <w:spacing w:before="0" w:after="110" w:line="260"/>
-      </w:pPr>
-      <w:r>
-        <w:rPr>
-          <w:rFonts w:ascii="Aptos" w:cs="Aptos" w:eastAsia="Aptos" w:hAnsi="Aptos"/>
-          <w:b/>
-          <w:bCs/>
-          <w:color w:val="25323B"/>
-          <w:sz w:val="20"/>
-          <w:szCs w:val="20"/>
-        </w:rPr>
-        <w:t xml:space="preserve">*Eyebrow:*</w:t>
-      </w:r>
-      <w:r>
-        <w:rPr>
-          <w:rFonts w:ascii="Aptos" w:cs="Aptos" w:eastAsia="Aptos" w:hAnsi="Aptos"/>
-          <w:b w:val="false"/>
-          <w:bCs w:val="false"/>
-          <w:color w:val="25323B"/>
-          <w:sz w:val="20"/>
-          <w:szCs w:val="20"/>
-        </w:rPr>
-        <w:t xml:space="preserve"> </w:t>
-      </w:r>
-      <w:r>
-        <w:rPr>
-          <w:rFonts w:ascii="Aptos Mono" w:cs="Aptos Mono" w:eastAsia="Aptos Mono" w:hAnsi="Aptos Mono"/>
-          <w:b w:val="false"/>
-          <w:bCs w:val="false"/>
-          <w:color w:val="1E5E85"/>
-          <w:sz w:val="18"/>
-          <w:szCs w:val="18"/>
-        </w:rPr>
-        <w:t xml:space="preserve">The Artimex collection</w:t>
-      </w:r>
-    </w:p>
-    <w:p>
-      <w:pPr>
-        <w:spacing w:before="0" w:after="110" w:line="260"/>
-      </w:pPr>
-      <w:r>
-        <w:rPr>
-          <w:rFonts w:ascii="Aptos" w:cs="Aptos" w:eastAsia="Aptos" w:hAnsi="Aptos"/>
-          <w:b/>
-          <w:bCs/>
-          <w:color w:val="25323B"/>
-          <w:sz w:val="20"/>
-          <w:szCs w:val="20"/>
-        </w:rPr>
-        <w:t xml:space="preserve">*Title:*</w:t>
-      </w:r>
-      <w:r>
-        <w:rPr>
-          <w:rFonts w:ascii="Aptos" w:cs="Aptos" w:eastAsia="Aptos" w:hAnsi="Aptos"/>
-          <w:b w:val="false"/>
-          <w:bCs w:val="false"/>
-          <w:color w:val="25323B"/>
-          <w:sz w:val="20"/>
-          <w:szCs w:val="20"/>
-        </w:rPr>
-        <w:t xml:space="preserve"> </w:t>
-      </w:r>
-      <w:r>
-        <w:rPr>
-          <w:rFonts w:ascii="Aptos Mono" w:cs="Aptos Mono" w:eastAsia="Aptos Mono" w:hAnsi="Aptos Mono"/>
-          <w:b w:val="false"/>
-          <w:bCs w:val="false"/>
-          <w:color w:val="1E5E85"/>
-          <w:sz w:val="18"/>
-          <w:szCs w:val="18"/>
-        </w:rPr>
-        <w:t xml:space="preserve">Find your favorite.</w:t>
-      </w:r>
-    </w:p>
-    <w:p>
-      <w:pPr>
-        <w:spacing w:before="0" w:after="110" w:line="260"/>
-      </w:pPr>
-      <w:r>
-        <w:rPr>
-          <w:rFonts w:ascii="Aptos" w:cs="Aptos" w:eastAsia="Aptos" w:hAnsi="Aptos"/>
-          <w:b/>
-          <w:bCs/>
-          <w:color w:val="25323B"/>
-          <w:sz w:val="20"/>
-          <w:szCs w:val="20"/>
-        </w:rPr>
-        <w:t xml:space="preserve">*Filter label:*</w:t>
-      </w:r>
-      <w:r>
-        <w:rPr>
-          <w:rFonts w:ascii="Aptos" w:cs="Aptos" w:eastAsia="Aptos" w:hAnsi="Aptos"/>
-          <w:b w:val="false"/>
-          <w:bCs w:val="false"/>
-          <w:color w:val="25323B"/>
-          <w:sz w:val="20"/>
-          <w:szCs w:val="20"/>
-        </w:rPr>
-        <w:t xml:space="preserve"> </w:t>
-      </w:r>
-      <w:r>
-        <w:rPr>
-          <w:rFonts w:ascii="Aptos Mono" w:cs="Aptos Mono" w:eastAsia="Aptos Mono" w:hAnsi="Aptos Mono"/>
-          <w:b w:val="false"/>
-          <w:bCs w:val="false"/>
-          <w:color w:val="1E5E85"/>
-          <w:sz w:val="18"/>
-          <w:szCs w:val="18"/>
-        </w:rPr>
-        <w:t xml:space="preserve">Product filters</w:t>
-      </w:r>
-    </w:p>
-    <w:p>
-      <w:pPr>
-        <w:spacing w:before="0" w:after="110" w:line="260"/>
-      </w:pPr>
-      <w:r>
-        <w:rPr>
-          <w:rFonts w:ascii="Aptos" w:cs="Aptos" w:eastAsia="Aptos" w:hAnsi="Aptos"/>
-          <w:b/>
-          <w:bCs/>
-          <w:color w:val="25323B"/>
-          <w:sz w:val="20"/>
-          <w:szCs w:val="20"/>
-        </w:rPr>
-        <w:t xml:space="preserve">*Filter options:*</w:t>
-      </w:r>
-      <w:r>
-        <w:rPr>
-          <w:rFonts w:ascii="Aptos" w:cs="Aptos" w:eastAsia="Aptos" w:hAnsi="Aptos"/>
-          <w:b w:val="false"/>
-          <w:bCs w:val="false"/>
-          <w:color w:val="25323B"/>
-          <w:sz w:val="20"/>
-          <w:szCs w:val="20"/>
-        </w:rPr>
-        <w:t xml:space="preserve"> </w:t>
-      </w:r>
-      <w:r>
-        <w:rPr>
-          <w:rFonts w:ascii="Aptos Mono" w:cs="Aptos Mono" w:eastAsia="Aptos Mono" w:hAnsi="Aptos Mono"/>
-          <w:b w:val="false"/>
-          <w:bCs w:val="false"/>
-          <w:color w:val="1E5E85"/>
-          <w:sz w:val="18"/>
-          <w:szCs w:val="18"/>
-        </w:rPr>
-        <w:t xml:space="preserve">All</w:t>
-      </w:r>
-      <w:r>
-        <w:rPr>
-          <w:rFonts w:ascii="Aptos" w:cs="Aptos" w:eastAsia="Aptos" w:hAnsi="Aptos"/>
-          <w:b w:val="false"/>
-          <w:bCs w:val="false"/>
-          <w:color w:val="25323B"/>
-          <w:sz w:val="20"/>
-          <w:szCs w:val="20"/>
-        </w:rPr>
-        <w:t xml:space="preserve"> · </w:t>
-      </w:r>
-      <w:r>
-        <w:rPr>
-          <w:rFonts w:ascii="Aptos Mono" w:cs="Aptos Mono" w:eastAsia="Aptos Mono" w:hAnsi="Aptos Mono"/>
-          <w:b w:val="false"/>
-          <w:bCs w:val="false"/>
-          <w:color w:val="1E5E85"/>
-          <w:sz w:val="18"/>
-          <w:szCs w:val="18"/>
-        </w:rPr>
-        <w:t xml:space="preserve">Conchas</w:t>
-      </w:r>
-      <w:r>
-        <w:rPr>
-          <w:rFonts w:ascii="Aptos" w:cs="Aptos" w:eastAsia="Aptos" w:hAnsi="Aptos"/>
-          <w:b w:val="false"/>
-          <w:bCs w:val="false"/>
-          <w:color w:val="25323B"/>
-          <w:sz w:val="20"/>
-          <w:szCs w:val="20"/>
-        </w:rPr>
-        <w:t xml:space="preserve"> · </w:t>
-      </w:r>
-      <w:r>
-        <w:rPr>
-          <w:rFonts w:ascii="Aptos Mono" w:cs="Aptos Mono" w:eastAsia="Aptos Mono" w:hAnsi="Aptos Mono"/>
-          <w:b w:val="false"/>
-          <w:bCs w:val="false"/>
-          <w:color w:val="1E5E85"/>
-          <w:sz w:val="18"/>
-          <w:szCs w:val="18"/>
-        </w:rPr>
-        <w:t xml:space="preserve">Savory</w:t>
-      </w:r>
-      <w:r>
-        <w:rPr>
-          <w:rFonts w:ascii="Aptos" w:cs="Aptos" w:eastAsia="Aptos" w:hAnsi="Aptos"/>
-          <w:b w:val="false"/>
-          <w:bCs w:val="false"/>
-          <w:color w:val="25323B"/>
-          <w:sz w:val="20"/>
-          <w:szCs w:val="20"/>
-        </w:rPr>
-        <w:t xml:space="preserve"> · </w:t>
-      </w:r>
-      <w:r>
-        <w:rPr>
-          <w:rFonts w:ascii="Aptos Mono" w:cs="Aptos Mono" w:eastAsia="Aptos Mono" w:hAnsi="Aptos Mono"/>
-          <w:b w:val="false"/>
-          <w:bCs w:val="false"/>
-          <w:color w:val="1E5E85"/>
-          <w:sz w:val="18"/>
-          <w:szCs w:val="18"/>
-        </w:rPr>
-        <w:t xml:space="preserve">Pastries</w:t>
-      </w:r>
-    </w:p>
-    <w:p>
-      <w:pPr>
-        <w:spacing w:before="0" w:after="110" w:line="260"/>
-      </w:pPr>
-      <w:r>
-        <w:rPr>
-          <w:rFonts w:ascii="Aptos" w:cs="Aptos" w:eastAsia="Aptos" w:hAnsi="Aptos"/>
-          <w:b/>
-          <w:bCs/>
-          <w:color w:val="25323B"/>
-          <w:sz w:val="20"/>
-          <w:szCs w:val="20"/>
-        </w:rPr>
-        <w:t xml:space="preserve">*Button on each product:*</w:t>
-      </w:r>
-      <w:r>
-        <w:rPr>
-          <w:rFonts w:ascii="Aptos" w:cs="Aptos" w:eastAsia="Aptos" w:hAnsi="Aptos"/>
-          <w:b w:val="false"/>
-          <w:bCs w:val="false"/>
-          <w:color w:val="25323B"/>
-          <w:sz w:val="20"/>
-          <w:szCs w:val="20"/>
-        </w:rPr>
-        <w:t xml:space="preserve"> </w:t>
-      </w:r>
-      <w:r>
-        <w:rPr>
-          <w:rFonts w:ascii="Aptos Mono" w:cs="Aptos Mono" w:eastAsia="Aptos Mono" w:hAnsi="Aptos Mono"/>
-          <w:b w:val="false"/>
-          <w:bCs w:val="false"/>
-          <w:color w:val="1E5E85"/>
-          <w:sz w:val="18"/>
-          <w:szCs w:val="18"/>
-        </w:rPr>
-        <w:t xml:space="preserve">Add to basket</w:t>
-      </w:r>
-    </w:p>
-    <w:p>
-      <w:pPr>
-        <w:pStyle w:val="Heading2"/>
-        <w:keepNext/>
-        <w:spacing w:before="180" w:after="90"/>
-      </w:pPr>
-      <w:r>
-        <w:rPr>
-          <w:rFonts w:ascii="Aptos" w:cs="Aptos" w:eastAsia="Aptos" w:hAnsi="Aptos"/>
-          <w:b w:val="false"/>
-          <w:bCs w:val="false"/>
-          <w:color w:val="1E5E85"/>
-          <w:sz w:val="22"/>
-          <w:szCs w:val="22"/>
+          <w:sz w:val="21"/>
+          <w:szCs w:val="21"/>
         </w:rPr>
         <w:t xml:space="preserve">Fresh products</w:t>
       </w:r>
@@ -3292,7 +3274,7 @@
           <w:sz w:val="28"/>
           <w:szCs w:val="28"/>
         </w:rPr>
-        <w:t xml:space="preserve">7. Frozen wholesale / B2B programme</w:t>
+        <w:t xml:space="preserve">Artimex bake-off program</w:t>
       </w:r>
     </w:p>
     <w:p>
@@ -3579,8 +3561,8 @@
           <w:b w:val="false"/>
           <w:bCs w:val="false"/>
           <w:color w:val="1E5E85"/>
-          <w:sz w:val="22"/>
-          <w:szCs w:val="22"/>
+          <w:sz w:val="21"/>
+          <w:szCs w:val="21"/>
         </w:rPr>
         <w:t xml:space="preserve">Wholesale products</w:t>
       </w:r>
@@ -4732,7 +4714,7 @@
           <w:sz w:val="28"/>
           <w:szCs w:val="28"/>
         </w:rPr>
-        <w:t xml:space="preserve">8. The Artimex standard</w:t>
+        <w:t xml:space="preserve">The Artimex standard</w:t>
       </w:r>
     </w:p>
     <w:p>
@@ -5140,7 +5122,7 @@
           <w:sz w:val="28"/>
           <w:szCs w:val="28"/>
         </w:rPr>
-        <w:t xml:space="preserve">9. Artimex heritage</w:t>
+        <w:t xml:space="preserve">From the original Artimex archive</w:t>
       </w:r>
     </w:p>
     <w:p>
@@ -5412,7 +5394,7 @@
           <w:sz w:val="28"/>
           <w:szCs w:val="28"/>
         </w:rPr>
-        <w:t xml:space="preserve">10. Artimex for business</w:t>
+        <w:t xml:space="preserve">Artimex for business</w:t>
       </w:r>
     </w:p>
     <w:p>
@@ -5986,7 +5968,7 @@
           <w:sz w:val="28"/>
           <w:szCs w:val="28"/>
         </w:rPr>
-        <w:t xml:space="preserve">11. From freezer to bakery case</w:t>
+        <w:t xml:space="preserve">From freezer to bakery case</w:t>
       </w:r>
     </w:p>
     <w:p>
@@ -6314,7 +6296,7 @@
           <w:sz w:val="28"/>
           <w:szCs w:val="28"/>
         </w:rPr>
-        <w:t xml:space="preserve">12. Careers</w:t>
+        <w:t xml:space="preserve">Opportunities at Artimex</w:t>
       </w:r>
     </w:p>
     <w:p>
@@ -6640,7 +6622,7 @@
           <w:sz w:val="28"/>
           <w:szCs w:val="28"/>
         </w:rPr>
-        <w:t xml:space="preserve">13. Contact and footer</w:t>
+        <w:t xml:space="preserve">Fresh bakery • Wholesale • Foodservice</w:t>
       </w:r>
     </w:p>
     <w:p>
@@ -7329,7 +7311,7 @@
           <w:sz w:val="28"/>
           <w:szCs w:val="28"/>
         </w:rPr>
-        <w:t xml:space="preserve">1. Anuncio y navegación</w:t>
+        <w:t xml:space="preserve">Barra de anuncio y encabezado</w:t>
       </w:r>
     </w:p>
     <w:p>
@@ -7839,7 +7821,7 @@
           <w:sz w:val="28"/>
           <w:szCs w:val="28"/>
         </w:rPr>
-        <w:t xml:space="preserve">2. Hero</w:t>
+        <w:t xml:space="preserve">Autenticidad • Tradición • Ingredientes superiores</w:t>
       </w:r>
     </w:p>
     <w:p>
@@ -8379,7 +8361,7 @@
           <w:sz w:val="28"/>
           <w:szCs w:val="28"/>
         </w:rPr>
-        <w:t xml:space="preserve">3. Marquee de categorías</w:t>
+        <w:t xml:space="preserve">Categorías de productos</w:t>
       </w:r>
     </w:p>
     <w:p>
@@ -8621,7 +8603,867 @@
           <w:sz w:val="28"/>
           <w:szCs w:val="28"/>
         </w:rPr>
-        <w:t xml:space="preserve">4. Recorridos de clientes</w:t>
+        <w:t xml:space="preserve">Fresco desde nuestros hornos</w:t>
+      </w:r>
+    </w:p>
+    <w:p>
+      <w:pPr>
+        <w:spacing w:before="0" w:after="110" w:line="260"/>
+      </w:pPr>
+      <w:r>
+        <w:rPr>
+          <w:rFonts w:ascii="Aptos" w:cs="Aptos" w:eastAsia="Aptos" w:hAnsi="Aptos"/>
+          <w:b/>
+          <w:bCs/>
+          <w:color w:val="25323B"/>
+          <w:sz w:val="20"/>
+          <w:szCs w:val="20"/>
+        </w:rPr>
+        <w:t xml:space="preserve">*Etiqueta de audiencia:*</w:t>
+      </w:r>
+      <w:r>
+        <w:rPr>
+          <w:rFonts w:ascii="Aptos" w:cs="Aptos" w:eastAsia="Aptos" w:hAnsi="Aptos"/>
+          <w:b w:val="false"/>
+          <w:bCs w:val="false"/>
+          <w:color w:val="25323B"/>
+          <w:sz w:val="20"/>
+          <w:szCs w:val="20"/>
+        </w:rPr>
+        <w:t xml:space="preserve"> </w:t>
+      </w:r>
+      <w:r>
+        <w:rPr>
+          <w:rFonts w:ascii="Aptos Mono" w:cs="Aptos Mono" w:eastAsia="Aptos Mono" w:hAnsi="Aptos Mono"/>
+          <w:b w:val="false"/>
+          <w:bCs w:val="false"/>
+          <w:color w:val="1E5E85"/>
+          <w:sz w:val="18"/>
+          <w:szCs w:val="18"/>
+        </w:rPr>
+        <w:t xml:space="preserve">Para casa y familia</w:t>
+      </w:r>
+    </w:p>
+    <w:p>
+      <w:pPr>
+        <w:spacing w:before="0" w:after="110" w:line="260"/>
+      </w:pPr>
+      <w:r>
+        <w:rPr>
+          <w:rFonts w:ascii="Aptos" w:cs="Aptos" w:eastAsia="Aptos" w:hAnsi="Aptos"/>
+          <w:b/>
+          <w:bCs/>
+          <w:color w:val="25323B"/>
+          <w:sz w:val="20"/>
+          <w:szCs w:val="20"/>
+        </w:rPr>
+        <w:t xml:space="preserve">*Titular:*</w:t>
+      </w:r>
+    </w:p>
+    <w:p>
+      <w:pPr>
+        <w:spacing w:before="0" w:after="110" w:line="260"/>
+      </w:pPr>
+      <w:r>
+        <w:rPr>
+          <w:rFonts w:ascii="Aptos Mono" w:cs="Aptos Mono" w:eastAsia="Aptos Mono" w:hAnsi="Aptos Mono"/>
+          <w:b w:val="false"/>
+          <w:bCs w:val="false"/>
+          <w:color w:val="1E5E85"/>
+          <w:sz w:val="18"/>
+          <w:szCs w:val="18"/>
+        </w:rPr>
+        <w:t xml:space="preserve">Fresco desde</w:t>
+      </w:r>
+    </w:p>
+    <w:p>
+      <w:pPr>
+        <w:spacing w:before="0" w:after="110" w:line="260"/>
+      </w:pPr>
+      <w:r>
+        <w:rPr>
+          <w:rFonts w:ascii="Aptos Mono" w:cs="Aptos Mono" w:eastAsia="Aptos Mono" w:hAnsi="Aptos Mono"/>
+          <w:b w:val="false"/>
+          <w:bCs w:val="false"/>
+          <w:color w:val="1E5E85"/>
+          <w:sz w:val="18"/>
+          <w:szCs w:val="18"/>
+        </w:rPr>
+        <w:t xml:space="preserve">nuestros hornos.</w:t>
+      </w:r>
+    </w:p>
+    <w:p>
+      <w:pPr>
+        <w:spacing w:before="0" w:after="110" w:line="260"/>
+      </w:pPr>
+      <w:r>
+        <w:rPr>
+          <w:rFonts w:ascii="Aptos" w:cs="Aptos" w:eastAsia="Aptos" w:hAnsi="Aptos"/>
+          <w:b/>
+          <w:bCs/>
+          <w:color w:val="25323B"/>
+          <w:sz w:val="20"/>
+          <w:szCs w:val="20"/>
+        </w:rPr>
+        <w:t xml:space="preserve">*Texto:*</w:t>
+      </w:r>
+      <w:r>
+        <w:rPr>
+          <w:rFonts w:ascii="Aptos" w:cs="Aptos" w:eastAsia="Aptos" w:hAnsi="Aptos"/>
+          <w:b w:val="false"/>
+          <w:bCs w:val="false"/>
+          <w:color w:val="25323B"/>
+          <w:sz w:val="20"/>
+          <w:szCs w:val="20"/>
+        </w:rPr>
+        <w:t xml:space="preserve"> </w:t>
+      </w:r>
+      <w:r>
+        <w:rPr>
+          <w:rFonts w:ascii="Aptos Mono" w:cs="Aptos Mono" w:eastAsia="Aptos Mono" w:hAnsi="Aptos Mono"/>
+          <w:b w:val="false"/>
+          <w:bCs w:val="false"/>
+          <w:color w:val="1E5E85"/>
+          <w:sz w:val="18"/>
+          <w:szCs w:val="18"/>
+        </w:rPr>
+        <w:t xml:space="preserve">Arma tu caja con los panes mexicanos que ama tu familia, horneados localmente con ingredientes superiores.</w:t>
+      </w:r>
+    </w:p>
+    <w:p>
+      <w:pPr>
+        <w:spacing w:before="0" w:after="110" w:line="260"/>
+      </w:pPr>
+      <w:r>
+        <w:rPr>
+          <w:rFonts w:ascii="Aptos" w:cs="Aptos" w:eastAsia="Aptos" w:hAnsi="Aptos"/>
+          <w:b/>
+          <w:bCs/>
+          <w:color w:val="25323B"/>
+          <w:sz w:val="20"/>
+          <w:szCs w:val="20"/>
+        </w:rPr>
+        <w:t xml:space="preserve">*Botón:*</w:t>
+      </w:r>
+      <w:r>
+        <w:rPr>
+          <w:rFonts w:ascii="Aptos" w:cs="Aptos" w:eastAsia="Aptos" w:hAnsi="Aptos"/>
+          <w:b w:val="false"/>
+          <w:bCs w:val="false"/>
+          <w:color w:val="25323B"/>
+          <w:sz w:val="20"/>
+          <w:szCs w:val="20"/>
+        </w:rPr>
+        <w:t xml:space="preserve"> </w:t>
+      </w:r>
+      <w:r>
+        <w:rPr>
+          <w:rFonts w:ascii="Aptos Mono" w:cs="Aptos Mono" w:eastAsia="Aptos Mono" w:hAnsi="Aptos Mono"/>
+          <w:b w:val="false"/>
+          <w:bCs w:val="false"/>
+          <w:color w:val="1E5E85"/>
+          <w:sz w:val="18"/>
+          <w:szCs w:val="18"/>
+        </w:rPr>
+        <w:t xml:space="preserve">Comprar fresco</w:t>
+      </w:r>
+    </w:p>
+    <w:p>
+      <w:pPr>
+        <w:pStyle w:val="Heading1"/>
+        <w:keepNext/>
+        <w:spacing w:before="260" w:after="90"/>
+      </w:pPr>
+      <w:r>
+        <w:rPr>
+          <w:rFonts w:ascii="Aptos" w:cs="Aptos" w:eastAsia="Aptos" w:hAnsi="Aptos"/>
+          <w:b w:val="false"/>
+          <w:bCs w:val="false"/>
+          <w:color w:val="1E5E85"/>
+          <w:sz w:val="28"/>
+          <w:szCs w:val="28"/>
+        </w:rPr>
+        <w:t xml:space="preserve">Tu panadería, más simple</w:t>
+      </w:r>
+    </w:p>
+    <w:p>
+      <w:pPr>
+        <w:spacing w:before="0" w:after="110" w:line="260"/>
+      </w:pPr>
+      <w:r>
+        <w:rPr>
+          <w:rFonts w:ascii="Aptos" w:cs="Aptos" w:eastAsia="Aptos" w:hAnsi="Aptos"/>
+          <w:b/>
+          <w:bCs/>
+          <w:color w:val="25323B"/>
+          <w:sz w:val="20"/>
+          <w:szCs w:val="20"/>
+        </w:rPr>
+        <w:t xml:space="preserve">*Etiqueta de audiencia:*</w:t>
+      </w:r>
+      <w:r>
+        <w:rPr>
+          <w:rFonts w:ascii="Aptos" w:cs="Aptos" w:eastAsia="Aptos" w:hAnsi="Aptos"/>
+          <w:b w:val="false"/>
+          <w:bCs w:val="false"/>
+          <w:color w:val="25323B"/>
+          <w:sz w:val="20"/>
+          <w:szCs w:val="20"/>
+        </w:rPr>
+        <w:t xml:space="preserve"> </w:t>
+      </w:r>
+      <w:r>
+        <w:rPr>
+          <w:rFonts w:ascii="Aptos Mono" w:cs="Aptos Mono" w:eastAsia="Aptos Mono" w:hAnsi="Aptos Mono"/>
+          <w:b w:val="false"/>
+          <w:bCs w:val="false"/>
+          <w:color w:val="1E5E85"/>
+          <w:sz w:val="18"/>
+          <w:szCs w:val="18"/>
+        </w:rPr>
+        <w:t xml:space="preserve">Para retail y foodservice</w:t>
+      </w:r>
+    </w:p>
+    <w:p>
+      <w:pPr>
+        <w:spacing w:before="0" w:after="110" w:line="260"/>
+      </w:pPr>
+      <w:r>
+        <w:rPr>
+          <w:rFonts w:ascii="Aptos" w:cs="Aptos" w:eastAsia="Aptos" w:hAnsi="Aptos"/>
+          <w:b/>
+          <w:bCs/>
+          <w:color w:val="25323B"/>
+          <w:sz w:val="20"/>
+          <w:szCs w:val="20"/>
+        </w:rPr>
+        <w:t xml:space="preserve">*Titular:*</w:t>
+      </w:r>
+    </w:p>
+    <w:p>
+      <w:pPr>
+        <w:spacing w:before="0" w:after="110" w:line="260"/>
+      </w:pPr>
+      <w:r>
+        <w:rPr>
+          <w:rFonts w:ascii="Aptos Mono" w:cs="Aptos Mono" w:eastAsia="Aptos Mono" w:hAnsi="Aptos Mono"/>
+          <w:b w:val="false"/>
+          <w:bCs w:val="false"/>
+          <w:color w:val="1E5E85"/>
+          <w:sz w:val="18"/>
+          <w:szCs w:val="18"/>
+        </w:rPr>
+        <w:t xml:space="preserve">Tu panadería,</w:t>
+      </w:r>
+    </w:p>
+    <w:p>
+      <w:pPr>
+        <w:spacing w:before="0" w:after="110" w:line="260"/>
+      </w:pPr>
+      <w:r>
+        <w:rPr>
+          <w:rFonts w:ascii="Aptos Mono" w:cs="Aptos Mono" w:eastAsia="Aptos Mono" w:hAnsi="Aptos Mono"/>
+          <w:b w:val="false"/>
+          <w:bCs w:val="false"/>
+          <w:color w:val="1E5E85"/>
+          <w:sz w:val="18"/>
+          <w:szCs w:val="18"/>
+        </w:rPr>
+        <w:t xml:space="preserve">más simple.</w:t>
+      </w:r>
+    </w:p>
+    <w:p>
+      <w:pPr>
+        <w:spacing w:before="0" w:after="110" w:line="260"/>
+      </w:pPr>
+      <w:r>
+        <w:rPr>
+          <w:rFonts w:ascii="Aptos" w:cs="Aptos" w:eastAsia="Aptos" w:hAnsi="Aptos"/>
+          <w:b/>
+          <w:bCs/>
+          <w:color w:val="25323B"/>
+          <w:sz w:val="20"/>
+          <w:szCs w:val="20"/>
+        </w:rPr>
+        <w:t xml:space="preserve">*Texto:*</w:t>
+      </w:r>
+      <w:r>
+        <w:rPr>
+          <w:rFonts w:ascii="Aptos" w:cs="Aptos" w:eastAsia="Aptos" w:hAnsi="Aptos"/>
+          <w:b w:val="false"/>
+          <w:bCs w:val="false"/>
+          <w:color w:val="25323B"/>
+          <w:sz w:val="20"/>
+          <w:szCs w:val="20"/>
+        </w:rPr>
+        <w:t xml:space="preserve"> </w:t>
+      </w:r>
+      <w:r>
+        <w:rPr>
+          <w:rFonts w:ascii="Aptos Mono" w:cs="Aptos Mono" w:eastAsia="Aptos Mono" w:hAnsi="Aptos Mono"/>
+          <w:b w:val="false"/>
+          <w:bCs w:val="false"/>
+          <w:color w:val="1E5E85"/>
+          <w:sz w:val="18"/>
+          <w:szCs w:val="18"/>
+        </w:rPr>
+        <w:t xml:space="preserve">Masa congelada y productos terminados con calidad constante, menor merma y menos mano de obra.</w:t>
+      </w:r>
+    </w:p>
+    <w:p>
+      <w:pPr>
+        <w:spacing w:before="0" w:after="110" w:line="260"/>
+      </w:pPr>
+      <w:r>
+        <w:rPr>
+          <w:rFonts w:ascii="Aptos" w:cs="Aptos" w:eastAsia="Aptos" w:hAnsi="Aptos"/>
+          <w:b/>
+          <w:bCs/>
+          <w:color w:val="25323B"/>
+          <w:sz w:val="20"/>
+          <w:szCs w:val="20"/>
+        </w:rPr>
+        <w:t xml:space="preserve">*Botón:*</w:t>
+      </w:r>
+      <w:r>
+        <w:rPr>
+          <w:rFonts w:ascii="Aptos" w:cs="Aptos" w:eastAsia="Aptos" w:hAnsi="Aptos"/>
+          <w:b w:val="false"/>
+          <w:bCs w:val="false"/>
+          <w:color w:val="25323B"/>
+          <w:sz w:val="20"/>
+          <w:szCs w:val="20"/>
+        </w:rPr>
+        <w:t xml:space="preserve"> </w:t>
+      </w:r>
+      <w:r>
+        <w:rPr>
+          <w:rFonts w:ascii="Aptos Mono" w:cs="Aptos Mono" w:eastAsia="Aptos Mono" w:hAnsi="Aptos Mono"/>
+          <w:b w:val="false"/>
+          <w:bCs w:val="false"/>
+          <w:color w:val="1E5E85"/>
+          <w:sz w:val="18"/>
+          <w:szCs w:val="18"/>
+        </w:rPr>
+        <w:t xml:space="preserve">Ver mayoreo</w:t>
+      </w:r>
+    </w:p>
+    <w:p>
+      <w:pPr>
+        <w:spacing w:before="0" w:after="110" w:line="260"/>
+      </w:pPr>
+      <w:r>
+        <w:rPr>
+          <w:rFonts w:ascii="Aptos" w:cs="Aptos" w:eastAsia="Aptos" w:hAnsi="Aptos"/>
+          <w:b w:val="false"/>
+          <w:bCs w:val="false"/>
+          <w:color w:val="25323B"/>
+          <w:sz w:val="20"/>
+          <w:szCs w:val="20"/>
+        </w:rPr>
+        <w:t xml:space="preserve">Validación: [ ] Aprobado tal como está  [ ] Solicita cambios</w:t>
+      </w:r>
+    </w:p>
+    <w:p>
+      <w:pPr>
+        <w:spacing w:before="0" w:after="110" w:line="260"/>
+      </w:pPr>
+      <w:r>
+        <w:rPr>
+          <w:rFonts w:ascii="Aptos" w:cs="Aptos" w:eastAsia="Aptos" w:hAnsi="Aptos"/>
+          <w:b w:val="false"/>
+          <w:bCs w:val="false"/>
+          <w:color w:val="25323B"/>
+          <w:sz w:val="20"/>
+          <w:szCs w:val="20"/>
+        </w:rPr>
+        <w:t xml:space="preserve">Notas: ______________________________________________________________________</w:t>
+      </w:r>
+    </w:p>
+    <w:p>
+      <w:pPr>
+        <w:pStyle w:val="Heading1"/>
+        <w:keepNext/>
+        <w:spacing w:before="260" w:after="90"/>
+      </w:pPr>
+      <w:r>
+        <w:rPr>
+          <w:rFonts w:ascii="Aptos" w:cs="Aptos" w:eastAsia="Aptos" w:hAnsi="Aptos"/>
+          <w:b w:val="false"/>
+          <w:bCs w:val="false"/>
+          <w:color w:val="1E5E85"/>
+          <w:sz w:val="28"/>
+          <w:szCs w:val="28"/>
+        </w:rPr>
+        <w:t xml:space="preserve">Dos formas de disfrutar Artimex</w:t>
+      </w:r>
+    </w:p>
+    <w:p>
+      <w:pPr>
+        <w:spacing w:before="0" w:after="110" w:line="260"/>
+      </w:pPr>
+      <w:r>
+        <w:rPr>
+          <w:rFonts w:ascii="Aptos" w:cs="Aptos" w:eastAsia="Aptos" w:hAnsi="Aptos"/>
+          <w:b/>
+          <w:bCs/>
+          <w:color w:val="25323B"/>
+          <w:sz w:val="20"/>
+          <w:szCs w:val="20"/>
+        </w:rPr>
+        <w:t xml:space="preserve">*Eyebrow:*</w:t>
+      </w:r>
+      <w:r>
+        <w:rPr>
+          <w:rFonts w:ascii="Aptos" w:cs="Aptos" w:eastAsia="Aptos" w:hAnsi="Aptos"/>
+          <w:b w:val="false"/>
+          <w:bCs w:val="false"/>
+          <w:color w:val="25323B"/>
+          <w:sz w:val="20"/>
+          <w:szCs w:val="20"/>
+        </w:rPr>
+        <w:t xml:space="preserve"> </w:t>
+      </w:r>
+      <w:r>
+        <w:rPr>
+          <w:rFonts w:ascii="Aptos Mono" w:cs="Aptos Mono" w:eastAsia="Aptos Mono" w:hAnsi="Aptos Mono"/>
+          <w:b w:val="false"/>
+          <w:bCs w:val="false"/>
+          <w:color w:val="1E5E85"/>
+          <w:sz w:val="18"/>
+          <w:szCs w:val="18"/>
+        </w:rPr>
+        <w:t xml:space="preserve">Dos formas de disfrutar Artimex</w:t>
+      </w:r>
+    </w:p>
+    <w:p>
+      <w:pPr>
+        <w:spacing w:before="0" w:after="110" w:line="260"/>
+      </w:pPr>
+      <w:r>
+        <w:rPr>
+          <w:rFonts w:ascii="Aptos" w:cs="Aptos" w:eastAsia="Aptos" w:hAnsi="Aptos"/>
+          <w:b/>
+          <w:bCs/>
+          <w:color w:val="25323B"/>
+          <w:sz w:val="20"/>
+          <w:szCs w:val="20"/>
+        </w:rPr>
+        <w:t xml:space="preserve">*Titular:*</w:t>
+      </w:r>
+    </w:p>
+    <w:p>
+      <w:pPr>
+        <w:spacing w:before="0" w:after="110" w:line="260"/>
+      </w:pPr>
+      <w:r>
+        <w:rPr>
+          <w:rFonts w:ascii="Aptos Mono" w:cs="Aptos Mono" w:eastAsia="Aptos Mono" w:hAnsi="Aptos Mono"/>
+          <w:b w:val="false"/>
+          <w:bCs w:val="false"/>
+          <w:color w:val="1E5E85"/>
+          <w:sz w:val="18"/>
+          <w:szCs w:val="18"/>
+        </w:rPr>
+        <w:t xml:space="preserve">Fresco para la mesa.</w:t>
+      </w:r>
+    </w:p>
+    <w:p>
+      <w:pPr>
+        <w:spacing w:before="0" w:after="110" w:line="260"/>
+      </w:pPr>
+      <w:r>
+        <w:rPr>
+          <w:rFonts w:ascii="Aptos Mono" w:cs="Aptos Mono" w:eastAsia="Aptos Mono" w:hAnsi="Aptos Mono"/>
+          <w:b w:val="false"/>
+          <w:bCs w:val="false"/>
+          <w:color w:val="1E5E85"/>
+          <w:sz w:val="18"/>
+          <w:szCs w:val="18"/>
+        </w:rPr>
+        <w:t xml:space="preserve">Congelado para el negocio.</w:t>
+      </w:r>
+    </w:p>
+    <w:p>
+      <w:pPr>
+        <w:spacing w:before="0" w:after="110" w:line="260"/>
+      </w:pPr>
+      <w:r>
+        <w:rPr>
+          <w:rFonts w:ascii="Aptos" w:cs="Aptos" w:eastAsia="Aptos" w:hAnsi="Aptos"/>
+          <w:b/>
+          <w:bCs/>
+          <w:color w:val="25323B"/>
+          <w:sz w:val="20"/>
+          <w:szCs w:val="20"/>
+        </w:rPr>
+        <w:t xml:space="preserve">*Texto:*</w:t>
+      </w:r>
+      <w:r>
+        <w:rPr>
+          <w:rFonts w:ascii="Aptos" w:cs="Aptos" w:eastAsia="Aptos" w:hAnsi="Aptos"/>
+          <w:b w:val="false"/>
+          <w:bCs w:val="false"/>
+          <w:color w:val="25323B"/>
+          <w:sz w:val="20"/>
+          <w:szCs w:val="20"/>
+        </w:rPr>
+        <w:t xml:space="preserve"> </w:t>
+      </w:r>
+      <w:r>
+        <w:rPr>
+          <w:rFonts w:ascii="Aptos Mono" w:cs="Aptos Mono" w:eastAsia="Aptos Mono" w:hAnsi="Aptos Mono"/>
+          <w:b w:val="false"/>
+          <w:bCs w:val="false"/>
+          <w:color w:val="1E5E85"/>
+          <w:sz w:val="18"/>
+          <w:szCs w:val="18"/>
+        </w:rPr>
+        <w:t xml:space="preserve">Una misma filosofía de producto, dos experiencias. El consumidor elige pan recién preparado; restaurantes y mercados construyen pedidos profesionales listos para hornear.</w:t>
+      </w:r>
+    </w:p>
+    <w:p>
+      <w:pPr>
+        <w:spacing w:before="0" w:after="110" w:line="260"/>
+      </w:pPr>
+      <w:r>
+        <w:rPr>
+          <w:rFonts w:ascii="Aptos" w:cs="Aptos" w:eastAsia="Aptos" w:hAnsi="Aptos"/>
+          <w:b w:val="false"/>
+          <w:bCs w:val="false"/>
+          <w:color w:val="25323B"/>
+          <w:sz w:val="20"/>
+          <w:szCs w:val="20"/>
+        </w:rPr>
+        <w:t xml:space="preserve">Validación: [ ] Aprobado tal como está  [ ] Solicita cambios</w:t>
+      </w:r>
+    </w:p>
+    <w:p>
+      <w:pPr>
+        <w:spacing w:before="0" w:after="110" w:line="260"/>
+      </w:pPr>
+      <w:r>
+        <w:rPr>
+          <w:rFonts w:ascii="Aptos" w:cs="Aptos" w:eastAsia="Aptos" w:hAnsi="Aptos"/>
+          <w:b w:val="false"/>
+          <w:bCs w:val="false"/>
+          <w:color w:val="25323B"/>
+          <w:sz w:val="20"/>
+          <w:szCs w:val="20"/>
+        </w:rPr>
+        <w:t xml:space="preserve">Notas: ______________________________________________________________________</w:t>
+      </w:r>
+    </w:p>
+    <w:p>
+      <w:pPr>
+        <w:pStyle w:val="Heading1"/>
+        <w:keepNext/>
+        <w:spacing w:before="260" w:after="90"/>
+      </w:pPr>
+      <w:r>
+        <w:rPr>
+          <w:rFonts w:ascii="Aptos" w:cs="Aptos" w:eastAsia="Aptos" w:hAnsi="Aptos"/>
+          <w:b w:val="false"/>
+          <w:bCs w:val="false"/>
+          <w:color w:val="1E5E85"/>
+          <w:sz w:val="28"/>
+          <w:szCs w:val="28"/>
+        </w:rPr>
+        <w:t xml:space="preserve">La colección Artimex</w:t>
+      </w:r>
+    </w:p>
+    <w:p>
+      <w:pPr>
+        <w:spacing w:before="0" w:after="110" w:line="260"/>
+      </w:pPr>
+      <w:r>
+        <w:rPr>
+          <w:rFonts w:ascii="Aptos" w:cs="Aptos" w:eastAsia="Aptos" w:hAnsi="Aptos"/>
+          <w:b/>
+          <w:bCs/>
+          <w:color w:val="25323B"/>
+          <w:sz w:val="20"/>
+          <w:szCs w:val="20"/>
+        </w:rPr>
+        <w:t xml:space="preserve">*Etiqueta de pestaña:*</w:t>
+      </w:r>
+      <w:r>
+        <w:rPr>
+          <w:rFonts w:ascii="Aptos" w:cs="Aptos" w:eastAsia="Aptos" w:hAnsi="Aptos"/>
+          <w:b w:val="false"/>
+          <w:bCs w:val="false"/>
+          <w:color w:val="25323B"/>
+          <w:sz w:val="20"/>
+          <w:szCs w:val="20"/>
+        </w:rPr>
+        <w:t xml:space="preserve"> </w:t>
+      </w:r>
+      <w:r>
+        <w:rPr>
+          <w:rFonts w:ascii="Aptos Mono" w:cs="Aptos Mono" w:eastAsia="Aptos Mono" w:hAnsi="Aptos Mono"/>
+          <w:b w:val="false"/>
+          <w:bCs w:val="false"/>
+          <w:color w:val="1E5E85"/>
+          <w:sz w:val="18"/>
+          <w:szCs w:val="18"/>
+        </w:rPr>
+        <w:t xml:space="preserve">Pan fresco</w:t>
+      </w:r>
+    </w:p>
+    <w:p>
+      <w:pPr>
+        <w:spacing w:before="0" w:after="110" w:line="260"/>
+      </w:pPr>
+      <w:r>
+        <w:rPr>
+          <w:rFonts w:ascii="Aptos" w:cs="Aptos" w:eastAsia="Aptos" w:hAnsi="Aptos"/>
+          <w:b/>
+          <w:bCs/>
+          <w:color w:val="25323B"/>
+          <w:sz w:val="20"/>
+          <w:szCs w:val="20"/>
+        </w:rPr>
+        <w:t xml:space="preserve">*Eyebrow:*</w:t>
+      </w:r>
+      <w:r>
+        <w:rPr>
+          <w:rFonts w:ascii="Aptos" w:cs="Aptos" w:eastAsia="Aptos" w:hAnsi="Aptos"/>
+          <w:b w:val="false"/>
+          <w:bCs w:val="false"/>
+          <w:color w:val="25323B"/>
+          <w:sz w:val="20"/>
+          <w:szCs w:val="20"/>
+        </w:rPr>
+        <w:t xml:space="preserve"> </w:t>
+      </w:r>
+      <w:r>
+        <w:rPr>
+          <w:rFonts w:ascii="Aptos Mono" w:cs="Aptos Mono" w:eastAsia="Aptos Mono" w:hAnsi="Aptos Mono"/>
+          <w:b w:val="false"/>
+          <w:bCs w:val="false"/>
+          <w:color w:val="1E5E85"/>
+          <w:sz w:val="18"/>
+          <w:szCs w:val="18"/>
+        </w:rPr>
+        <w:t xml:space="preserve">La colección Artimex</w:t>
+      </w:r>
+    </w:p>
+    <w:p>
+      <w:pPr>
+        <w:spacing w:before="0" w:after="110" w:line="260"/>
+      </w:pPr>
+      <w:r>
+        <w:rPr>
+          <w:rFonts w:ascii="Aptos" w:cs="Aptos" w:eastAsia="Aptos" w:hAnsi="Aptos"/>
+          <w:b/>
+          <w:bCs/>
+          <w:color w:val="25323B"/>
+          <w:sz w:val="20"/>
+          <w:szCs w:val="20"/>
+        </w:rPr>
+        <w:t xml:space="preserve">*Título:*</w:t>
+      </w:r>
+      <w:r>
+        <w:rPr>
+          <w:rFonts w:ascii="Aptos" w:cs="Aptos" w:eastAsia="Aptos" w:hAnsi="Aptos"/>
+          <w:b w:val="false"/>
+          <w:bCs w:val="false"/>
+          <w:color w:val="25323B"/>
+          <w:sz w:val="20"/>
+          <w:szCs w:val="20"/>
+        </w:rPr>
+        <w:t xml:space="preserve"> </w:t>
+      </w:r>
+      <w:r>
+        <w:rPr>
+          <w:rFonts w:ascii="Aptos Mono" w:cs="Aptos Mono" w:eastAsia="Aptos Mono" w:hAnsi="Aptos Mono"/>
+          <w:b w:val="false"/>
+          <w:bCs w:val="false"/>
+          <w:color w:val="1E5E85"/>
+          <w:sz w:val="18"/>
+          <w:szCs w:val="18"/>
+        </w:rPr>
+        <w:t xml:space="preserve">Encuentra tu favorito.</w:t>
+      </w:r>
+    </w:p>
+    <w:p>
+      <w:pPr>
+        <w:spacing w:before="0" w:after="110" w:line="260"/>
+      </w:pPr>
+      <w:r>
+        <w:rPr>
+          <w:rFonts w:ascii="Aptos" w:cs="Aptos" w:eastAsia="Aptos" w:hAnsi="Aptos"/>
+          <w:b/>
+          <w:bCs/>
+          <w:color w:val="25323B"/>
+          <w:sz w:val="20"/>
+          <w:szCs w:val="20"/>
+        </w:rPr>
+        <w:t xml:space="preserve">*Etiqueta de filtros:*</w:t>
+      </w:r>
+      <w:r>
+        <w:rPr>
+          <w:rFonts w:ascii="Aptos" w:cs="Aptos" w:eastAsia="Aptos" w:hAnsi="Aptos"/>
+          <w:b w:val="false"/>
+          <w:bCs w:val="false"/>
+          <w:color w:val="25323B"/>
+          <w:sz w:val="20"/>
+          <w:szCs w:val="20"/>
+        </w:rPr>
+        <w:t xml:space="preserve"> </w:t>
+      </w:r>
+      <w:r>
+        <w:rPr>
+          <w:rFonts w:ascii="Aptos Mono" w:cs="Aptos Mono" w:eastAsia="Aptos Mono" w:hAnsi="Aptos Mono"/>
+          <w:b w:val="false"/>
+          <w:bCs w:val="false"/>
+          <w:color w:val="1E5E85"/>
+          <w:sz w:val="18"/>
+          <w:szCs w:val="18"/>
+        </w:rPr>
+        <w:t xml:space="preserve">Filtros de producto</w:t>
+      </w:r>
+    </w:p>
+    <w:p>
+      <w:pPr>
+        <w:spacing w:before="0" w:after="110" w:line="260"/>
+      </w:pPr>
+      <w:r>
+        <w:rPr>
+          <w:rFonts w:ascii="Aptos" w:cs="Aptos" w:eastAsia="Aptos" w:hAnsi="Aptos"/>
+          <w:b/>
+          <w:bCs/>
+          <w:color w:val="25323B"/>
+          <w:sz w:val="20"/>
+          <w:szCs w:val="20"/>
+        </w:rPr>
+        <w:t xml:space="preserve">*Opciones de filtro:*</w:t>
+      </w:r>
+      <w:r>
+        <w:rPr>
+          <w:rFonts w:ascii="Aptos" w:cs="Aptos" w:eastAsia="Aptos" w:hAnsi="Aptos"/>
+          <w:b w:val="false"/>
+          <w:bCs w:val="false"/>
+          <w:color w:val="25323B"/>
+          <w:sz w:val="20"/>
+          <w:szCs w:val="20"/>
+        </w:rPr>
+        <w:t xml:space="preserve"> </w:t>
+      </w:r>
+      <w:r>
+        <w:rPr>
+          <w:rFonts w:ascii="Aptos Mono" w:cs="Aptos Mono" w:eastAsia="Aptos Mono" w:hAnsi="Aptos Mono"/>
+          <w:b w:val="false"/>
+          <w:bCs w:val="false"/>
+          <w:color w:val="1E5E85"/>
+          <w:sz w:val="18"/>
+          <w:szCs w:val="18"/>
+        </w:rPr>
+        <w:t xml:space="preserve">Todos</w:t>
+      </w:r>
+      <w:r>
+        <w:rPr>
+          <w:rFonts w:ascii="Aptos" w:cs="Aptos" w:eastAsia="Aptos" w:hAnsi="Aptos"/>
+          <w:b w:val="false"/>
+          <w:bCs w:val="false"/>
+          <w:color w:val="25323B"/>
+          <w:sz w:val="20"/>
+          <w:szCs w:val="20"/>
+        </w:rPr>
+        <w:t xml:space="preserve"> · </w:t>
+      </w:r>
+      <w:r>
+        <w:rPr>
+          <w:rFonts w:ascii="Aptos Mono" w:cs="Aptos Mono" w:eastAsia="Aptos Mono" w:hAnsi="Aptos Mono"/>
+          <w:b w:val="false"/>
+          <w:bCs w:val="false"/>
+          <w:color w:val="1E5E85"/>
+          <w:sz w:val="18"/>
+          <w:szCs w:val="18"/>
+        </w:rPr>
+        <w:t xml:space="preserve">Conchas</w:t>
+      </w:r>
+      <w:r>
+        <w:rPr>
+          <w:rFonts w:ascii="Aptos" w:cs="Aptos" w:eastAsia="Aptos" w:hAnsi="Aptos"/>
+          <w:b w:val="false"/>
+          <w:bCs w:val="false"/>
+          <w:color w:val="25323B"/>
+          <w:sz w:val="20"/>
+          <w:szCs w:val="20"/>
+        </w:rPr>
+        <w:t xml:space="preserve"> · </w:t>
+      </w:r>
+      <w:r>
+        <w:rPr>
+          <w:rFonts w:ascii="Aptos Mono" w:cs="Aptos Mono" w:eastAsia="Aptos Mono" w:hAnsi="Aptos Mono"/>
+          <w:b w:val="false"/>
+          <w:bCs w:val="false"/>
+          <w:color w:val="1E5E85"/>
+          <w:sz w:val="18"/>
+          <w:szCs w:val="18"/>
+        </w:rPr>
+        <w:t xml:space="preserve">Savory</w:t>
+      </w:r>
+      <w:r>
+        <w:rPr>
+          <w:rFonts w:ascii="Aptos" w:cs="Aptos" w:eastAsia="Aptos" w:hAnsi="Aptos"/>
+          <w:b w:val="false"/>
+          <w:bCs w:val="false"/>
+          <w:color w:val="25323B"/>
+          <w:sz w:val="20"/>
+          <w:szCs w:val="20"/>
+        </w:rPr>
+        <w:t xml:space="preserve"> · </w:t>
+      </w:r>
+      <w:r>
+        <w:rPr>
+          <w:rFonts w:ascii="Aptos Mono" w:cs="Aptos Mono" w:eastAsia="Aptos Mono" w:hAnsi="Aptos Mono"/>
+          <w:b w:val="false"/>
+          <w:bCs w:val="false"/>
+          <w:color w:val="1E5E85"/>
+          <w:sz w:val="18"/>
+          <w:szCs w:val="18"/>
+        </w:rPr>
+        <w:t xml:space="preserve">Pastries</w:t>
+      </w:r>
+    </w:p>
+    <w:p>
+      <w:pPr>
+        <w:spacing w:before="0" w:after="110" w:line="260"/>
+      </w:pPr>
+      <w:r>
+        <w:rPr>
+          <w:rFonts w:ascii="Aptos" w:cs="Aptos" w:eastAsia="Aptos" w:hAnsi="Aptos"/>
+          <w:b/>
+          <w:bCs/>
+          <w:color w:val="25323B"/>
+          <w:sz w:val="20"/>
+          <w:szCs w:val="20"/>
+        </w:rPr>
+        <w:t xml:space="preserve">*Botón en cada producto:*</w:t>
+      </w:r>
+      <w:r>
+        <w:rPr>
+          <w:rFonts w:ascii="Aptos" w:cs="Aptos" w:eastAsia="Aptos" w:hAnsi="Aptos"/>
+          <w:b w:val="false"/>
+          <w:bCs w:val="false"/>
+          <w:color w:val="25323B"/>
+          <w:sz w:val="20"/>
+          <w:szCs w:val="20"/>
+        </w:rPr>
+        <w:t xml:space="preserve"> </w:t>
+      </w:r>
+      <w:r>
+        <w:rPr>
+          <w:rFonts w:ascii="Aptos Mono" w:cs="Aptos Mono" w:eastAsia="Aptos Mono" w:hAnsi="Aptos Mono"/>
+          <w:b w:val="false"/>
+          <w:bCs w:val="false"/>
+          <w:color w:val="1E5E85"/>
+          <w:sz w:val="18"/>
+          <w:szCs w:val="18"/>
+        </w:rPr>
+        <w:t xml:space="preserve">Agregar a la canasta</w:t>
       </w:r>
     </w:p>
     <w:p>
@@ -8636,886 +9478,8 @@
           <w:b w:val="false"/>
           <w:bCs w:val="false"/>
           <w:color w:val="1E5E85"/>
-          <w:sz w:val="22"/>
-          <w:szCs w:val="22"/>
-        </w:rPr>
-        <w:t xml:space="preserve">Fresco desde nuestros hornos</w:t>
-      </w:r>
-    </w:p>
-    <w:p>
-      <w:pPr>
-        <w:spacing w:before="0" w:after="110" w:line="260"/>
-      </w:pPr>
-      <w:r>
-        <w:rPr>
-          <w:rFonts w:ascii="Aptos" w:cs="Aptos" w:eastAsia="Aptos" w:hAnsi="Aptos"/>
-          <w:b/>
-          <w:bCs/>
-          <w:color w:val="25323B"/>
-          <w:sz w:val="20"/>
-          <w:szCs w:val="20"/>
-        </w:rPr>
-        <w:t xml:space="preserve">*Etiqueta de audiencia:*</w:t>
-      </w:r>
-      <w:r>
-        <w:rPr>
-          <w:rFonts w:ascii="Aptos" w:cs="Aptos" w:eastAsia="Aptos" w:hAnsi="Aptos"/>
-          <w:b w:val="false"/>
-          <w:bCs w:val="false"/>
-          <w:color w:val="25323B"/>
-          <w:sz w:val="20"/>
-          <w:szCs w:val="20"/>
-        </w:rPr>
-        <w:t xml:space="preserve"> </w:t>
-      </w:r>
-      <w:r>
-        <w:rPr>
-          <w:rFonts w:ascii="Aptos Mono" w:cs="Aptos Mono" w:eastAsia="Aptos Mono" w:hAnsi="Aptos Mono"/>
-          <w:b w:val="false"/>
-          <w:bCs w:val="false"/>
-          <w:color w:val="1E5E85"/>
-          <w:sz w:val="18"/>
-          <w:szCs w:val="18"/>
-        </w:rPr>
-        <w:t xml:space="preserve">Para casa y familia</w:t>
-      </w:r>
-    </w:p>
-    <w:p>
-      <w:pPr>
-        <w:spacing w:before="0" w:after="110" w:line="260"/>
-      </w:pPr>
-      <w:r>
-        <w:rPr>
-          <w:rFonts w:ascii="Aptos" w:cs="Aptos" w:eastAsia="Aptos" w:hAnsi="Aptos"/>
-          <w:b/>
-          <w:bCs/>
-          <w:color w:val="25323B"/>
-          <w:sz w:val="20"/>
-          <w:szCs w:val="20"/>
-        </w:rPr>
-        <w:t xml:space="preserve">*Titular:*</w:t>
-      </w:r>
-    </w:p>
-    <w:p>
-      <w:pPr>
-        <w:spacing w:before="0" w:after="110" w:line="260"/>
-      </w:pPr>
-      <w:r>
-        <w:rPr>
-          <w:rFonts w:ascii="Aptos Mono" w:cs="Aptos Mono" w:eastAsia="Aptos Mono" w:hAnsi="Aptos Mono"/>
-          <w:b w:val="false"/>
-          <w:bCs w:val="false"/>
-          <w:color w:val="1E5E85"/>
-          <w:sz w:val="18"/>
-          <w:szCs w:val="18"/>
-        </w:rPr>
-        <w:t xml:space="preserve">Fresco desde</w:t>
-      </w:r>
-    </w:p>
-    <w:p>
-      <w:pPr>
-        <w:spacing w:before="0" w:after="110" w:line="260"/>
-      </w:pPr>
-      <w:r>
-        <w:rPr>
-          <w:rFonts w:ascii="Aptos Mono" w:cs="Aptos Mono" w:eastAsia="Aptos Mono" w:hAnsi="Aptos Mono"/>
-          <w:b w:val="false"/>
-          <w:bCs w:val="false"/>
-          <w:color w:val="1E5E85"/>
-          <w:sz w:val="18"/>
-          <w:szCs w:val="18"/>
-        </w:rPr>
-        <w:t xml:space="preserve">nuestros hornos.</w:t>
-      </w:r>
-    </w:p>
-    <w:p>
-      <w:pPr>
-        <w:spacing w:before="0" w:after="110" w:line="260"/>
-      </w:pPr>
-      <w:r>
-        <w:rPr>
-          <w:rFonts w:ascii="Aptos" w:cs="Aptos" w:eastAsia="Aptos" w:hAnsi="Aptos"/>
-          <w:b/>
-          <w:bCs/>
-          <w:color w:val="25323B"/>
-          <w:sz w:val="20"/>
-          <w:szCs w:val="20"/>
-        </w:rPr>
-        <w:t xml:space="preserve">*Texto:*</w:t>
-      </w:r>
-      <w:r>
-        <w:rPr>
-          <w:rFonts w:ascii="Aptos" w:cs="Aptos" w:eastAsia="Aptos" w:hAnsi="Aptos"/>
-          <w:b w:val="false"/>
-          <w:bCs w:val="false"/>
-          <w:color w:val="25323B"/>
-          <w:sz w:val="20"/>
-          <w:szCs w:val="20"/>
-        </w:rPr>
-        <w:t xml:space="preserve"> </w:t>
-      </w:r>
-      <w:r>
-        <w:rPr>
-          <w:rFonts w:ascii="Aptos Mono" w:cs="Aptos Mono" w:eastAsia="Aptos Mono" w:hAnsi="Aptos Mono"/>
-          <w:b w:val="false"/>
-          <w:bCs w:val="false"/>
-          <w:color w:val="1E5E85"/>
-          <w:sz w:val="18"/>
-          <w:szCs w:val="18"/>
-        </w:rPr>
-        <w:t xml:space="preserve">Arma tu caja con los panes mexicanos que ama tu familia, horneados localmente con ingredientes superiores.</w:t>
-      </w:r>
-    </w:p>
-    <w:p>
-      <w:pPr>
-        <w:spacing w:before="0" w:after="110" w:line="260"/>
-      </w:pPr>
-      <w:r>
-        <w:rPr>
-          <w:rFonts w:ascii="Aptos" w:cs="Aptos" w:eastAsia="Aptos" w:hAnsi="Aptos"/>
-          <w:b/>
-          <w:bCs/>
-          <w:color w:val="25323B"/>
-          <w:sz w:val="20"/>
-          <w:szCs w:val="20"/>
-        </w:rPr>
-        <w:t xml:space="preserve">*Botón:*</w:t>
-      </w:r>
-      <w:r>
-        <w:rPr>
-          <w:rFonts w:ascii="Aptos" w:cs="Aptos" w:eastAsia="Aptos" w:hAnsi="Aptos"/>
-          <w:b w:val="false"/>
-          <w:bCs w:val="false"/>
-          <w:color w:val="25323B"/>
-          <w:sz w:val="20"/>
-          <w:szCs w:val="20"/>
-        </w:rPr>
-        <w:t xml:space="preserve"> </w:t>
-      </w:r>
-      <w:r>
-        <w:rPr>
-          <w:rFonts w:ascii="Aptos Mono" w:cs="Aptos Mono" w:eastAsia="Aptos Mono" w:hAnsi="Aptos Mono"/>
-          <w:b w:val="false"/>
-          <w:bCs w:val="false"/>
-          <w:color w:val="1E5E85"/>
-          <w:sz w:val="18"/>
-          <w:szCs w:val="18"/>
-        </w:rPr>
-        <w:t xml:space="preserve">Comprar fresco</w:t>
-      </w:r>
-    </w:p>
-    <w:p>
-      <w:pPr>
-        <w:pStyle w:val="Heading2"/>
-        <w:keepNext/>
-        <w:spacing w:before="180" w:after="90"/>
-      </w:pPr>
-      <w:r>
-        <w:rPr>
-          <w:rFonts w:ascii="Aptos" w:cs="Aptos" w:eastAsia="Aptos" w:hAnsi="Aptos"/>
-          <w:b w:val="false"/>
-          <w:bCs w:val="false"/>
-          <w:color w:val="1E5E85"/>
-          <w:sz w:val="22"/>
-          <w:szCs w:val="22"/>
-        </w:rPr>
-        <w:t xml:space="preserve">Tu panadería, más simple</w:t>
-      </w:r>
-    </w:p>
-    <w:p>
-      <w:pPr>
-        <w:spacing w:before="0" w:after="110" w:line="260"/>
-      </w:pPr>
-      <w:r>
-        <w:rPr>
-          <w:rFonts w:ascii="Aptos" w:cs="Aptos" w:eastAsia="Aptos" w:hAnsi="Aptos"/>
-          <w:b/>
-          <w:bCs/>
-          <w:color w:val="25323B"/>
-          <w:sz w:val="20"/>
-          <w:szCs w:val="20"/>
-        </w:rPr>
-        <w:t xml:space="preserve">*Etiqueta de audiencia:*</w:t>
-      </w:r>
-      <w:r>
-        <w:rPr>
-          <w:rFonts w:ascii="Aptos" w:cs="Aptos" w:eastAsia="Aptos" w:hAnsi="Aptos"/>
-          <w:b w:val="false"/>
-          <w:bCs w:val="false"/>
-          <w:color w:val="25323B"/>
-          <w:sz w:val="20"/>
-          <w:szCs w:val="20"/>
-        </w:rPr>
-        <w:t xml:space="preserve"> </w:t>
-      </w:r>
-      <w:r>
-        <w:rPr>
-          <w:rFonts w:ascii="Aptos Mono" w:cs="Aptos Mono" w:eastAsia="Aptos Mono" w:hAnsi="Aptos Mono"/>
-          <w:b w:val="false"/>
-          <w:bCs w:val="false"/>
-          <w:color w:val="1E5E85"/>
-          <w:sz w:val="18"/>
-          <w:szCs w:val="18"/>
-        </w:rPr>
-        <w:t xml:space="preserve">Para retail y foodservice</w:t>
-      </w:r>
-    </w:p>
-    <w:p>
-      <w:pPr>
-        <w:spacing w:before="0" w:after="110" w:line="260"/>
-      </w:pPr>
-      <w:r>
-        <w:rPr>
-          <w:rFonts w:ascii="Aptos" w:cs="Aptos" w:eastAsia="Aptos" w:hAnsi="Aptos"/>
-          <w:b/>
-          <w:bCs/>
-          <w:color w:val="25323B"/>
-          <w:sz w:val="20"/>
-          <w:szCs w:val="20"/>
-        </w:rPr>
-        <w:t xml:space="preserve">*Titular:*</w:t>
-      </w:r>
-    </w:p>
-    <w:p>
-      <w:pPr>
-        <w:spacing w:before="0" w:after="110" w:line="260"/>
-      </w:pPr>
-      <w:r>
-        <w:rPr>
-          <w:rFonts w:ascii="Aptos Mono" w:cs="Aptos Mono" w:eastAsia="Aptos Mono" w:hAnsi="Aptos Mono"/>
-          <w:b w:val="false"/>
-          <w:bCs w:val="false"/>
-          <w:color w:val="1E5E85"/>
-          <w:sz w:val="18"/>
-          <w:szCs w:val="18"/>
-        </w:rPr>
-        <w:t xml:space="preserve">Tu panadería,</w:t>
-      </w:r>
-    </w:p>
-    <w:p>
-      <w:pPr>
-        <w:spacing w:before="0" w:after="110" w:line="260"/>
-      </w:pPr>
-      <w:r>
-        <w:rPr>
-          <w:rFonts w:ascii="Aptos Mono" w:cs="Aptos Mono" w:eastAsia="Aptos Mono" w:hAnsi="Aptos Mono"/>
-          <w:b w:val="false"/>
-          <w:bCs w:val="false"/>
-          <w:color w:val="1E5E85"/>
-          <w:sz w:val="18"/>
-          <w:szCs w:val="18"/>
-        </w:rPr>
-        <w:t xml:space="preserve">más simple.</w:t>
-      </w:r>
-    </w:p>
-    <w:p>
-      <w:pPr>
-        <w:spacing w:before="0" w:after="110" w:line="260"/>
-      </w:pPr>
-      <w:r>
-        <w:rPr>
-          <w:rFonts w:ascii="Aptos" w:cs="Aptos" w:eastAsia="Aptos" w:hAnsi="Aptos"/>
-          <w:b/>
-          <w:bCs/>
-          <w:color w:val="25323B"/>
-          <w:sz w:val="20"/>
-          <w:szCs w:val="20"/>
-        </w:rPr>
-        <w:t xml:space="preserve">*Texto:*</w:t>
-      </w:r>
-      <w:r>
-        <w:rPr>
-          <w:rFonts w:ascii="Aptos" w:cs="Aptos" w:eastAsia="Aptos" w:hAnsi="Aptos"/>
-          <w:b w:val="false"/>
-          <w:bCs w:val="false"/>
-          <w:color w:val="25323B"/>
-          <w:sz w:val="20"/>
-          <w:szCs w:val="20"/>
-        </w:rPr>
-        <w:t xml:space="preserve"> </w:t>
-      </w:r>
-      <w:r>
-        <w:rPr>
-          <w:rFonts w:ascii="Aptos Mono" w:cs="Aptos Mono" w:eastAsia="Aptos Mono" w:hAnsi="Aptos Mono"/>
-          <w:b w:val="false"/>
-          <w:bCs w:val="false"/>
-          <w:color w:val="1E5E85"/>
-          <w:sz w:val="18"/>
-          <w:szCs w:val="18"/>
-        </w:rPr>
-        <w:t xml:space="preserve">Masa congelada y productos terminados con calidad constante, menor merma y menos mano de obra.</w:t>
-      </w:r>
-    </w:p>
-    <w:p>
-      <w:pPr>
-        <w:spacing w:before="0" w:after="110" w:line="260"/>
-      </w:pPr>
-      <w:r>
-        <w:rPr>
-          <w:rFonts w:ascii="Aptos" w:cs="Aptos" w:eastAsia="Aptos" w:hAnsi="Aptos"/>
-          <w:b/>
-          <w:bCs/>
-          <w:color w:val="25323B"/>
-          <w:sz w:val="20"/>
-          <w:szCs w:val="20"/>
-        </w:rPr>
-        <w:t xml:space="preserve">*Botón:*</w:t>
-      </w:r>
-      <w:r>
-        <w:rPr>
-          <w:rFonts w:ascii="Aptos" w:cs="Aptos" w:eastAsia="Aptos" w:hAnsi="Aptos"/>
-          <w:b w:val="false"/>
-          <w:bCs w:val="false"/>
-          <w:color w:val="25323B"/>
-          <w:sz w:val="20"/>
-          <w:szCs w:val="20"/>
-        </w:rPr>
-        <w:t xml:space="preserve"> </w:t>
-      </w:r>
-      <w:r>
-        <w:rPr>
-          <w:rFonts w:ascii="Aptos Mono" w:cs="Aptos Mono" w:eastAsia="Aptos Mono" w:hAnsi="Aptos Mono"/>
-          <w:b w:val="false"/>
-          <w:bCs w:val="false"/>
-          <w:color w:val="1E5E85"/>
-          <w:sz w:val="18"/>
-          <w:szCs w:val="18"/>
-        </w:rPr>
-        <w:t xml:space="preserve">Ver mayoreo</w:t>
-      </w:r>
-    </w:p>
-    <w:p>
-      <w:pPr>
-        <w:spacing w:before="0" w:after="110" w:line="260"/>
-      </w:pPr>
-      <w:r>
-        <w:rPr>
-          <w:rFonts w:ascii="Aptos" w:cs="Aptos" w:eastAsia="Aptos" w:hAnsi="Aptos"/>
-          <w:b w:val="false"/>
-          <w:bCs w:val="false"/>
-          <w:color w:val="25323B"/>
-          <w:sz w:val="20"/>
-          <w:szCs w:val="20"/>
-        </w:rPr>
-        <w:t xml:space="preserve">Validación: [ ] Aprobado tal como está  [ ] Solicita cambios</w:t>
-      </w:r>
-    </w:p>
-    <w:p>
-      <w:pPr>
-        <w:spacing w:before="0" w:after="110" w:line="260"/>
-      </w:pPr>
-      <w:r>
-        <w:rPr>
-          <w:rFonts w:ascii="Aptos" w:cs="Aptos" w:eastAsia="Aptos" w:hAnsi="Aptos"/>
-          <w:b w:val="false"/>
-          <w:bCs w:val="false"/>
-          <w:color w:val="25323B"/>
-          <w:sz w:val="20"/>
-          <w:szCs w:val="20"/>
-        </w:rPr>
-        <w:t xml:space="preserve">Notas: ______________________________________________________________________</w:t>
-      </w:r>
-    </w:p>
-    <w:p>
-      <w:pPr>
-        <w:pStyle w:val="Heading1"/>
-        <w:keepNext/>
-        <w:spacing w:before="260" w:after="90"/>
-      </w:pPr>
-      <w:r>
-        <w:rPr>
-          <w:rFonts w:ascii="Aptos" w:cs="Aptos" w:eastAsia="Aptos" w:hAnsi="Aptos"/>
-          <w:b w:val="false"/>
-          <w:bCs w:val="false"/>
-          <w:color w:val="1E5E85"/>
-          <w:sz w:val="28"/>
-          <w:szCs w:val="28"/>
-        </w:rPr>
-        <w:t xml:space="preserve">5. Introducción de la experiencia de productos</w:t>
-      </w:r>
-    </w:p>
-    <w:p>
-      <w:pPr>
-        <w:spacing w:before="0" w:after="110" w:line="260"/>
-      </w:pPr>
-      <w:r>
-        <w:rPr>
-          <w:rFonts w:ascii="Aptos" w:cs="Aptos" w:eastAsia="Aptos" w:hAnsi="Aptos"/>
-          <w:b/>
-          <w:bCs/>
-          <w:color w:val="25323B"/>
-          <w:sz w:val="20"/>
-          <w:szCs w:val="20"/>
-        </w:rPr>
-        <w:t xml:space="preserve">*Eyebrow:*</w:t>
-      </w:r>
-      <w:r>
-        <w:rPr>
-          <w:rFonts w:ascii="Aptos" w:cs="Aptos" w:eastAsia="Aptos" w:hAnsi="Aptos"/>
-          <w:b w:val="false"/>
-          <w:bCs w:val="false"/>
-          <w:color w:val="25323B"/>
-          <w:sz w:val="20"/>
-          <w:szCs w:val="20"/>
-        </w:rPr>
-        <w:t xml:space="preserve"> </w:t>
-      </w:r>
-      <w:r>
-        <w:rPr>
-          <w:rFonts w:ascii="Aptos Mono" w:cs="Aptos Mono" w:eastAsia="Aptos Mono" w:hAnsi="Aptos Mono"/>
-          <w:b w:val="false"/>
-          <w:bCs w:val="false"/>
-          <w:color w:val="1E5E85"/>
-          <w:sz w:val="18"/>
-          <w:szCs w:val="18"/>
-        </w:rPr>
-        <w:t xml:space="preserve">Dos formas de disfrutar Artimex</w:t>
-      </w:r>
-    </w:p>
-    <w:p>
-      <w:pPr>
-        <w:spacing w:before="0" w:after="110" w:line="260"/>
-      </w:pPr>
-      <w:r>
-        <w:rPr>
-          <w:rFonts w:ascii="Aptos" w:cs="Aptos" w:eastAsia="Aptos" w:hAnsi="Aptos"/>
-          <w:b/>
-          <w:bCs/>
-          <w:color w:val="25323B"/>
-          <w:sz w:val="20"/>
-          <w:szCs w:val="20"/>
-        </w:rPr>
-        <w:t xml:space="preserve">*Titular:*</w:t>
-      </w:r>
-    </w:p>
-    <w:p>
-      <w:pPr>
-        <w:spacing w:before="0" w:after="110" w:line="260"/>
-      </w:pPr>
-      <w:r>
-        <w:rPr>
-          <w:rFonts w:ascii="Aptos Mono" w:cs="Aptos Mono" w:eastAsia="Aptos Mono" w:hAnsi="Aptos Mono"/>
-          <w:b w:val="false"/>
-          <w:bCs w:val="false"/>
-          <w:color w:val="1E5E85"/>
-          <w:sz w:val="18"/>
-          <w:szCs w:val="18"/>
-        </w:rPr>
-        <w:t xml:space="preserve">Fresco para la mesa.</w:t>
-      </w:r>
-    </w:p>
-    <w:p>
-      <w:pPr>
-        <w:spacing w:before="0" w:after="110" w:line="260"/>
-      </w:pPr>
-      <w:r>
-        <w:rPr>
-          <w:rFonts w:ascii="Aptos Mono" w:cs="Aptos Mono" w:eastAsia="Aptos Mono" w:hAnsi="Aptos Mono"/>
-          <w:b w:val="false"/>
-          <w:bCs w:val="false"/>
-          <w:color w:val="1E5E85"/>
-          <w:sz w:val="18"/>
-          <w:szCs w:val="18"/>
-        </w:rPr>
-        <w:t xml:space="preserve">Congelado para el negocio.</w:t>
-      </w:r>
-    </w:p>
-    <w:p>
-      <w:pPr>
-        <w:spacing w:before="0" w:after="110" w:line="260"/>
-      </w:pPr>
-      <w:r>
-        <w:rPr>
-          <w:rFonts w:ascii="Aptos" w:cs="Aptos" w:eastAsia="Aptos" w:hAnsi="Aptos"/>
-          <w:b/>
-          <w:bCs/>
-          <w:color w:val="25323B"/>
-          <w:sz w:val="20"/>
-          <w:szCs w:val="20"/>
-        </w:rPr>
-        <w:t xml:space="preserve">*Texto:*</w:t>
-      </w:r>
-      <w:r>
-        <w:rPr>
-          <w:rFonts w:ascii="Aptos" w:cs="Aptos" w:eastAsia="Aptos" w:hAnsi="Aptos"/>
-          <w:b w:val="false"/>
-          <w:bCs w:val="false"/>
-          <w:color w:val="25323B"/>
-          <w:sz w:val="20"/>
-          <w:szCs w:val="20"/>
-        </w:rPr>
-        <w:t xml:space="preserve"> </w:t>
-      </w:r>
-      <w:r>
-        <w:rPr>
-          <w:rFonts w:ascii="Aptos Mono" w:cs="Aptos Mono" w:eastAsia="Aptos Mono" w:hAnsi="Aptos Mono"/>
-          <w:b w:val="false"/>
-          <w:bCs w:val="false"/>
-          <w:color w:val="1E5E85"/>
-          <w:sz w:val="18"/>
-          <w:szCs w:val="18"/>
-        </w:rPr>
-        <w:t xml:space="preserve">Una misma filosofía de producto, dos experiencias. El consumidor elige pan recién preparado; restaurantes y mercados construyen pedidos profesionales listos para hornear.</w:t>
-      </w:r>
-    </w:p>
-    <w:p>
-      <w:pPr>
-        <w:spacing w:before="0" w:after="110" w:line="260"/>
-      </w:pPr>
-      <w:r>
-        <w:rPr>
-          <w:rFonts w:ascii="Aptos" w:cs="Aptos" w:eastAsia="Aptos" w:hAnsi="Aptos"/>
-          <w:b w:val="false"/>
-          <w:bCs w:val="false"/>
-          <w:color w:val="25323B"/>
-          <w:sz w:val="20"/>
-          <w:szCs w:val="20"/>
-        </w:rPr>
-        <w:t xml:space="preserve">Validación: [ ] Aprobado tal como está  [ ] Solicita cambios</w:t>
-      </w:r>
-    </w:p>
-    <w:p>
-      <w:pPr>
-        <w:spacing w:before="0" w:after="110" w:line="260"/>
-      </w:pPr>
-      <w:r>
-        <w:rPr>
-          <w:rFonts w:ascii="Aptos" w:cs="Aptos" w:eastAsia="Aptos" w:hAnsi="Aptos"/>
-          <w:b w:val="false"/>
-          <w:bCs w:val="false"/>
-          <w:color w:val="25323B"/>
-          <w:sz w:val="20"/>
-          <w:szCs w:val="20"/>
-        </w:rPr>
-        <w:t xml:space="preserve">Notas: ______________________________________________________________________</w:t>
-      </w:r>
-    </w:p>
-    <w:p>
-      <w:pPr>
-        <w:pStyle w:val="Heading1"/>
-        <w:keepNext/>
-        <w:spacing w:before="260" w:after="90"/>
-      </w:pPr>
-      <w:r>
-        <w:rPr>
-          <w:rFonts w:ascii="Aptos" w:cs="Aptos" w:eastAsia="Aptos" w:hAnsi="Aptos"/>
-          <w:b w:val="false"/>
-          <w:bCs w:val="false"/>
-          <w:color w:val="1E5E85"/>
-          <w:sz w:val="28"/>
-          <w:szCs w:val="28"/>
-        </w:rPr>
-        <w:t xml:space="preserve">6. Catálogo de pan fresco / B2C</w:t>
-      </w:r>
-    </w:p>
-    <w:p>
-      <w:pPr>
-        <w:spacing w:before="0" w:after="110" w:line="260"/>
-      </w:pPr>
-      <w:r>
-        <w:rPr>
-          <w:rFonts w:ascii="Aptos" w:cs="Aptos" w:eastAsia="Aptos" w:hAnsi="Aptos"/>
-          <w:b/>
-          <w:bCs/>
-          <w:color w:val="25323B"/>
-          <w:sz w:val="20"/>
-          <w:szCs w:val="20"/>
-        </w:rPr>
-        <w:t xml:space="preserve">*Etiqueta de pestaña:*</w:t>
-      </w:r>
-      <w:r>
-        <w:rPr>
-          <w:rFonts w:ascii="Aptos" w:cs="Aptos" w:eastAsia="Aptos" w:hAnsi="Aptos"/>
-          <w:b w:val="false"/>
-          <w:bCs w:val="false"/>
-          <w:color w:val="25323B"/>
-          <w:sz w:val="20"/>
-          <w:szCs w:val="20"/>
-        </w:rPr>
-        <w:t xml:space="preserve"> </w:t>
-      </w:r>
-      <w:r>
-        <w:rPr>
-          <w:rFonts w:ascii="Aptos Mono" w:cs="Aptos Mono" w:eastAsia="Aptos Mono" w:hAnsi="Aptos Mono"/>
-          <w:b w:val="false"/>
-          <w:bCs w:val="false"/>
-          <w:color w:val="1E5E85"/>
-          <w:sz w:val="18"/>
-          <w:szCs w:val="18"/>
-        </w:rPr>
-        <w:t xml:space="preserve">Pan fresco</w:t>
-      </w:r>
-    </w:p>
-    <w:p>
-      <w:pPr>
-        <w:spacing w:before="0" w:after="110" w:line="260"/>
-      </w:pPr>
-      <w:r>
-        <w:rPr>
-          <w:rFonts w:ascii="Aptos" w:cs="Aptos" w:eastAsia="Aptos" w:hAnsi="Aptos"/>
-          <w:b/>
-          <w:bCs/>
-          <w:color w:val="25323B"/>
-          <w:sz w:val="20"/>
-          <w:szCs w:val="20"/>
-        </w:rPr>
-        <w:t xml:space="preserve">*Eyebrow:*</w:t>
-      </w:r>
-      <w:r>
-        <w:rPr>
-          <w:rFonts w:ascii="Aptos" w:cs="Aptos" w:eastAsia="Aptos" w:hAnsi="Aptos"/>
-          <w:b w:val="false"/>
-          <w:bCs w:val="false"/>
-          <w:color w:val="25323B"/>
-          <w:sz w:val="20"/>
-          <w:szCs w:val="20"/>
-        </w:rPr>
-        <w:t xml:space="preserve"> </w:t>
-      </w:r>
-      <w:r>
-        <w:rPr>
-          <w:rFonts w:ascii="Aptos Mono" w:cs="Aptos Mono" w:eastAsia="Aptos Mono" w:hAnsi="Aptos Mono"/>
-          <w:b w:val="false"/>
-          <w:bCs w:val="false"/>
-          <w:color w:val="1E5E85"/>
-          <w:sz w:val="18"/>
-          <w:szCs w:val="18"/>
-        </w:rPr>
-        <w:t xml:space="preserve">La colección Artimex</w:t>
-      </w:r>
-    </w:p>
-    <w:p>
-      <w:pPr>
-        <w:spacing w:before="0" w:after="110" w:line="260"/>
-      </w:pPr>
-      <w:r>
-        <w:rPr>
-          <w:rFonts w:ascii="Aptos" w:cs="Aptos" w:eastAsia="Aptos" w:hAnsi="Aptos"/>
-          <w:b/>
-          <w:bCs/>
-          <w:color w:val="25323B"/>
-          <w:sz w:val="20"/>
-          <w:szCs w:val="20"/>
-        </w:rPr>
-        <w:t xml:space="preserve">*Título:*</w:t>
-      </w:r>
-      <w:r>
-        <w:rPr>
-          <w:rFonts w:ascii="Aptos" w:cs="Aptos" w:eastAsia="Aptos" w:hAnsi="Aptos"/>
-          <w:b w:val="false"/>
-          <w:bCs w:val="false"/>
-          <w:color w:val="25323B"/>
-          <w:sz w:val="20"/>
-          <w:szCs w:val="20"/>
-        </w:rPr>
-        <w:t xml:space="preserve"> </w:t>
-      </w:r>
-      <w:r>
-        <w:rPr>
-          <w:rFonts w:ascii="Aptos Mono" w:cs="Aptos Mono" w:eastAsia="Aptos Mono" w:hAnsi="Aptos Mono"/>
-          <w:b w:val="false"/>
-          <w:bCs w:val="false"/>
-          <w:color w:val="1E5E85"/>
-          <w:sz w:val="18"/>
-          <w:szCs w:val="18"/>
-        </w:rPr>
-        <w:t xml:space="preserve">Encuentra tu favorito.</w:t>
-      </w:r>
-    </w:p>
-    <w:p>
-      <w:pPr>
-        <w:spacing w:before="0" w:after="110" w:line="260"/>
-      </w:pPr>
-      <w:r>
-        <w:rPr>
-          <w:rFonts w:ascii="Aptos" w:cs="Aptos" w:eastAsia="Aptos" w:hAnsi="Aptos"/>
-          <w:b/>
-          <w:bCs/>
-          <w:color w:val="25323B"/>
-          <w:sz w:val="20"/>
-          <w:szCs w:val="20"/>
-        </w:rPr>
-        <w:t xml:space="preserve">*Etiqueta de filtros:*</w:t>
-      </w:r>
-      <w:r>
-        <w:rPr>
-          <w:rFonts w:ascii="Aptos" w:cs="Aptos" w:eastAsia="Aptos" w:hAnsi="Aptos"/>
-          <w:b w:val="false"/>
-          <w:bCs w:val="false"/>
-          <w:color w:val="25323B"/>
-          <w:sz w:val="20"/>
-          <w:szCs w:val="20"/>
-        </w:rPr>
-        <w:t xml:space="preserve"> </w:t>
-      </w:r>
-      <w:r>
-        <w:rPr>
-          <w:rFonts w:ascii="Aptos Mono" w:cs="Aptos Mono" w:eastAsia="Aptos Mono" w:hAnsi="Aptos Mono"/>
-          <w:b w:val="false"/>
-          <w:bCs w:val="false"/>
-          <w:color w:val="1E5E85"/>
-          <w:sz w:val="18"/>
-          <w:szCs w:val="18"/>
-        </w:rPr>
-        <w:t xml:space="preserve">Filtros de producto</w:t>
-      </w:r>
-    </w:p>
-    <w:p>
-      <w:pPr>
-        <w:spacing w:before="0" w:after="110" w:line="260"/>
-      </w:pPr>
-      <w:r>
-        <w:rPr>
-          <w:rFonts w:ascii="Aptos" w:cs="Aptos" w:eastAsia="Aptos" w:hAnsi="Aptos"/>
-          <w:b/>
-          <w:bCs/>
-          <w:color w:val="25323B"/>
-          <w:sz w:val="20"/>
-          <w:szCs w:val="20"/>
-        </w:rPr>
-        <w:t xml:space="preserve">*Opciones de filtro:*</w:t>
-      </w:r>
-      <w:r>
-        <w:rPr>
-          <w:rFonts w:ascii="Aptos" w:cs="Aptos" w:eastAsia="Aptos" w:hAnsi="Aptos"/>
-          <w:b w:val="false"/>
-          <w:bCs w:val="false"/>
-          <w:color w:val="25323B"/>
-          <w:sz w:val="20"/>
-          <w:szCs w:val="20"/>
-        </w:rPr>
-        <w:t xml:space="preserve"> </w:t>
-      </w:r>
-      <w:r>
-        <w:rPr>
-          <w:rFonts w:ascii="Aptos Mono" w:cs="Aptos Mono" w:eastAsia="Aptos Mono" w:hAnsi="Aptos Mono"/>
-          <w:b w:val="false"/>
-          <w:bCs w:val="false"/>
-          <w:color w:val="1E5E85"/>
-          <w:sz w:val="18"/>
-          <w:szCs w:val="18"/>
-        </w:rPr>
-        <w:t xml:space="preserve">Todos</w:t>
-      </w:r>
-      <w:r>
-        <w:rPr>
-          <w:rFonts w:ascii="Aptos" w:cs="Aptos" w:eastAsia="Aptos" w:hAnsi="Aptos"/>
-          <w:b w:val="false"/>
-          <w:bCs w:val="false"/>
-          <w:color w:val="25323B"/>
-          <w:sz w:val="20"/>
-          <w:szCs w:val="20"/>
-        </w:rPr>
-        <w:t xml:space="preserve"> · </w:t>
-      </w:r>
-      <w:r>
-        <w:rPr>
-          <w:rFonts w:ascii="Aptos Mono" w:cs="Aptos Mono" w:eastAsia="Aptos Mono" w:hAnsi="Aptos Mono"/>
-          <w:b w:val="false"/>
-          <w:bCs w:val="false"/>
-          <w:color w:val="1E5E85"/>
-          <w:sz w:val="18"/>
-          <w:szCs w:val="18"/>
-        </w:rPr>
-        <w:t xml:space="preserve">Conchas</w:t>
-      </w:r>
-      <w:r>
-        <w:rPr>
-          <w:rFonts w:ascii="Aptos" w:cs="Aptos" w:eastAsia="Aptos" w:hAnsi="Aptos"/>
-          <w:b w:val="false"/>
-          <w:bCs w:val="false"/>
-          <w:color w:val="25323B"/>
-          <w:sz w:val="20"/>
-          <w:szCs w:val="20"/>
-        </w:rPr>
-        <w:t xml:space="preserve"> · </w:t>
-      </w:r>
-      <w:r>
-        <w:rPr>
-          <w:rFonts w:ascii="Aptos Mono" w:cs="Aptos Mono" w:eastAsia="Aptos Mono" w:hAnsi="Aptos Mono"/>
-          <w:b w:val="false"/>
-          <w:bCs w:val="false"/>
-          <w:color w:val="1E5E85"/>
-          <w:sz w:val="18"/>
-          <w:szCs w:val="18"/>
-        </w:rPr>
-        <w:t xml:space="preserve">Savory</w:t>
-      </w:r>
-      <w:r>
-        <w:rPr>
-          <w:rFonts w:ascii="Aptos" w:cs="Aptos" w:eastAsia="Aptos" w:hAnsi="Aptos"/>
-          <w:b w:val="false"/>
-          <w:bCs w:val="false"/>
-          <w:color w:val="25323B"/>
-          <w:sz w:val="20"/>
-          <w:szCs w:val="20"/>
-        </w:rPr>
-        <w:t xml:space="preserve"> · </w:t>
-      </w:r>
-      <w:r>
-        <w:rPr>
-          <w:rFonts w:ascii="Aptos Mono" w:cs="Aptos Mono" w:eastAsia="Aptos Mono" w:hAnsi="Aptos Mono"/>
-          <w:b w:val="false"/>
-          <w:bCs w:val="false"/>
-          <w:color w:val="1E5E85"/>
-          <w:sz w:val="18"/>
-          <w:szCs w:val="18"/>
-        </w:rPr>
-        <w:t xml:space="preserve">Pastries</w:t>
-      </w:r>
-    </w:p>
-    <w:p>
-      <w:pPr>
-        <w:spacing w:before="0" w:after="110" w:line="260"/>
-      </w:pPr>
-      <w:r>
-        <w:rPr>
-          <w:rFonts w:ascii="Aptos" w:cs="Aptos" w:eastAsia="Aptos" w:hAnsi="Aptos"/>
-          <w:b/>
-          <w:bCs/>
-          <w:color w:val="25323B"/>
-          <w:sz w:val="20"/>
-          <w:szCs w:val="20"/>
-        </w:rPr>
-        <w:t xml:space="preserve">*Botón en cada producto:*</w:t>
-      </w:r>
-      <w:r>
-        <w:rPr>
-          <w:rFonts w:ascii="Aptos" w:cs="Aptos" w:eastAsia="Aptos" w:hAnsi="Aptos"/>
-          <w:b w:val="false"/>
-          <w:bCs w:val="false"/>
-          <w:color w:val="25323B"/>
-          <w:sz w:val="20"/>
-          <w:szCs w:val="20"/>
-        </w:rPr>
-        <w:t xml:space="preserve"> </w:t>
-      </w:r>
-      <w:r>
-        <w:rPr>
-          <w:rFonts w:ascii="Aptos Mono" w:cs="Aptos Mono" w:eastAsia="Aptos Mono" w:hAnsi="Aptos Mono"/>
-          <w:b w:val="false"/>
-          <w:bCs w:val="false"/>
-          <w:color w:val="1E5E85"/>
-          <w:sz w:val="18"/>
-          <w:szCs w:val="18"/>
-        </w:rPr>
-        <w:t xml:space="preserve">Agregar a la canasta</w:t>
-      </w:r>
-    </w:p>
-    <w:p>
-      <w:pPr>
-        <w:pStyle w:val="Heading2"/>
-        <w:keepNext/>
-        <w:spacing w:before="180" w:after="90"/>
-      </w:pPr>
-      <w:r>
-        <w:rPr>
-          <w:rFonts w:ascii="Aptos" w:cs="Aptos" w:eastAsia="Aptos" w:hAnsi="Aptos"/>
-          <w:b w:val="false"/>
-          <w:bCs w:val="false"/>
-          <w:color w:val="1E5E85"/>
-          <w:sz w:val="22"/>
-          <w:szCs w:val="22"/>
+          <w:sz w:val="21"/>
+          <w:szCs w:val="21"/>
         </w:rPr>
         <w:t xml:space="preserve">Productos frescos</w:t>
       </w:r>
@@ -10344,7 +10308,7 @@
           <w:sz w:val="28"/>
           <w:szCs w:val="28"/>
         </w:rPr>
-        <w:t xml:space="preserve">7. Programa de mayoreo congelado / B2B</w:t>
+        <w:t xml:space="preserve">Programa Artimex Bake-Off</w:t>
       </w:r>
     </w:p>
     <w:p>
@@ -10631,8 +10595,8 @@
           <w:b w:val="false"/>
           <w:bCs w:val="false"/>
           <w:color w:val="1E5E85"/>
-          <w:sz w:val="22"/>
-          <w:szCs w:val="22"/>
+          <w:sz w:val="21"/>
+          <w:szCs w:val="21"/>
         </w:rPr>
         <w:t xml:space="preserve">Productos de mayoreo</w:t>
       </w:r>
@@ -11784,7 +11748,7 @@
           <w:sz w:val="28"/>
           <w:szCs w:val="28"/>
         </w:rPr>
-        <w:t xml:space="preserve">8. El estándar Artimex</w:t>
+        <w:t xml:space="preserve">El estándar Artimex</w:t>
       </w:r>
     </w:p>
     <w:p>
@@ -12192,7 +12156,7 @@
           <w:sz w:val="28"/>
           <w:szCs w:val="28"/>
         </w:rPr>
-        <w:t xml:space="preserve">9. Herencia Artimex</w:t>
+        <w:t xml:space="preserve">Del archivo original de Artimex</w:t>
       </w:r>
     </w:p>
     <w:p>
@@ -12464,7 +12428,7 @@
           <w:sz w:val="28"/>
           <w:szCs w:val="28"/>
         </w:rPr>
-        <w:t xml:space="preserve">10. Artimex para negocios</w:t>
+        <w:t xml:space="preserve">Artimex para negocios</w:t>
       </w:r>
     </w:p>
     <w:p>
@@ -13038,7 +13002,7 @@
           <w:sz w:val="28"/>
           <w:szCs w:val="28"/>
         </w:rPr>
-        <w:t xml:space="preserve">11. Del congelador a la vitrina</w:t>
+        <w:t xml:space="preserve">Del congelador a la vitrina</w:t>
       </w:r>
     </w:p>
     <w:p>
@@ -13366,7 +13330,7 @@
           <w:sz w:val="28"/>
           <w:szCs w:val="28"/>
         </w:rPr>
-        <w:t xml:space="preserve">12. Empleo</w:t>
+        <w:t xml:space="preserve">Oportunidades en Artimex</w:t>
       </w:r>
     </w:p>
     <w:p>
@@ -13692,7 +13656,7 @@
           <w:sz w:val="28"/>
           <w:szCs w:val="28"/>
         </w:rPr>
-        <w:t xml:space="preserve">13. Contacto y pie de página</w:t>
+        <w:t xml:space="preserve">Pan fresco • Mayoreo • Foodservice</w:t>
       </w:r>
     </w:p>
     <w:p>

</xml_diff>

<commit_message>
Add original Artimex About Us content
</commit_message>
<xml_diff>
--- a/docs/artimex-bos.docx
+++ b/docs/artimex-bos.docx
@@ -411,7 +411,7 @@
                 <w:sz w:val="16"/>
                 <w:szCs w:val="16"/>
               </w:rPr>
-              <w:t xml:space="preserve">Our story</w:t>
+              <w:t xml:space="preserve">About us</w:t>
             </w:r>
           </w:p>
         </w:tc>
@@ -434,7 +434,7 @@
                 <w:sz w:val="16"/>
                 <w:szCs w:val="16"/>
               </w:rPr>
-              <w:t xml:space="preserve">#story</w:t>
+              <w:t xml:space="preserve">#about</w:t>
             </w:r>
           </w:p>
         </w:tc>
@@ -1219,7 +1219,7 @@
           <w:sz w:val="18"/>
           <w:szCs w:val="18"/>
         </w:rPr>
-        <w:t xml:space="preserve">Our story</w:t>
+        <w:t xml:space="preserve">About us</w:t>
       </w:r>
     </w:p>
     <w:p>
@@ -2458,7 +2458,7 @@
           <w:sz w:val="28"/>
           <w:szCs w:val="28"/>
         </w:rPr>
-        <w:t xml:space="preserve">2. Our story</w:t>
+        <w:t xml:space="preserve">2. About us</w:t>
       </w:r>
     </w:p>
     <w:p>
@@ -2496,7 +2496,34 @@
           <w:sz w:val="18"/>
           <w:szCs w:val="18"/>
         </w:rPr>
-        <w:t xml:space="preserve">#story</w:t>
+        <w:t xml:space="preserve">#about</w:t>
+      </w:r>
+    </w:p>
+    <w:p>
+      <w:pPr>
+        <w:spacing w:before="0" w:after="110" w:line="260"/>
+      </w:pPr>
+      <w:r>
+        <w:rPr>
+          <w:rFonts w:ascii="Aptos" w:cs="Aptos" w:eastAsia="Aptos" w:hAnsi="Aptos"/>
+          <w:b/>
+          <w:bCs/>
+          <w:color w:val="25323B"/>
+          <w:sz w:val="20"/>
+          <w:szCs w:val="20"/>
+        </w:rPr>
+        <w:t xml:space="preserve">*Source page:*</w:t>
+      </w:r>
+      <w:r>
+        <w:rPr>
+          <w:rFonts w:ascii="Aptos" w:cs="Aptos" w:eastAsia="Aptos" w:hAnsi="Aptos"/>
+          <w:b w:val="false"/>
+          <w:bCs w:val="false"/>
+          <w:color w:val="25323B"/>
+          <w:sz w:val="20"/>
+          <w:szCs w:val="20"/>
+        </w:rPr>
+        <w:t xml:space="preserve"> https://www.artimexbakery.com/aboutus.html</w:t>
       </w:r>
     </w:p>
     <w:p>
@@ -2552,7 +2579,7 @@
           <w:sz w:val="18"/>
           <w:szCs w:val="18"/>
         </w:rPr>
-        <w:t xml:space="preserve">Artimex — Our Story | Artisan Mexican Bakery</w:t>
+        <w:t xml:space="preserve">Artimex — About Us | Artisan Mexican Bakery</w:t>
       </w:r>
     </w:p>
     <w:p>
@@ -2590,7 +2617,7 @@
           <w:sz w:val="18"/>
           <w:szCs w:val="18"/>
         </w:rPr>
-        <w:t xml:space="preserve">The Artimex standard: Mexican baking made with authenticity, tradition, superior ingredients and modern consistency.</w:t>
+        <w:t xml:space="preserve">Artimex Artisan Mexican Bakery creates authentic Mexican breads in the spirit of the artisan baking tradition.</w:t>
       </w:r>
     </w:p>
     <w:p>
@@ -2628,7 +2655,7 @@
           <w:sz w:val="18"/>
           <w:szCs w:val="18"/>
         </w:rPr>
-        <w:t xml:space="preserve">Artimex story, Mexican baking tradition, artisan bakery, authentic Mexican bread, superior ingredients, bakery consistency</w:t>
+        <w:t xml:space="preserve">Artimex about us, artisan Mexican bakery, authentic recipes, classic Mexican breads, artisan baking tradition, flash frozen bakery</w:t>
       </w:r>
     </w:p>
     <w:p>
@@ -2646,7 +2673,7 @@
           <w:sz w:val="21"/>
           <w:szCs w:val="21"/>
         </w:rPr>
-        <w:t xml:space="preserve">The Artimex standard</w:t>
+        <w:t xml:space="preserve">Authenticity. Tradition. Superior Ingredients.</w:t>
       </w:r>
     </w:p>
     <w:p>
@@ -2673,7 +2700,7 @@
           <w:sz w:val="18"/>
           <w:szCs w:val="18"/>
         </w:rPr>
-        <w:t xml:space="preserve">The Artimex standard</w:t>
+        <w:t xml:space="preserve">Authenticity. Tradition. Superior Ingredients.</w:t>
       </w:r>
     </w:p>
     <w:p>
@@ -2748,7 +2775,7 @@
           <w:sz w:val="18"/>
           <w:szCs w:val="18"/>
         </w:rPr>
-        <w:t xml:space="preserve">We approach Mexican baking as a craft: the right ingredients, the right fermentation, the right heat — and the discipline to make every batch worthy of the tradition behind it.</w:t>
+        <w:t xml:space="preserve">When ARTIMEX ARTISAN MEXICAN BAKERY first opened its doors, we had a vision of creating only the finest Mexican breads prepared in the spirit of the artisan baking tradition. In a few short years we have done just that, winning praise and acceptance for our authentic recipes and classic Mexican breads throughout the Hispanic community.</w:t>
       </w:r>
     </w:p>
     <w:p>
@@ -2808,7 +2835,7 @@
           <w:sz w:val="18"/>
           <w:szCs w:val="18"/>
         </w:rPr>
-        <w:t xml:space="preserve">Classic Mexican breads with recognizable flavor, shape and texture.</w:t>
+        <w:t xml:space="preserve">Harkening back to the traditions of Mexico’s finest Artisan bakers, we strive to bake not only with our hands and our heads, but with our hearts as well.</w:t>
       </w:r>
     </w:p>
     <w:p>
@@ -2830,7 +2857,7 @@
           <w:sz w:val="18"/>
           <w:szCs w:val="18"/>
         </w:rPr>
-        <w:t xml:space="preserve">Consistency</w:t>
+        <w:t xml:space="preserve">Artisan craft</w:t>
       </w:r>
       <w:r>
         <w:rPr>
@@ -2852,7 +2879,7 @@
           <w:sz w:val="18"/>
           <w:szCs w:val="18"/>
         </w:rPr>
-        <w:t xml:space="preserve">A repeatable bakery program designed for dependable daily results.</w:t>
+        <w:t xml:space="preserve">Whether it’s putting together the perfect mix of fresh ingredients, calculating the optimal baking time, or determining peak oven temperatures, we pride ourselves on creating a truly unique bread every time we bake.</w:t>
       </w:r>
     </w:p>
     <w:p>
@@ -2874,7 +2901,7 @@
           <w:sz w:val="18"/>
           <w:szCs w:val="18"/>
         </w:rPr>
-        <w:t xml:space="preserve">Superior ingredients</w:t>
+        <w:t xml:space="preserve">Unrivaled quality</w:t>
       </w:r>
       <w:r>
         <w:rPr>
@@ -2896,7 +2923,7 @@
           <w:sz w:val="18"/>
           <w:szCs w:val="18"/>
         </w:rPr>
-        <w:t xml:space="preserve">Quality starts before the oven — with a better base and careful handling.</w:t>
+        <w:t xml:space="preserve">What our breads have in common is ARTIMEX ARTISAN MEXICAN BAKERY’S unrivaled quality, always steeped in a rich artisan tradition.</w:t>
       </w:r>
     </w:p>
     <w:p>
@@ -2928,23 +2955,55 @@
           <w:sz w:val="18"/>
           <w:szCs w:val="18"/>
         </w:rPr>
-        <w:t xml:space="preserve">Traditional form.</w:t>
-      </w:r>
-    </w:p>
-    <w:p>
-      <w:pPr>
-        <w:spacing w:before="0" w:after="110" w:line="260"/>
-      </w:pPr>
-      <w:r>
-        <w:rPr>
-          <w:rFonts w:ascii="Aptos Mono" w:cs="Aptos Mono" w:eastAsia="Aptos Mono" w:hAnsi="Aptos Mono"/>
-          <w:b w:val="false"/>
-          <w:bCs w:val="false"/>
-          <w:color w:val="1E5E85"/>
-          <w:sz w:val="18"/>
-          <w:szCs w:val="18"/>
-        </w:rPr>
-        <w:t xml:space="preserve">Modern consistency.</w:t>
+        <w:t xml:space="preserve">He who works with his hands is a laborer.</w:t>
+      </w:r>
+    </w:p>
+    <w:p>
+      <w:pPr>
+        <w:spacing w:before="0" w:after="110" w:line="260"/>
+      </w:pPr>
+      <w:r>
+        <w:rPr>
+          <w:rFonts w:ascii="Aptos Mono" w:cs="Aptos Mono" w:eastAsia="Aptos Mono" w:hAnsi="Aptos Mono"/>
+          <w:b w:val="false"/>
+          <w:bCs w:val="false"/>
+          <w:color w:val="1E5E85"/>
+          <w:sz w:val="18"/>
+          <w:szCs w:val="18"/>
+        </w:rPr>
+        <w:t xml:space="preserve">He who works with his hands and his head is a craftsman.</w:t>
+      </w:r>
+    </w:p>
+    <w:p>
+      <w:pPr>
+        <w:spacing w:before="0" w:after="110" w:line="260"/>
+      </w:pPr>
+      <w:r>
+        <w:rPr>
+          <w:rFonts w:ascii="Aptos Mono" w:cs="Aptos Mono" w:eastAsia="Aptos Mono" w:hAnsi="Aptos Mono"/>
+          <w:b w:val="false"/>
+          <w:bCs w:val="false"/>
+          <w:color w:val="1E5E85"/>
+          <w:sz w:val="18"/>
+          <w:szCs w:val="18"/>
+        </w:rPr>
+        <w:t xml:space="preserve">He who works with his hands and his head and his heart is an artist.</w:t>
+      </w:r>
+    </w:p>
+    <w:p>
+      <w:pPr>
+        <w:spacing w:before="0" w:after="110" w:line="260"/>
+      </w:pPr>
+      <w:r>
+        <w:rPr>
+          <w:rFonts w:ascii="Aptos Mono" w:cs="Aptos Mono" w:eastAsia="Aptos Mono" w:hAnsi="Aptos Mono"/>
+          <w:b w:val="false"/>
+          <w:bCs w:val="false"/>
+          <w:color w:val="1E5E85"/>
+          <w:sz w:val="18"/>
+          <w:szCs w:val="18"/>
+        </w:rPr>
+        <w:t xml:space="preserve">—St. Francis of Assisi</w:t>
       </w:r>
     </w:p>
     <w:p>
@@ -2962,7 +3021,7 @@
           <w:sz w:val="21"/>
           <w:szCs w:val="21"/>
         </w:rPr>
-        <w:t xml:space="preserve">From the original Artimex archive</w:t>
+        <w:t xml:space="preserve">About us content from the original Artimex page</w:t>
       </w:r>
     </w:p>
     <w:p>
@@ -2989,7 +3048,7 @@
           <w:sz w:val="18"/>
           <w:szCs w:val="18"/>
         </w:rPr>
-        <w:t xml:space="preserve">From the original Artimex archive</w:t>
+        <w:t xml:space="preserve">About Us</w:t>
       </w:r>
     </w:p>
     <w:p>
@@ -3021,23 +3080,23 @@
           <w:sz w:val="18"/>
           <w:szCs w:val="18"/>
         </w:rPr>
-        <w:t xml:space="preserve">A tradition that</w:t>
-      </w:r>
-    </w:p>
-    <w:p>
-      <w:pPr>
-        <w:spacing w:before="0" w:after="110" w:line="260"/>
-      </w:pPr>
-      <w:r>
-        <w:rPr>
-          <w:rFonts w:ascii="Aptos Mono" w:cs="Aptos Mono" w:eastAsia="Aptos Mono" w:hAnsi="Aptos Mono"/>
-          <w:b w:val="false"/>
-          <w:bCs w:val="false"/>
-          <w:color w:val="1E5E85"/>
-          <w:sz w:val="18"/>
-          <w:szCs w:val="18"/>
-        </w:rPr>
-        <w:t xml:space="preserve">keeps moving forward.</w:t>
+        <w:t xml:space="preserve">Authenticity. Tradition.</w:t>
+      </w:r>
+    </w:p>
+    <w:p>
+      <w:pPr>
+        <w:spacing w:before="0" w:after="110" w:line="260"/>
+      </w:pPr>
+      <w:r>
+        <w:rPr>
+          <w:rFonts w:ascii="Aptos Mono" w:cs="Aptos Mono" w:eastAsia="Aptos Mono" w:hAnsi="Aptos Mono"/>
+          <w:b w:val="false"/>
+          <w:bCs w:val="false"/>
+          <w:color w:val="1E5E85"/>
+          <w:sz w:val="18"/>
+          <w:szCs w:val="18"/>
+        </w:rPr>
+        <w:t xml:space="preserve">Superior Ingredients.</w:t>
       </w:r>
     </w:p>
     <w:p>
@@ -3064,7 +3123,142 @@
           <w:sz w:val="18"/>
           <w:szCs w:val="18"/>
         </w:rPr>
-        <w:t xml:space="preserve">These images belong to the visual history of Artimex: breads made with craft, color and generosity since the brand’s earliest days.</w:t>
+        <w:t xml:space="preserve">Bread is a special part of all of our daily lives. It’s what ties our meals together. So whether you’re looking for a light and sweet breakfast bread, or rich and savory Telera for tortas, ARTIMEX ARTISAN MEXICAN BAKERY offers a wide-array of delicious, freshly baked selections for any meal, occasion, or special celebration.</w:t>
+      </w:r>
+    </w:p>
+    <w:p>
+      <w:pPr>
+        <w:spacing w:before="0" w:after="110" w:line="260"/>
+      </w:pPr>
+      <w:r>
+        <w:rPr>
+          <w:rFonts w:ascii="Aptos" w:cs="Aptos" w:eastAsia="Aptos" w:hAnsi="Aptos"/>
+          <w:b w:val="false"/>
+          <w:bCs w:val="false"/>
+          <w:color w:val="25323B"/>
+          <w:sz w:val="20"/>
+          <w:szCs w:val="20"/>
+        </w:rPr>
+        <w:t xml:space="preserve">Text: </w:t>
+      </w:r>
+      <w:r>
+        <w:rPr>
+          <w:rFonts w:ascii="Aptos Mono" w:cs="Aptos Mono" w:eastAsia="Aptos Mono" w:hAnsi="Aptos Mono"/>
+          <w:b w:val="false"/>
+          <w:bCs w:val="false"/>
+          <w:color w:val="1E5E85"/>
+          <w:sz w:val="18"/>
+          <w:szCs w:val="18"/>
+        </w:rPr>
+        <w:t xml:space="preserve">Over years of dedication, ARTIMEX ARTISAN MEXICAN BAKERY specialized in Mexican Bakery using the latest in flash frozen bakery technology and has created an impeccable track record of reliability, consistency and dependability. Delicious, artisan-inspired breads prepared with authentic ingredients on a daily basis: this is what sets us apart from the rest.</w:t>
+      </w:r>
+    </w:p>
+    <w:p>
+      <w:pPr>
+        <w:spacing w:before="0" w:after="110" w:line="260"/>
+      </w:pPr>
+      <w:r>
+        <w:rPr>
+          <w:rFonts w:ascii="Aptos" w:cs="Aptos" w:eastAsia="Aptos" w:hAnsi="Aptos"/>
+          <w:b w:val="false"/>
+          <w:bCs w:val="false"/>
+          <w:color w:val="25323B"/>
+          <w:sz w:val="20"/>
+          <w:szCs w:val="20"/>
+        </w:rPr>
+        <w:t xml:space="preserve">Text: </w:t>
+      </w:r>
+      <w:r>
+        <w:rPr>
+          <w:rFonts w:ascii="Aptos Mono" w:cs="Aptos Mono" w:eastAsia="Aptos Mono" w:hAnsi="Aptos Mono"/>
+          <w:b w:val="false"/>
+          <w:bCs w:val="false"/>
+          <w:color w:val="1E5E85"/>
+          <w:sz w:val="18"/>
+          <w:szCs w:val="18"/>
+        </w:rPr>
+        <w:t xml:space="preserve">Our authentic baked goods have already garnered strong sales and wide acceptance throughout the Hispanic community. We see as validation of our product line the success we have seen in sales, but more importantly, the acceptance that we receive on a daily basis by customers of the leading Mexican restaurant/bakery chain in Southern California, EL GALLO GIRO.</w:t>
+      </w:r>
+    </w:p>
+    <w:p>
+      <w:pPr>
+        <w:spacing w:before="0" w:after="110" w:line="260"/>
+      </w:pPr>
+      <w:r>
+        <w:rPr>
+          <w:rFonts w:ascii="Aptos" w:cs="Aptos" w:eastAsia="Aptos" w:hAnsi="Aptos"/>
+          <w:b w:val="false"/>
+          <w:bCs w:val="false"/>
+          <w:color w:val="25323B"/>
+          <w:sz w:val="20"/>
+          <w:szCs w:val="20"/>
+        </w:rPr>
+        <w:t xml:space="preserve">Text: </w:t>
+      </w:r>
+      <w:r>
+        <w:rPr>
+          <w:rFonts w:ascii="Aptos Mono" w:cs="Aptos Mono" w:eastAsia="Aptos Mono" w:hAnsi="Aptos Mono"/>
+          <w:b w:val="false"/>
+          <w:bCs w:val="false"/>
+          <w:color w:val="1E5E85"/>
+          <w:sz w:val="18"/>
+          <w:szCs w:val="18"/>
+        </w:rPr>
+        <w:t xml:space="preserve">ARTIMEX ARTISAN MEXICAN BAKERY is the perfect solution to be your own Mexican bakery, because we help you to simplify your operations, lower your labor costs, and control your operational costs. In addition, through our high quality standards and exceptional flavor profiles, we can help you sell more!</w:t>
+      </w:r>
+    </w:p>
+    <w:p>
+      <w:pPr>
+        <w:spacing w:before="0" w:after="110" w:line="260"/>
+      </w:pPr>
+      <w:r>
+        <w:rPr>
+          <w:rFonts w:ascii="Aptos" w:cs="Aptos" w:eastAsia="Aptos" w:hAnsi="Aptos"/>
+          <w:b w:val="false"/>
+          <w:bCs w:val="false"/>
+          <w:color w:val="25323B"/>
+          <w:sz w:val="20"/>
+          <w:szCs w:val="20"/>
+        </w:rPr>
+        <w:t xml:space="preserve">Text: </w:t>
+      </w:r>
+      <w:r>
+        <w:rPr>
+          <w:rFonts w:ascii="Aptos Mono" w:cs="Aptos Mono" w:eastAsia="Aptos Mono" w:hAnsi="Aptos Mono"/>
+          <w:b w:val="false"/>
+          <w:bCs w:val="false"/>
+          <w:color w:val="1E5E85"/>
+          <w:sz w:val="18"/>
+          <w:szCs w:val="18"/>
+        </w:rPr>
+        <w:t xml:space="preserve">This includes such important needs as hiring qualified bakers, creating consistent products, stocking an ample variety of baked goods that is attractive to customers, and having enough inventory to supply your demand. We help solve waste issues, the issue of investing too much money and time acquiring and then maintaining heavy equipment, and many other critical problems.</w:t>
+      </w:r>
+    </w:p>
+    <w:p>
+      <w:pPr>
+        <w:spacing w:before="0" w:after="110" w:line="260"/>
+      </w:pPr>
+      <w:r>
+        <w:rPr>
+          <w:rFonts w:ascii="Aptos" w:cs="Aptos" w:eastAsia="Aptos" w:hAnsi="Aptos"/>
+          <w:b w:val="false"/>
+          <w:bCs w:val="false"/>
+          <w:color w:val="25323B"/>
+          <w:sz w:val="20"/>
+          <w:szCs w:val="20"/>
+        </w:rPr>
+        <w:t xml:space="preserve">Text: </w:t>
+      </w:r>
+      <w:r>
+        <w:rPr>
+          <w:rFonts w:ascii="Aptos Mono" w:cs="Aptos Mono" w:eastAsia="Aptos Mono" w:hAnsi="Aptos Mono"/>
+          <w:b w:val="false"/>
+          <w:bCs w:val="false"/>
+          <w:color w:val="1E5E85"/>
+          <w:sz w:val="18"/>
+          <w:szCs w:val="18"/>
+        </w:rPr>
+        <w:t xml:space="preserve">El Gallo Giro is a household name in Los Angeles and surrounding cities, and serves over 1,000,000 meals a year in 11 restaurants. El Gallo Giro has been a mainstay for 21 years due to its adherence to the traditional preparation techniques and original recipes. We are proud of our relationship with El Gallo Giro, and continue to provide only the freshest, best tasting bakery products for El Gallo Giro and many other restaurants and markets.</w:t>
       </w:r>
     </w:p>
     <w:p>
@@ -7609,7 +7803,7 @@
           <w:sz w:val="18"/>
           <w:szCs w:val="18"/>
         </w:rPr>
-        <w:t xml:space="preserve">Our story</w:t>
+        <w:t xml:space="preserve">About us</w:t>
       </w:r>
       <w:r>
         <w:rPr>
@@ -8123,7 +8317,7 @@
           <w:sz w:val="18"/>
           <w:szCs w:val="18"/>
         </w:rPr>
-        <w:t xml:space="preserve">Nuestra historia</w:t>
+        <w:t xml:space="preserve">Sobre nosotros</w:t>
       </w:r>
     </w:p>
     <w:p>
@@ -9362,7 +9556,7 @@
           <w:sz w:val="28"/>
           <w:szCs w:val="28"/>
         </w:rPr>
-        <w:t xml:space="preserve">2. Nuestra historia</w:t>
+        <w:t xml:space="preserve">2. Sobre nosotros</w:t>
       </w:r>
     </w:p>
     <w:p>
@@ -9400,7 +9594,34 @@
           <w:sz w:val="18"/>
           <w:szCs w:val="18"/>
         </w:rPr>
-        <w:t xml:space="preserve">#story</w:t>
+        <w:t xml:space="preserve">#about</w:t>
+      </w:r>
+    </w:p>
+    <w:p>
+      <w:pPr>
+        <w:spacing w:before="0" w:after="110" w:line="260"/>
+      </w:pPr>
+      <w:r>
+        <w:rPr>
+          <w:rFonts w:ascii="Aptos" w:cs="Aptos" w:eastAsia="Aptos" w:hAnsi="Aptos"/>
+          <w:b/>
+          <w:bCs/>
+          <w:color w:val="25323B"/>
+          <w:sz w:val="20"/>
+          <w:szCs w:val="20"/>
+        </w:rPr>
+        <w:t xml:space="preserve">*Página de origen:*</w:t>
+      </w:r>
+      <w:r>
+        <w:rPr>
+          <w:rFonts w:ascii="Aptos" w:cs="Aptos" w:eastAsia="Aptos" w:hAnsi="Aptos"/>
+          <w:b w:val="false"/>
+          <w:bCs w:val="false"/>
+          <w:color w:val="25323B"/>
+          <w:sz w:val="20"/>
+          <w:szCs w:val="20"/>
+        </w:rPr>
+        <w:t xml:space="preserve"> https://www.artimexbakery.com/aboutus.html</w:t>
       </w:r>
     </w:p>
     <w:p>
@@ -9456,7 +9677,7 @@
           <w:sz w:val="18"/>
           <w:szCs w:val="18"/>
         </w:rPr>
-        <w:t xml:space="preserve">Artimex — Nuestra historia | Panadería Mexicana Artesanal</w:t>
+        <w:t xml:space="preserve">Artimex — Sobre nosotros | Panadería Mexicana Artesanal</w:t>
       </w:r>
     </w:p>
     <w:p>
@@ -9494,7 +9715,7 @@
           <w:sz w:val="18"/>
           <w:szCs w:val="18"/>
         </w:rPr>
-        <w:t xml:space="preserve">El estándar Artimex: pan mexicano hecho con autenticidad, tradición, ingredientes superiores y consistencia moderna.</w:t>
+        <w:t xml:space="preserve">Artimex Artisan Mexican Bakery crea panes mexicanos auténticos con el espíritu de la tradición de la panadería artesanal.</w:t>
       </w:r>
     </w:p>
     <w:p>
@@ -9532,7 +9753,7 @@
           <w:sz w:val="18"/>
           <w:szCs w:val="18"/>
         </w:rPr>
-        <w:t xml:space="preserve">historia de Artimex, tradición del pan mexicano, panadería artesanal, pan mexicano auténtico, ingredientes superiores, consistencia</w:t>
+        <w:t xml:space="preserve">sobre Artimex, panadería mexicana artesanal, recetas auténticas, panes mexicanos clásicos, tradición de panadería artesanal, panificación ultracongelada</w:t>
       </w:r>
     </w:p>
     <w:p>
@@ -9550,7 +9771,7 @@
           <w:sz w:val="21"/>
           <w:szCs w:val="21"/>
         </w:rPr>
-        <w:t xml:space="preserve">El estándar Artimex</w:t>
+        <w:t xml:space="preserve">Autenticidad. Tradición. Ingredientes superiores.</w:t>
       </w:r>
     </w:p>
     <w:p>
@@ -9577,7 +9798,7 @@
           <w:sz w:val="18"/>
           <w:szCs w:val="18"/>
         </w:rPr>
-        <w:t xml:space="preserve">El estándar Artimex</w:t>
+        <w:t xml:space="preserve">Autenticidad. Tradición. Ingredientes superiores.</w:t>
       </w:r>
     </w:p>
     <w:p>
@@ -9652,7 +9873,7 @@
           <w:sz w:val="18"/>
           <w:szCs w:val="18"/>
         </w:rPr>
-        <w:t xml:space="preserve">Hacemos pan mexicano como un oficio: ingredientes correctos, fermentación precisa, calor exacto y la disciplina para que cada lote honre la tradición.</w:t>
+        <w:t xml:space="preserve">Cuando ARTIMEX ARTISAN MEXICAN BAKERY abrió sus puertas, teníamos la visión de crear únicamente los mejores panes mexicanos preparados con el espíritu de la tradición de la panadería artesanal. En pocos años lo hemos logrado, ganando elogios y aceptación por nuestras recetas auténticas y panes mexicanos clásicos en toda la comunidad hispana.</w:t>
       </w:r>
     </w:p>
     <w:p>
@@ -9712,7 +9933,7 @@
           <w:sz w:val="18"/>
           <w:szCs w:val="18"/>
         </w:rPr>
-        <w:t xml:space="preserve">Panes mexicanos clásicos con sabor, forma y textura reconocibles.</w:t>
+        <w:t xml:space="preserve">Recordando las tradiciones de los mejores panaderos artesanales de México, nos esforzamos por hornear no solo con nuestras manos y nuestra mente, sino también con el corazón.</w:t>
       </w:r>
     </w:p>
     <w:p>
@@ -9734,7 +9955,7 @@
           <w:sz w:val="18"/>
           <w:szCs w:val="18"/>
         </w:rPr>
-        <w:t xml:space="preserve">Consistencia</w:t>
+        <w:t xml:space="preserve">Oficio artesanal</w:t>
       </w:r>
       <w:r>
         <w:rPr>
@@ -9756,7 +9977,7 @@
           <w:sz w:val="18"/>
           <w:szCs w:val="18"/>
         </w:rPr>
-        <w:t xml:space="preserve">Un programa repetible diseñado para resultados confiables cada día.</w:t>
+        <w:t xml:space="preserve">Desde la mezcla perfecta de ingredientes frescos hasta calcular el tiempo óptimo de horneado y determinar la temperatura ideal del horno, nos enorgullece crear un pan verdaderamente único cada vez.</w:t>
       </w:r>
     </w:p>
     <w:p>
@@ -9778,7 +9999,7 @@
           <w:sz w:val="18"/>
           <w:szCs w:val="18"/>
         </w:rPr>
-        <w:t xml:space="preserve">Ingredientes superiores</w:t>
+        <w:t xml:space="preserve">Calidad incomparable</w:t>
       </w:r>
       <w:r>
         <w:rPr>
@@ -9800,7 +10021,7 @@
           <w:sz w:val="18"/>
           <w:szCs w:val="18"/>
         </w:rPr>
-        <w:t xml:space="preserve">La calidad comienza antes del horno, con una mejor base y un manejo cuidadoso.</w:t>
+        <w:t xml:space="preserve">Nuestros panes comparten una calidad incomparable, siempre arraigada en una rica tradición artesanal.</w:t>
       </w:r>
     </w:p>
     <w:p>
@@ -9832,23 +10053,55 @@
           <w:sz w:val="18"/>
           <w:szCs w:val="18"/>
         </w:rPr>
-        <w:t xml:space="preserve">Forma tradicional.</w:t>
-      </w:r>
-    </w:p>
-    <w:p>
-      <w:pPr>
-        <w:spacing w:before="0" w:after="110" w:line="260"/>
-      </w:pPr>
-      <w:r>
-        <w:rPr>
-          <w:rFonts w:ascii="Aptos Mono" w:cs="Aptos Mono" w:eastAsia="Aptos Mono" w:hAnsi="Aptos Mono"/>
-          <w:b w:val="false"/>
-          <w:bCs w:val="false"/>
-          <w:color w:val="1E5E85"/>
-          <w:sz w:val="18"/>
-          <w:szCs w:val="18"/>
-        </w:rPr>
-        <w:t xml:space="preserve">Consistencia moderna.</w:t>
+        <w:t xml:space="preserve">Quien trabaja con sus manos es un trabajador.</w:t>
+      </w:r>
+    </w:p>
+    <w:p>
+      <w:pPr>
+        <w:spacing w:before="0" w:after="110" w:line="260"/>
+      </w:pPr>
+      <w:r>
+        <w:rPr>
+          <w:rFonts w:ascii="Aptos Mono" w:cs="Aptos Mono" w:eastAsia="Aptos Mono" w:hAnsi="Aptos Mono"/>
+          <w:b w:val="false"/>
+          <w:bCs w:val="false"/>
+          <w:color w:val="1E5E85"/>
+          <w:sz w:val="18"/>
+          <w:szCs w:val="18"/>
+        </w:rPr>
+        <w:t xml:space="preserve">Quien trabaja con sus manos y su mente es un artesano.</w:t>
+      </w:r>
+    </w:p>
+    <w:p>
+      <w:pPr>
+        <w:spacing w:before="0" w:after="110" w:line="260"/>
+      </w:pPr>
+      <w:r>
+        <w:rPr>
+          <w:rFonts w:ascii="Aptos Mono" w:cs="Aptos Mono" w:eastAsia="Aptos Mono" w:hAnsi="Aptos Mono"/>
+          <w:b w:val="false"/>
+          <w:bCs w:val="false"/>
+          <w:color w:val="1E5E85"/>
+          <w:sz w:val="18"/>
+          <w:szCs w:val="18"/>
+        </w:rPr>
+        <w:t xml:space="preserve">Quien trabaja con sus manos, su mente y su corazón es un artista.</w:t>
+      </w:r>
+    </w:p>
+    <w:p>
+      <w:pPr>
+        <w:spacing w:before="0" w:after="110" w:line="260"/>
+      </w:pPr>
+      <w:r>
+        <w:rPr>
+          <w:rFonts w:ascii="Aptos Mono" w:cs="Aptos Mono" w:eastAsia="Aptos Mono" w:hAnsi="Aptos Mono"/>
+          <w:b w:val="false"/>
+          <w:bCs w:val="false"/>
+          <w:color w:val="1E5E85"/>
+          <w:sz w:val="18"/>
+          <w:szCs w:val="18"/>
+        </w:rPr>
+        <w:t xml:space="preserve">—San Francisco de Asís.</w:t>
       </w:r>
     </w:p>
     <w:p>
@@ -9866,7 +10119,7 @@
           <w:sz w:val="21"/>
           <w:szCs w:val="21"/>
         </w:rPr>
-        <w:t xml:space="preserve">Del archivo original de Artimex</w:t>
+        <w:t xml:space="preserve">Contenido de Sobre nosotros de la página original de Artimex</w:t>
       </w:r>
     </w:p>
     <w:p>
@@ -9893,7 +10146,7 @@
           <w:sz w:val="18"/>
           <w:szCs w:val="18"/>
         </w:rPr>
-        <w:t xml:space="preserve">Del archivo original de Artimex</w:t>
+        <w:t xml:space="preserve">Sobre nosotros</w:t>
       </w:r>
     </w:p>
     <w:p>
@@ -9925,23 +10178,23 @@
           <w:sz w:val="18"/>
           <w:szCs w:val="18"/>
         </w:rPr>
-        <w:t xml:space="preserve">Una tradición que</w:t>
-      </w:r>
-    </w:p>
-    <w:p>
-      <w:pPr>
-        <w:spacing w:before="0" w:after="110" w:line="260"/>
-      </w:pPr>
-      <w:r>
-        <w:rPr>
-          <w:rFonts w:ascii="Aptos Mono" w:cs="Aptos Mono" w:eastAsia="Aptos Mono" w:hAnsi="Aptos Mono"/>
-          <w:b w:val="false"/>
-          <w:bCs w:val="false"/>
-          <w:color w:val="1E5E85"/>
-          <w:sz w:val="18"/>
-          <w:szCs w:val="18"/>
-        </w:rPr>
-        <w:t xml:space="preserve">sigue creciendo.</w:t>
+        <w:t xml:space="preserve">Autenticidad. Tradición.</w:t>
+      </w:r>
+    </w:p>
+    <w:p>
+      <w:pPr>
+        <w:spacing w:before="0" w:after="110" w:line="260"/>
+      </w:pPr>
+      <w:r>
+        <w:rPr>
+          <w:rFonts w:ascii="Aptos Mono" w:cs="Aptos Mono" w:eastAsia="Aptos Mono" w:hAnsi="Aptos Mono"/>
+          <w:b w:val="false"/>
+          <w:bCs w:val="false"/>
+          <w:color w:val="1E5E85"/>
+          <w:sz w:val="18"/>
+          <w:szCs w:val="18"/>
+        </w:rPr>
+        <w:t xml:space="preserve">Ingredientes superiores.</w:t>
       </w:r>
     </w:p>
     <w:p>
@@ -9968,7 +10221,142 @@
           <w:sz w:val="18"/>
           <w:szCs w:val="18"/>
         </w:rPr>
-        <w:t xml:space="preserve">Estas imágenes pertenecen a la historia visual de Artimex: panes hechos con oficio, color y generosidad desde el origen de la marca.</w:t>
+        <w:t xml:space="preserve">El pan es una parte especial de nuestra vida diaria. Es lo que une nuestras comidas. Ya sea que busques un pan dulce y ligero para el desayuno o una Telera rica y sabrosa para tortas, ARTIMEX ARTISAN MEXICAN BAKERY ofrece una amplia variedad de selecciones deliciosas y recién horneadas para cualquier comida, ocasión o celebración especial.</w:t>
+      </w:r>
+    </w:p>
+    <w:p>
+      <w:pPr>
+        <w:spacing w:before="0" w:after="110" w:line="260"/>
+      </w:pPr>
+      <w:r>
+        <w:rPr>
+          <w:rFonts w:ascii="Aptos" w:cs="Aptos" w:eastAsia="Aptos" w:hAnsi="Aptos"/>
+          <w:b w:val="false"/>
+          <w:bCs w:val="false"/>
+          <w:color w:val="25323B"/>
+          <w:sz w:val="20"/>
+          <w:szCs w:val="20"/>
+        </w:rPr>
+        <w:t xml:space="preserve">Texto: </w:t>
+      </w:r>
+      <w:r>
+        <w:rPr>
+          <w:rFonts w:ascii="Aptos Mono" w:cs="Aptos Mono" w:eastAsia="Aptos Mono" w:hAnsi="Aptos Mono"/>
+          <w:b w:val="false"/>
+          <w:bCs w:val="false"/>
+          <w:color w:val="1E5E85"/>
+          <w:sz w:val="18"/>
+          <w:szCs w:val="18"/>
+        </w:rPr>
+        <w:t xml:space="preserve">A lo largo de años de dedicación, ARTIMEX ARTISAN MEXICAN BAKERY se ha especializado en panadería mexicana utilizando la tecnología más avanzada de panificación ultracongelada y ha creado un historial impecable de confiabilidad, consistencia y seguridad. Panes deliciosos, inspirados en la artesanía y preparados diariamente con ingredientes auténticos: eso es lo que nos distingue.</w:t>
+      </w:r>
+    </w:p>
+    <w:p>
+      <w:pPr>
+        <w:spacing w:before="0" w:after="110" w:line="260"/>
+      </w:pPr>
+      <w:r>
+        <w:rPr>
+          <w:rFonts w:ascii="Aptos" w:cs="Aptos" w:eastAsia="Aptos" w:hAnsi="Aptos"/>
+          <w:b w:val="false"/>
+          <w:bCs w:val="false"/>
+          <w:color w:val="25323B"/>
+          <w:sz w:val="20"/>
+          <w:szCs w:val="20"/>
+        </w:rPr>
+        <w:t xml:space="preserve">Texto: </w:t>
+      </w:r>
+      <w:r>
+        <w:rPr>
+          <w:rFonts w:ascii="Aptos Mono" w:cs="Aptos Mono" w:eastAsia="Aptos Mono" w:hAnsi="Aptos Mono"/>
+          <w:b w:val="false"/>
+          <w:bCs w:val="false"/>
+          <w:color w:val="1E5E85"/>
+          <w:sz w:val="18"/>
+          <w:szCs w:val="18"/>
+        </w:rPr>
+        <w:t xml:space="preserve">Nuestros productos horneados auténticos ya han obtenido fuertes ventas y una amplia aceptación en la comunidad hispana. Consideramos una validación de nuestra línea de productos el éxito que hemos visto en ventas, pero más importante aún, la aceptación que recibimos diariamente de los clientes de la principal cadena de restaurantes y panaderías mexicanas del sur de California, EL GALLO GIRO.</w:t>
+      </w:r>
+    </w:p>
+    <w:p>
+      <w:pPr>
+        <w:spacing w:before="0" w:after="110" w:line="260"/>
+      </w:pPr>
+      <w:r>
+        <w:rPr>
+          <w:rFonts w:ascii="Aptos" w:cs="Aptos" w:eastAsia="Aptos" w:hAnsi="Aptos"/>
+          <w:b w:val="false"/>
+          <w:bCs w:val="false"/>
+          <w:color w:val="25323B"/>
+          <w:sz w:val="20"/>
+          <w:szCs w:val="20"/>
+        </w:rPr>
+        <w:t xml:space="preserve">Texto: </w:t>
+      </w:r>
+      <w:r>
+        <w:rPr>
+          <w:rFonts w:ascii="Aptos Mono" w:cs="Aptos Mono" w:eastAsia="Aptos Mono" w:hAnsi="Aptos Mono"/>
+          <w:b w:val="false"/>
+          <w:bCs w:val="false"/>
+          <w:color w:val="1E5E85"/>
+          <w:sz w:val="18"/>
+          <w:szCs w:val="18"/>
+        </w:rPr>
+        <w:t xml:space="preserve">ARTIMEX ARTISAN MEXICAN BAKERY es la solución perfecta para tener tu propia panadería mexicana, porque te ayudamos a simplificar tus operaciones, reducir los costos de mano de obra y controlar tus costos operativos. Además, mediante nuestros altos estándares de calidad y perfiles de sabor excepcionales, podemos ayudarte a vender más.</w:t>
+      </w:r>
+    </w:p>
+    <w:p>
+      <w:pPr>
+        <w:spacing w:before="0" w:after="110" w:line="260"/>
+      </w:pPr>
+      <w:r>
+        <w:rPr>
+          <w:rFonts w:ascii="Aptos" w:cs="Aptos" w:eastAsia="Aptos" w:hAnsi="Aptos"/>
+          <w:b w:val="false"/>
+          <w:bCs w:val="false"/>
+          <w:color w:val="25323B"/>
+          <w:sz w:val="20"/>
+          <w:szCs w:val="20"/>
+        </w:rPr>
+        <w:t xml:space="preserve">Texto: </w:t>
+      </w:r>
+      <w:r>
+        <w:rPr>
+          <w:rFonts w:ascii="Aptos Mono" w:cs="Aptos Mono" w:eastAsia="Aptos Mono" w:hAnsi="Aptos Mono"/>
+          <w:b w:val="false"/>
+          <w:bCs w:val="false"/>
+          <w:color w:val="1E5E85"/>
+          <w:sz w:val="18"/>
+          <w:szCs w:val="18"/>
+        </w:rPr>
+        <w:t xml:space="preserve">Esto incluye necesidades importantes como contratar panaderos calificados, crear productos consistentes, mantener una amplia variedad de productos horneados atractiva para los clientes y tener suficiente inventario para satisfacer la demanda. Ayudamos a resolver los problemas de merma y la inversión excesiva de tiempo y dinero en adquirir y mantener equipos pesados, además de muchos otros problemas críticos.</w:t>
+      </w:r>
+    </w:p>
+    <w:p>
+      <w:pPr>
+        <w:spacing w:before="0" w:after="110" w:line="260"/>
+      </w:pPr>
+      <w:r>
+        <w:rPr>
+          <w:rFonts w:ascii="Aptos" w:cs="Aptos" w:eastAsia="Aptos" w:hAnsi="Aptos"/>
+          <w:b w:val="false"/>
+          <w:bCs w:val="false"/>
+          <w:color w:val="25323B"/>
+          <w:sz w:val="20"/>
+          <w:szCs w:val="20"/>
+        </w:rPr>
+        <w:t xml:space="preserve">Texto: </w:t>
+      </w:r>
+      <w:r>
+        <w:rPr>
+          <w:rFonts w:ascii="Aptos Mono" w:cs="Aptos Mono" w:eastAsia="Aptos Mono" w:hAnsi="Aptos Mono"/>
+          <w:b w:val="false"/>
+          <w:bCs w:val="false"/>
+          <w:color w:val="1E5E85"/>
+          <w:sz w:val="18"/>
+          <w:szCs w:val="18"/>
+        </w:rPr>
+        <w:t xml:space="preserve">EL GALLO GIRO es un nombre familiar en Los Ángeles y las ciudades cercanas, y sirve más de 1,000,000 de comidas al año en 11 restaurantes. El Gallo Giro ha sido un pilar durante 21 años gracias a su adhesión a las técnicas tradicionales de preparación y recetas originales. Estamos orgullosos de nuestra relación con El Gallo Giro y continuamos proporcionando los productos de panadería más frescos y sabrosos para El Gallo Giro y muchos otros restaurantes y mercados.</w:t>
       </w:r>
     </w:p>
     <w:p>
@@ -14497,7 +14885,7 @@
           <w:sz w:val="18"/>
           <w:szCs w:val="18"/>
         </w:rPr>
-        <w:t xml:space="preserve">Nuestra historia</w:t>
+        <w:t xml:space="preserve">Sobre nosotros</w:t>
       </w:r>
       <w:r>
         <w:rPr>

</xml_diff>

<commit_message>
Complete About Us source content integration
</commit_message>
<xml_diff>
--- a/docs/artimex-bos.docx
+++ b/docs/artimex-bos.docx
@@ -3259,6 +3259,33 @@
           <w:szCs w:val="18"/>
         </w:rPr>
         <w:t xml:space="preserve">El Gallo Giro is a household name in Los Angeles and surrounding cities, and serves over 1,000,000 meals a year in 11 restaurants. El Gallo Giro has been a mainstay for 21 years due to its adherence to the traditional preparation techniques and original recipes. We are proud of our relationship with El Gallo Giro, and continue to provide only the freshest, best tasting bakery products for El Gallo Giro and many other restaurants and markets.</w:t>
+      </w:r>
+    </w:p>
+    <w:p>
+      <w:pPr>
+        <w:spacing w:before="0" w:after="110" w:line="260"/>
+      </w:pPr>
+      <w:r>
+        <w:rPr>
+          <w:rFonts w:ascii="Aptos" w:cs="Aptos" w:eastAsia="Aptos" w:hAnsi="Aptos"/>
+          <w:b w:val="false"/>
+          <w:bCs w:val="false"/>
+          <w:color w:val="25323B"/>
+          <w:sz w:val="20"/>
+          <w:szCs w:val="20"/>
+        </w:rPr>
+        <w:t xml:space="preserve">Text: </w:t>
+      </w:r>
+      <w:r>
+        <w:rPr>
+          <w:rFonts w:ascii="Aptos Mono" w:cs="Aptos Mono" w:eastAsia="Aptos Mono" w:hAnsi="Aptos Mono"/>
+          <w:b w:val="false"/>
+          <w:bCs w:val="false"/>
+          <w:color w:val="1E5E85"/>
+          <w:sz w:val="18"/>
+          <w:szCs w:val="18"/>
+        </w:rPr>
+        <w:t xml:space="preserve">Click on Contact Us to find out how we can work together.</w:t>
       </w:r>
     </w:p>
     <w:p>
@@ -10372,6 +10399,33 @@
           <w:sz w:val="20"/>
           <w:szCs w:val="20"/>
         </w:rPr>
+        <w:t xml:space="preserve">Texto: </w:t>
+      </w:r>
+      <w:r>
+        <w:rPr>
+          <w:rFonts w:ascii="Aptos Mono" w:cs="Aptos Mono" w:eastAsia="Aptos Mono" w:hAnsi="Aptos Mono"/>
+          <w:b w:val="false"/>
+          <w:bCs w:val="false"/>
+          <w:color w:val="1E5E85"/>
+          <w:sz w:val="18"/>
+          <w:szCs w:val="18"/>
+        </w:rPr>
+        <w:t xml:space="preserve">Haz clic en Contacto para descubrir cómo podemos trabajar juntos.</w:t>
+      </w:r>
+    </w:p>
+    <w:p>
+      <w:pPr>
+        <w:spacing w:before="0" w:after="110" w:line="260"/>
+      </w:pPr>
+      <w:r>
+        <w:rPr>
+          <w:rFonts w:ascii="Aptos" w:cs="Aptos" w:eastAsia="Aptos" w:hAnsi="Aptos"/>
+          <w:b w:val="false"/>
+          <w:bCs w:val="false"/>
+          <w:color w:val="25323B"/>
+          <w:sz w:val="20"/>
+          <w:szCs w:val="20"/>
+        </w:rPr>
         <w:t xml:space="preserve">Botón: </w:t>
       </w:r>
       <w:r>

</xml_diff>

<commit_message>
Refine About Us copy for client approval
</commit_message>
<xml_diff>
--- a/docs/artimex-bos.docx
+++ b/docs/artimex-bos.docx
@@ -2775,7 +2775,7 @@
           <w:sz w:val="18"/>
           <w:szCs w:val="18"/>
         </w:rPr>
-        <w:t xml:space="preserve">When ARTIMEX ARTISAN MEXICAN BAKERY first opened its doors, we had a vision of creating only the finest Mexican breads prepared in the spirit of the artisan baking tradition. In a few short years we have done just that, winning praise and acceptance for our authentic recipes and classic Mexican breads throughout the Hispanic community.</w:t>
+        <w:t xml:space="preserve">When Artimex opened its doors, it began with a clear mission: to create exceptional Mexican breads in the spirit of the artisan tradition. Today, that vision lives in every recipe, with authentic flavor, character, and a consistency our customers can rely on.</w:t>
       </w:r>
     </w:p>
     <w:p>
@@ -2835,7 +2835,7 @@
           <w:sz w:val="18"/>
           <w:szCs w:val="18"/>
         </w:rPr>
-        <w:t xml:space="preserve">Harkening back to the traditions of Mexico’s finest Artisan bakers, we strive to bake not only with our hands and our heads, but with our hearts as well.</w:t>
+        <w:t xml:space="preserve">We honor the finest traditions of Mexican baking with recipes, flavors, and forms that feel genuinely authentic.</w:t>
       </w:r>
     </w:p>
     <w:p>
@@ -2879,7 +2879,7 @@
           <w:sz w:val="18"/>
           <w:szCs w:val="18"/>
         </w:rPr>
-        <w:t xml:space="preserve">Whether it’s putting together the perfect mix of fresh ingredients, calculating the optimal baking time, or determining peak oven temperatures, we pride ourselves on creating a truly unique bread every time we bake.</w:t>
+        <w:t xml:space="preserve">From fresh ingredients and careful mixing to fermentation, bake time, and oven temperature, every detail matters.</w:t>
       </w:r>
     </w:p>
     <w:p>
@@ -2901,7 +2901,7 @@
           <w:sz w:val="18"/>
           <w:szCs w:val="18"/>
         </w:rPr>
-        <w:t xml:space="preserve">Unrivaled quality</w:t>
+        <w:t xml:space="preserve">Quality</w:t>
       </w:r>
       <w:r>
         <w:rPr>
@@ -2923,7 +2923,7 @@
           <w:sz w:val="18"/>
           <w:szCs w:val="18"/>
         </w:rPr>
-        <w:t xml:space="preserve">What our breads have in common is ARTIMEX ARTISAN MEXICAN BAKERY’S unrivaled quality, always steeped in a rich artisan tradition.</w:t>
+        <w:t xml:space="preserve">Every bread and pastry is made to deliver the flavor, texture, and consistency our customers expect.</w:t>
       </w:r>
     </w:p>
     <w:p>
@@ -3021,7 +3021,7 @@
           <w:sz w:val="21"/>
           <w:szCs w:val="21"/>
         </w:rPr>
-        <w:t xml:space="preserve">About us content from the original Artimex page</w:t>
+        <w:t xml:space="preserve">About us content — optimized from the original Artimex page</w:t>
       </w:r>
     </w:p>
     <w:p>
@@ -3123,7 +3123,7 @@
           <w:sz w:val="18"/>
           <w:szCs w:val="18"/>
         </w:rPr>
-        <w:t xml:space="preserve">Bread is a special part of all of our daily lives. It’s what ties our meals together. So whether you’re looking for a light and sweet breakfast bread, or rich and savory Telera for tortas, ARTIMEX ARTISAN MEXICAN BAKERY offers a wide-array of delicious, freshly baked selections for any meal, occasion, or special celebration.</w:t>
+        <w:t xml:space="preserve">Bread brings people together. It belongs at our everyday meals, in our daily rituals, and at our celebrations. From light, sweet breakfast bread to savory Telera for tortas, Artimex offers a freshly baked selection for every occasion.</w:t>
       </w:r>
     </w:p>
     <w:p>
@@ -3150,7 +3150,7 @@
           <w:sz w:val="18"/>
           <w:szCs w:val="18"/>
         </w:rPr>
-        <w:t xml:space="preserve">Over years of dedication, ARTIMEX ARTISAN MEXICAN BAKERY specialized in Mexican Bakery using the latest in flash frozen bakery technology and has created an impeccable track record of reliability, consistency and dependability. Delicious, artisan-inspired breads prepared with authentic ingredients on a daily basis: this is what sets us apart from the rest.</w:t>
+        <w:t xml:space="preserve">Artimex combines artisan methods with modern flash-frozen technology to deliver products that are reliable, consistent, and full of flavor. It is a smarter way to bring authentic Mexican bread to more bakery cases and more tables.</w:t>
       </w:r>
     </w:p>
     <w:p>
@@ -3177,7 +3177,7 @@
           <w:sz w:val="18"/>
           <w:szCs w:val="18"/>
         </w:rPr>
-        <w:t xml:space="preserve">Our authentic baked goods have already garnered strong sales and wide acceptance throughout the Hispanic community. We see as validation of our product line the success we have seen in sales, but more importantly, the acceptance that we receive on a daily basis by customers of the leading Mexican restaurant/bakery chain in Southern California, EL GALLO GIRO.</w:t>
+        <w:t xml:space="preserve">That combination of tradition and consistency has earned strong acceptance throughout the Hispanic community. Our relationship with El Gallo Giro, one of Southern California’s leading Mexican restaurant and bakery chains, reflects the standard we work to maintain.</w:t>
       </w:r>
     </w:p>
     <w:p>
@@ -3204,7 +3204,7 @@
           <w:sz w:val="18"/>
           <w:szCs w:val="18"/>
         </w:rPr>
-        <w:t xml:space="preserve">ARTIMEX ARTISAN MEXICAN BAKERY is the perfect solution to be your own Mexican bakery, because we help you to simplify your operations, lower your labor costs, and control your operational costs. In addition, through our high quality standards and exceptional flavor profiles, we can help you sell more!</w:t>
+        <w:t xml:space="preserve">For restaurants, markets, and foodservice operators, Artimex makes it possible to offer an authentic Mexican bakery program without carrying the full complexity of a traditional scratch operation.</w:t>
       </w:r>
     </w:p>
     <w:p>
@@ -3231,7 +3231,7 @@
           <w:sz w:val="18"/>
           <w:szCs w:val="18"/>
         </w:rPr>
-        <w:t xml:space="preserve">This includes such important needs as hiring qualified bakers, creating consistent products, stocking an ample variety of baked goods that is attractive to customers, and having enough inventory to supply your demand. We help solve waste issues, the issue of investing too much money and time acquiring and then maintaining heavy equipment, and many other critical problems.</w:t>
+        <w:t xml:space="preserve">Reliable products, a broad assortment, flexible inventory, and less waste help reduce labor and equipment pressure while making it easier to meet demand consistently.</w:t>
       </w:r>
     </w:p>
     <w:p>
@@ -3258,7 +3258,7 @@
           <w:sz w:val="18"/>
           <w:szCs w:val="18"/>
         </w:rPr>
-        <w:t xml:space="preserve">El Gallo Giro is a household name in Los Angeles and surrounding cities, and serves over 1,000,000 meals a year in 11 restaurants. El Gallo Giro has been a mainstay for 21 years due to its adherence to the traditional preparation techniques and original recipes. We are proud of our relationship with El Gallo Giro, and continue to provide only the freshest, best tasting bakery products for El Gallo Giro and many other restaurants and markets.</w:t>
+        <w:t xml:space="preserve">El Gallo Giro serves more than 1,000,000 meals each year across 11 restaurants and has built a 21-year track record around traditional preparation techniques and original recipes. We are proud of our relationship and of continuing to provide fresh, great-tasting bakery products to El Gallo Giro and many other restaurants and markets.</w:t>
       </w:r>
     </w:p>
     <w:p>
@@ -3285,7 +3285,7 @@
           <w:sz w:val="18"/>
           <w:szCs w:val="18"/>
         </w:rPr>
-        <w:t xml:space="preserve">Click on Contact Us to find out how we can work together.</w:t>
+        <w:t xml:space="preserve">Visit Contact to find out how we can work together.</w:t>
       </w:r>
     </w:p>
     <w:p>
@@ -9900,7 +9900,7 @@
           <w:sz w:val="18"/>
           <w:szCs w:val="18"/>
         </w:rPr>
-        <w:t xml:space="preserve">Cuando ARTIMEX ARTISAN MEXICAN BAKERY abrió sus puertas, teníamos la visión de crear únicamente los mejores panes mexicanos preparados con el espíritu de la tradición de la panadería artesanal. En pocos años lo hemos logrado, ganando elogios y aceptación por nuestras recetas auténticas y panes mexicanos clásicos en toda la comunidad hispana.</w:t>
+        <w:t xml:space="preserve">Cuando Artimex abrió sus puertas, nació con una misión clara: crear panes mexicanos excepcionales en el espíritu de la tradición artesanal. Hoy, esa visión vive en cada receta, con sabores auténticos, carácter y una consistencia en la que nuestros clientes pueden confiar.</w:t>
       </w:r>
     </w:p>
     <w:p>
@@ -9960,7 +9960,7 @@
           <w:sz w:val="18"/>
           <w:szCs w:val="18"/>
         </w:rPr>
-        <w:t xml:space="preserve">Recordando las tradiciones de los mejores panaderos artesanales de México, nos esforzamos por hornear no solo con nuestras manos y nuestra mente, sino también con el corazón.</w:t>
+        <w:t xml:space="preserve">Honramos las mejores tradiciones de la panadería mexicana con recetas, sabores y formas que se sienten genuinamente auténticos.</w:t>
       </w:r>
     </w:p>
     <w:p>
@@ -10004,7 +10004,7 @@
           <w:sz w:val="18"/>
           <w:szCs w:val="18"/>
         </w:rPr>
-        <w:t xml:space="preserve">Desde la mezcla perfecta de ingredientes frescos hasta calcular el tiempo óptimo de horneado y determinar la temperatura ideal del horno, nos enorgullece crear un pan verdaderamente único cada vez.</w:t>
+        <w:t xml:space="preserve">Desde los ingredientes frescos y la mezcla hasta la fermentación, el tiempo de horneado y la temperatura del horno, cada detalle importa.</w:t>
       </w:r>
     </w:p>
     <w:p>
@@ -10026,7 +10026,7 @@
           <w:sz w:val="18"/>
           <w:szCs w:val="18"/>
         </w:rPr>
-        <w:t xml:space="preserve">Calidad incomparable</w:t>
+        <w:t xml:space="preserve">Calidad</w:t>
       </w:r>
       <w:r>
         <w:rPr>
@@ -10048,7 +10048,7 @@
           <w:sz w:val="18"/>
           <w:szCs w:val="18"/>
         </w:rPr>
-        <w:t xml:space="preserve">Nuestros panes comparten una calidad incomparable, siempre arraigada en una rica tradición artesanal.</w:t>
+        <w:t xml:space="preserve">Cada pan y cada pastel se elaboran para ofrecer el sabor, la textura y la consistencia que esperan nuestros clientes.</w:t>
       </w:r>
     </w:p>
     <w:p>
@@ -10146,7 +10146,7 @@
           <w:sz w:val="21"/>
           <w:szCs w:val="21"/>
         </w:rPr>
-        <w:t xml:space="preserve">Contenido de Sobre nosotros de la página original de Artimex</w:t>
+        <w:t xml:space="preserve">Contenido de Sobre nosotros — optimizado a partir de la página original de Artimex</w:t>
       </w:r>
     </w:p>
     <w:p>
@@ -10248,7 +10248,7 @@
           <w:sz w:val="18"/>
           <w:szCs w:val="18"/>
         </w:rPr>
-        <w:t xml:space="preserve">El pan es una parte especial de nuestra vida diaria. Es lo que une nuestras comidas. Ya sea que busques un pan dulce y ligero para el desayuno o una Telera rica y sabrosa para tortas, ARTIMEX ARTISAN MEXICAN BAKERY ofrece una amplia variedad de selecciones deliciosas y recién horneadas para cualquier comida, ocasión o celebración especial.</w:t>
+        <w:t xml:space="preserve">El pan reúne a las personas. Acompaña nuestras comidas, nuestros momentos cotidianos y nuestras celebraciones. Desde un pan dulce y ligero para el desayuno hasta una Telera sabrosa para tortas, Artimex ofrece una variedad recién horneada para cada ocasión.</w:t>
       </w:r>
     </w:p>
     <w:p>
@@ -10275,7 +10275,7 @@
           <w:sz w:val="18"/>
           <w:szCs w:val="18"/>
         </w:rPr>
-        <w:t xml:space="preserve">A lo largo de años de dedicación, ARTIMEX ARTISAN MEXICAN BAKERY se ha especializado en panadería mexicana utilizando la tecnología más avanzada de panificación ultracongelada y ha creado un historial impecable de confiabilidad, consistencia y seguridad. Panes deliciosos, inspirados en la artesanía y preparados diariamente con ingredientes auténticos: eso es lo que nos distingue.</w:t>
+        <w:t xml:space="preserve">Artimex combina métodos artesanales con tecnología moderna de panificación ultracongelada para entregar productos confiables, consistentes y llenos de sabor. Es una forma más inteligente de llevar el pan mexicano auténtico a más vitrinas y más mesas.</w:t>
       </w:r>
     </w:p>
     <w:p>
@@ -10302,7 +10302,7 @@
           <w:sz w:val="18"/>
           <w:szCs w:val="18"/>
         </w:rPr>
-        <w:t xml:space="preserve">Nuestros productos horneados auténticos ya han obtenido fuertes ventas y una amplia aceptación en la comunidad hispana. Consideramos una validación de nuestra línea de productos el éxito que hemos visto en ventas, pero más importante aún, la aceptación que recibimos diariamente de los clientes de la principal cadena de restaurantes y panaderías mexicanas del sur de California, EL GALLO GIRO.</w:t>
+        <w:t xml:space="preserve">Esa combinación de tradición y consistencia ha generado una fuerte aceptación en la comunidad hispana. Nuestra relación con El Gallo Giro, una de las principales cadenas de restaurantes y panaderías mexicanas del sur de California, es una muestra del estándar que buscamos mantener.</w:t>
       </w:r>
     </w:p>
     <w:p>
@@ -10329,7 +10329,7 @@
           <w:sz w:val="18"/>
           <w:szCs w:val="18"/>
         </w:rPr>
-        <w:t xml:space="preserve">ARTIMEX ARTISAN MEXICAN BAKERY es la solución perfecta para tener tu propia panadería mexicana, porque te ayudamos a simplificar tus operaciones, reducir los costos de mano de obra y controlar tus costos operativos. Además, mediante nuestros altos estándares de calidad y perfiles de sabor excepcionales, podemos ayudarte a vender más.</w:t>
+        <w:t xml:space="preserve">Para restaurantes, mercados y operadores foodservice, Artimex permite ofrecer un programa de panadería mexicana auténtica sin asumir toda la complejidad de una operación tradicional desde cero.</w:t>
       </w:r>
     </w:p>
     <w:p>
@@ -10356,7 +10356,7 @@
           <w:sz w:val="18"/>
           <w:szCs w:val="18"/>
         </w:rPr>
-        <w:t xml:space="preserve">Esto incluye necesidades importantes como contratar panaderos calificados, crear productos consistentes, mantener una amplia variedad de productos horneados atractiva para los clientes y tener suficiente inventario para satisfacer la demanda. Ayudamos a resolver los problemas de merma y la inversión excesiva de tiempo y dinero en adquirir y mantener equipos pesados, además de muchos otros problemas críticos.</w:t>
+        <w:t xml:space="preserve">Productos confiables, un surtido amplio, inventario flexible y menos merma ayudan a reducir la presión de mano de obra y equipo, mientras permiten responder a la demanda con mayor consistencia.</w:t>
       </w:r>
     </w:p>
     <w:p>
@@ -10383,7 +10383,7 @@
           <w:sz w:val="18"/>
           <w:szCs w:val="18"/>
         </w:rPr>
-        <w:t xml:space="preserve">EL GALLO GIRO es un nombre familiar en Los Ángeles y las ciudades cercanas, y sirve más de 1,000,000 de comidas al año en 11 restaurantes. El Gallo Giro ha sido un pilar durante 21 años gracias a su adhesión a las técnicas tradicionales de preparación y recetas originales. Estamos orgullosos de nuestra relación con El Gallo Giro y continuamos proporcionando los productos de panadería más frescos y sabrosos para El Gallo Giro y muchos otros restaurantes y mercados.</w:t>
+        <w:t xml:space="preserve">El Gallo Giro atiende a más de 1,000,000 de personas al año en 11 restaurantes y mantiene una trayectoria de 21 años basada en técnicas tradicionales y recetas originales. Nos enorgullece nuestra relación y seguir ofreciendo productos frescos y sabrosos a El Gallo Giro y a muchos otros restaurantes y mercados.</w:t>
       </w:r>
     </w:p>
     <w:p>
@@ -10410,7 +10410,7 @@
           <w:sz w:val="18"/>
           <w:szCs w:val="18"/>
         </w:rPr>
-        <w:t xml:space="preserve">Haz clic en Contacto para descubrir cómo podemos trabajar juntos.</w:t>
+        <w:t xml:space="preserve">Visita Contacto para descubrir cómo podemos trabajar juntos.</w:t>
       </w:r>
     </w:p>
     <w:p>

</xml_diff>